<commit_message>
docs: refresh EN+KH suite with email verification, role guards, /confirm, PayWay persistence
</commit_message>
<xml_diff>
--- a/DOC/EN/NF-DOC-001_Executive_Overview_EN.docx
+++ b/DOC/EN/NF-DOC-001_Executive_Overview_EN.docx
@@ -963,7 +963,7 @@
                 <w:color w:val="0B1F2E"/>
                 <w:sz w:val="19"/>
               </w:rPr>
-              <w:t>Email + password with Brevo OTP verification (10-minute expiry)</w:t>
+              <w:t>Email + password with Brevo OTP verification — login blocked until the email is verified</w:t>
             </w:r>
           </w:p>
         </w:tc>
@@ -2297,7 +2297,7 @@
           <w:color w:val="0B1F2E"/>
           <w:sz w:val="21"/>
         </w:rPr>
-        <w:t>Email OTP verification for register, login, and password change flows</w:t>
+        <w:t>Email OTP verification required before first login (new accounts are locked until verified)</w:t>
       </w:r>
     </w:p>
     <w:p>

</xml_diff>

<commit_message>
docs: update suite for PayWay Purchase API hosted checkout
</commit_message>
<xml_diff>
--- a/DOC/EN/NF-DOC-001_Executive_Overview_EN.docx
+++ b/DOC/EN/NF-DOC-001_Executive_Overview_EN.docx
@@ -1023,7 +1023,7 @@
                 <w:color w:val="0B1F2E"/>
                 <w:sz w:val="19"/>
               </w:rPr>
-              <w:t>KHQR (Bakong) integration and ABA PayWay webhooks</w:t>
+              <w:t>KHQR (Bakong) integration and ABA PayWay hosted checkout</w:t>
             </w:r>
           </w:p>
         </w:tc>
@@ -2393,7 +2393,7 @@
           <w:color w:val="0B1F2E"/>
           <w:sz w:val="21"/>
         </w:rPr>
-        <w:t>Go live with ABA PayWay production webhooks</w:t>
+        <w:t>Go live with ABA PayWay production checkout</w:t>
       </w:r>
     </w:p>
     <w:p>

</xml_diff>

<commit_message>
Update all 8 EN docs to match current codebase (phone OTP, dashboard redesign, KHQR payment, super admin cleanup)
</commit_message>
<xml_diff>
--- a/DOC/EN/NF-DOC-001_Executive_Overview_EN.docx
+++ b/DOC/EN/NF-DOC-001_Executive_Overview_EN.docx
@@ -2,2564 +2,365 @@
 <file path=word/document.xml><?xml version="1.0" encoding="utf-8"?>
 <w:document xmlns:wpc="http://schemas.microsoft.com/office/word/2010/wordprocessingCanvas" xmlns:mo="http://schemas.microsoft.com/office/mac/office/2008/main" xmlns:mc="http://schemas.openxmlformats.org/markup-compatibility/2006" xmlns:mv="urn:schemas-microsoft-com:mac:vml" xmlns:o="urn:schemas-microsoft-com:office:office" xmlns:r="http://schemas.openxmlformats.org/officeDocument/2006/relationships" xmlns:m="http://schemas.openxmlformats.org/officeDocument/2006/math" xmlns:v="urn:schemas-microsoft-com:vml" xmlns:wp14="http://schemas.microsoft.com/office/word/2010/wordprocessingDrawing" xmlns:wp="http://schemas.openxmlformats.org/drawingml/2006/wordprocessingDrawing" xmlns:w10="urn:schemas-microsoft-com:office:word" xmlns:w="http://schemas.openxmlformats.org/wordprocessingml/2006/main" xmlns:w14="http://schemas.microsoft.com/office/word/2010/wordml" xmlns:wpg="http://schemas.microsoft.com/office/word/2010/wordprocessingGroup" xmlns:wpi="http://schemas.microsoft.com/office/word/2010/wordprocessingInk" xmlns:wne="http://schemas.microsoft.com/office/word/2006/wordml" xmlns:wps="http://schemas.microsoft.com/office/word/2010/wordprocessingShape" mc:Ignorable="w14 wp14">
   <w:body>
-    <w:tbl>
-      <w:tblPr>
-        <w:tblStyle w:val="TableGrid"/>
-        <w:tblW w:type="auto" w:w="0"/>
-        <w:tblLook w:firstColumn="1" w:firstRow="1" w:lastColumn="0" w:lastRow="0" w:noHBand="0" w:noVBand="1" w:val="04A0"/>
-      </w:tblPr>
-      <w:tblGrid>
-        <w:gridCol w:w="9317"/>
-      </w:tblGrid>
-      <w:tr>
-        <w:tc>
-          <w:tcPr>
-            <w:tcW w:type="dxa" w:w="9317"/>
-            <w:shd w:val="clear" w:fill="0B1F2E"/>
-            <w:tcMar>
-              <w:top w:w="180" w:type="dxa"/>
-              <w:start w:w="240" w:type="dxa"/>
-              <w:bottom w:w="180" w:type="dxa"/>
-              <w:end w:w="240" w:type="dxa"/>
-            </w:tcMar>
-          </w:tcPr>
-          <w:p>
-            <w:r/>
-            <w:r>
-              <w:rPr>
-                <w:rFonts w:ascii="Segoe UI" w:hAnsi="Segoe UI" w:cs="Segoe UI"/>
-                <w:b/>
-                <w:i w:val="0"/>
-                <w:color w:val="00BDAA"/>
-                <w:sz w:val="26"/>
-              </w:rPr>
-              <w:t>NEXUSFINANCE</w:t>
-            </w:r>
-          </w:p>
-          <w:p>
-            <w:pPr>
-              <w:spacing w:after="0"/>
-            </w:pPr>
-            <w:r>
-              <w:rPr>
-                <w:rFonts w:ascii="Segoe UI" w:hAnsi="Segoe UI" w:cs="Segoe UI"/>
-                <w:b w:val="0"/>
-                <w:i w:val="0"/>
-                <w:color w:val="9FB4C4"/>
-                <w:sz w:val="18"/>
-              </w:rPr>
-              <w:t>Secure • Modern • Cutting-edge  |  Lending Platform for Cambodia</w:t>
-            </w:r>
-          </w:p>
-        </w:tc>
-      </w:tr>
-    </w:tbl>
     <w:p>
       <w:pPr>
-        <w:spacing w:after="40"/>
-      </w:pPr>
-    </w:p>
-    <w:p>
-      <w:pPr>
-        <w:spacing w:after="600"/>
-      </w:pPr>
-    </w:p>
-    <w:p>
-      <w:pPr>
-        <w:spacing w:after="120"/>
-        <w:jc w:val="left"/>
+        <w:pStyle w:val="Title"/>
       </w:pPr>
       <w:r>
-        <w:rPr>
-          <w:rFonts w:ascii="Segoe UI" w:hAnsi="Segoe UI" w:cs="Segoe UI"/>
-          <w:b/>
-          <w:i w:val="0"/>
-          <w:color w:val="0B1F2E"/>
-          <w:sz w:val="68"/>
-        </w:rPr>
         <w:t>NexusFinance — Executive Overview</w:t>
       </w:r>
     </w:p>
     <w:p>
-      <w:pPr>
-        <w:pBdr>
-          <w:bottom w:val="single" w:sz="24" w:space="4" w:color="00BDAA"/>
-        </w:pBdr>
-        <w:spacing w:after="240"/>
-      </w:pPr>
-    </w:p>
-    <w:p>
-      <w:pPr>
-        <w:spacing w:after="80"/>
-      </w:pPr>
       <w:r>
-        <w:rPr>
-          <w:rFonts w:ascii="Segoe UI" w:hAnsi="Segoe UI" w:cs="Segoe UI"/>
-          <w:b w:val="0"/>
-          <w:i w:val="0"/>
-          <w:color w:val="475A6B"/>
-          <w:sz w:val="26"/>
-        </w:rPr>
         <w:t>Digital Lending Platform for Cambodia</w:t>
       </w:r>
     </w:p>
     <w:p>
-      <w:pPr>
-        <w:spacing w:after="0"/>
-      </w:pPr>
       <w:r>
-        <w:rPr>
-          <w:rFonts w:ascii="Segoe UI" w:hAnsi="Segoe UI" w:cs="Segoe UI"/>
-          <w:b/>
-          <w:i w:val="0"/>
-          <w:color w:val="008A7C"/>
-          <w:sz w:val="20"/>
-        </w:rPr>
         <w:t>EN</w:t>
       </w:r>
     </w:p>
     <w:p>
-      <w:pPr>
-        <w:spacing w:after="600"/>
-      </w:pPr>
-    </w:p>
-    <w:tbl>
-      <w:tblPr>
-        <w:tblStyle w:val="TableGrid"/>
-        <w:tblW w:type="auto" w:w="0"/>
-        <w:tblLook w:firstColumn="1" w:firstRow="1" w:lastColumn="0" w:lastRow="0" w:noHBand="0" w:noVBand="1" w:val="04A0"/>
-      </w:tblPr>
-      <w:tblGrid>
-        <w:gridCol w:w="4658"/>
-        <w:gridCol w:w="4658"/>
-      </w:tblGrid>
-      <w:tr>
-        <w:tc>
-          <w:tcPr>
-            <w:tcW w:type="dxa" w:w="3168"/>
-            <w:shd w:val="clear" w:fill="F4F8FA"/>
-            <w:tcMar>
-              <w:top w:w="80" w:type="dxa"/>
-              <w:start w:w="120" w:type="dxa"/>
-              <w:bottom w:w="80" w:type="dxa"/>
-              <w:end w:w="120" w:type="dxa"/>
-            </w:tcMar>
-          </w:tcPr>
-          <w:p>
-            <w:r/>
-            <w:r>
-              <w:rPr>
-                <w:rFonts w:ascii="Segoe UI" w:hAnsi="Segoe UI" w:cs="Segoe UI"/>
-                <w:b/>
-                <w:i w:val="0"/>
-                <w:color w:val="0B1F2E"/>
-                <w:sz w:val="20"/>
-              </w:rPr>
-              <w:t>Document Number</w:t>
-            </w:r>
-          </w:p>
-        </w:tc>
-        <w:tc>
-          <w:tcPr>
-            <w:tcW w:type="dxa" w:w="6048"/>
-            <w:tcMar>
-              <w:top w:w="80" w:type="dxa"/>
-              <w:start w:w="120" w:type="dxa"/>
-              <w:bottom w:w="80" w:type="dxa"/>
-              <w:end w:w="120" w:type="dxa"/>
-            </w:tcMar>
-          </w:tcPr>
-          <w:p>
-            <w:r/>
-            <w:r>
-              <w:rPr>
-                <w:rFonts w:ascii="Segoe UI" w:hAnsi="Segoe UI" w:cs="Segoe UI"/>
-                <w:b w:val="0"/>
-                <w:i w:val="0"/>
-                <w:color w:val="475A6B"/>
-                <w:sz w:val="20"/>
-              </w:rPr>
-              <w:t>NF-DOC-001</w:t>
-            </w:r>
-          </w:p>
-        </w:tc>
-      </w:tr>
-      <w:tr>
-        <w:tc>
-          <w:tcPr>
-            <w:tcW w:type="dxa" w:w="3168"/>
-            <w:shd w:val="clear" w:fill="F4F8FA"/>
-            <w:tcMar>
-              <w:top w:w="80" w:type="dxa"/>
-              <w:start w:w="120" w:type="dxa"/>
-              <w:bottom w:w="80" w:type="dxa"/>
-              <w:end w:w="120" w:type="dxa"/>
-            </w:tcMar>
-          </w:tcPr>
-          <w:p>
-            <w:r/>
-            <w:r>
-              <w:rPr>
-                <w:rFonts w:ascii="Segoe UI" w:hAnsi="Segoe UI" w:cs="Segoe UI"/>
-                <w:b/>
-                <w:i w:val="0"/>
-                <w:color w:val="0B1F2E"/>
-                <w:sz w:val="20"/>
-              </w:rPr>
-              <w:t>Version</w:t>
-            </w:r>
-          </w:p>
-        </w:tc>
-        <w:tc>
-          <w:tcPr>
-            <w:tcW w:type="dxa" w:w="6048"/>
-            <w:tcMar>
-              <w:top w:w="80" w:type="dxa"/>
-              <w:start w:w="120" w:type="dxa"/>
-              <w:bottom w:w="80" w:type="dxa"/>
-              <w:end w:w="120" w:type="dxa"/>
-            </w:tcMar>
-          </w:tcPr>
-          <w:p>
-            <w:r/>
-            <w:r>
-              <w:rPr>
-                <w:rFonts w:ascii="Segoe UI" w:hAnsi="Segoe UI" w:cs="Segoe UI"/>
-                <w:b w:val="0"/>
-                <w:i w:val="0"/>
-                <w:color w:val="475A6B"/>
-                <w:sz w:val="20"/>
-              </w:rPr>
-              <w:t>1.0</w:t>
-            </w:r>
-          </w:p>
-        </w:tc>
-      </w:tr>
-      <w:tr>
-        <w:tc>
-          <w:tcPr>
-            <w:tcW w:type="dxa" w:w="3168"/>
-            <w:shd w:val="clear" w:fill="F4F8FA"/>
-            <w:tcMar>
-              <w:top w:w="80" w:type="dxa"/>
-              <w:start w:w="120" w:type="dxa"/>
-              <w:bottom w:w="80" w:type="dxa"/>
-              <w:end w:w="120" w:type="dxa"/>
-            </w:tcMar>
-          </w:tcPr>
-          <w:p>
-            <w:r/>
-            <w:r>
-              <w:rPr>
-                <w:rFonts w:ascii="Segoe UI" w:hAnsi="Segoe UI" w:cs="Segoe UI"/>
-                <w:b/>
-                <w:i w:val="0"/>
-                <w:color w:val="0B1F2E"/>
-                <w:sz w:val="20"/>
-              </w:rPr>
-              <w:t>Date</w:t>
-            </w:r>
-          </w:p>
-        </w:tc>
-        <w:tc>
-          <w:tcPr>
-            <w:tcW w:type="dxa" w:w="6048"/>
-            <w:tcMar>
-              <w:top w:w="80" w:type="dxa"/>
-              <w:start w:w="120" w:type="dxa"/>
-              <w:bottom w:w="80" w:type="dxa"/>
-              <w:end w:w="120" w:type="dxa"/>
-            </w:tcMar>
-          </w:tcPr>
-          <w:p>
-            <w:r/>
-            <w:r>
-              <w:rPr>
-                <w:rFonts w:ascii="Segoe UI" w:hAnsi="Segoe UI" w:cs="Segoe UI"/>
-                <w:b w:val="0"/>
-                <w:i w:val="0"/>
-                <w:color w:val="475A6B"/>
-                <w:sz w:val="20"/>
-              </w:rPr>
-              <w:t>August 2026</w:t>
-            </w:r>
-          </w:p>
-        </w:tc>
-      </w:tr>
-      <w:tr>
-        <w:tc>
-          <w:tcPr>
-            <w:tcW w:type="dxa" w:w="3168"/>
-            <w:shd w:val="clear" w:fill="F4F8FA"/>
-            <w:tcMar>
-              <w:top w:w="80" w:type="dxa"/>
-              <w:start w:w="120" w:type="dxa"/>
-              <w:bottom w:w="80" w:type="dxa"/>
-              <w:end w:w="120" w:type="dxa"/>
-            </w:tcMar>
-          </w:tcPr>
-          <w:p>
-            <w:r/>
-            <w:r>
-              <w:rPr>
-                <w:rFonts w:ascii="Segoe UI" w:hAnsi="Segoe UI" w:cs="Segoe UI"/>
-                <w:b/>
-                <w:i w:val="0"/>
-                <w:color w:val="0B1F2E"/>
-                <w:sz w:val="20"/>
-              </w:rPr>
-              <w:t>Prepared By</w:t>
-            </w:r>
-          </w:p>
-        </w:tc>
-        <w:tc>
-          <w:tcPr>
-            <w:tcW w:type="dxa" w:w="6048"/>
-            <w:tcMar>
-              <w:top w:w="80" w:type="dxa"/>
-              <w:start w:w="120" w:type="dxa"/>
-              <w:bottom w:w="80" w:type="dxa"/>
-              <w:end w:w="120" w:type="dxa"/>
-            </w:tcMar>
-          </w:tcPr>
-          <w:p>
-            <w:r/>
-            <w:r>
-              <w:rPr>
-                <w:rFonts w:ascii="Segoe UI" w:hAnsi="Segoe UI" w:cs="Segoe UI"/>
-                <w:b w:val="0"/>
-                <w:i w:val="0"/>
-                <w:color w:val="475A6B"/>
-                <w:sz w:val="20"/>
-              </w:rPr>
-              <w:t>NDX Digital Support</w:t>
-            </w:r>
-          </w:p>
-        </w:tc>
-      </w:tr>
-      <w:tr>
-        <w:tc>
-          <w:tcPr>
-            <w:tcW w:type="dxa" w:w="3168"/>
-            <w:shd w:val="clear" w:fill="F4F8FA"/>
-            <w:tcMar>
-              <w:top w:w="80" w:type="dxa"/>
-              <w:start w:w="120" w:type="dxa"/>
-              <w:bottom w:w="80" w:type="dxa"/>
-              <w:end w:w="120" w:type="dxa"/>
-            </w:tcMar>
-          </w:tcPr>
-          <w:p>
-            <w:r/>
-            <w:r>
-              <w:rPr>
-                <w:rFonts w:ascii="Segoe UI" w:hAnsi="Segoe UI" w:cs="Segoe UI"/>
-                <w:b/>
-                <w:i w:val="0"/>
-                <w:color w:val="0B1F2E"/>
-                <w:sz w:val="20"/>
-              </w:rPr>
-              <w:t>Classification</w:t>
-            </w:r>
-          </w:p>
-        </w:tc>
-        <w:tc>
-          <w:tcPr>
-            <w:tcW w:type="dxa" w:w="6048"/>
-            <w:tcMar>
-              <w:top w:w="80" w:type="dxa"/>
-              <w:start w:w="120" w:type="dxa"/>
-              <w:bottom w:w="80" w:type="dxa"/>
-              <w:end w:w="120" w:type="dxa"/>
-            </w:tcMar>
-          </w:tcPr>
-          <w:p>
-            <w:r/>
-            <w:r>
-              <w:rPr>
-                <w:rFonts w:ascii="Segoe UI" w:hAnsi="Segoe UI" w:cs="Segoe UI"/>
-                <w:b w:val="0"/>
-                <w:i w:val="0"/>
-                <w:color w:val="475A6B"/>
-                <w:sz w:val="20"/>
-              </w:rPr>
-              <w:t>Internal &amp; Confidential</w:t>
-            </w:r>
-          </w:p>
-        </w:tc>
-      </w:tr>
-    </w:tbl>
-    <w:p>
-      <w:pPr>
-        <w:spacing w:after="280"/>
-      </w:pPr>
-    </w:p>
-    <w:p>
       <w:r>
-        <w:rPr>
-          <w:rFonts w:ascii="Segoe UI" w:hAnsi="Segoe UI" w:cs="Segoe UI"/>
-          <w:b w:val="0"/>
-          <w:i w:val="0"/>
-          <w:color w:val="6B7A89"/>
-          <w:sz w:val="18"/>
-        </w:rPr>
-        <w:t>Loan Management  •  KHQR Payments  •  Telegram Bot  •  Android App</w:t>
-      </w:r>
-    </w:p>
-    <w:p>
-      <w:r>
-        <w:br w:type="page"/>
-      </w:r>
-    </w:p>
-    <w:p>
-      <w:pPr>
-        <w:spacing w:after="120"/>
-        <w:pBdr>
-          <w:bottom w:val="single" w:sz="12" w:space="4" w:color="00BDAA"/>
-        </w:pBdr>
-      </w:pPr>
-      <w:r>
-        <w:rPr>
-          <w:rFonts w:ascii="Segoe UI" w:hAnsi="Segoe UI" w:cs="Segoe UI"/>
-          <w:b/>
-          <w:i w:val="0"/>
-          <w:color w:val="0B1F2E"/>
-          <w:sz w:val="32"/>
-        </w:rPr>
-        <w:t>Table of Contents</w:t>
-      </w:r>
-    </w:p>
-    <w:p>
-      <w:pPr>
-        <w:spacing w:after="160"/>
-      </w:pPr>
-    </w:p>
-    <w:p>
-      <w:pPr>
-        <w:tabs>
-          <w:tab w:pos="9360" w:val="right" w:leader="hyphen"/>
-        </w:tabs>
-        <w:spacing w:after="80"/>
-      </w:pPr>
-      <w:r>
-        <w:rPr>
-          <w:rFonts w:ascii="Segoe UI" w:hAnsi="Segoe UI" w:cs="Segoe UI"/>
-          <w:b/>
-          <w:i w:val="0"/>
-          <w:color w:val="008A7C"/>
-          <w:sz w:val="22"/>
-        </w:rPr>
-        <w:t xml:space="preserve">1.  </w:t>
-      </w:r>
-      <w:r>
-        <w:rPr>
-          <w:rFonts w:ascii="Segoe UI" w:hAnsi="Segoe UI" w:cs="Segoe UI"/>
-          <w:b w:val="0"/>
-          <w:i w:val="0"/>
-          <w:color w:val="0B1F2E"/>
-          <w:sz w:val="22"/>
-        </w:rPr>
-        <w:t>Executive Summary</w:t>
-      </w:r>
-    </w:p>
-    <w:p>
-      <w:pPr>
-        <w:tabs>
-          <w:tab w:pos="9360" w:val="right" w:leader="hyphen"/>
-        </w:tabs>
-        <w:spacing w:after="80"/>
-      </w:pPr>
-      <w:r>
-        <w:rPr>
-          <w:rFonts w:ascii="Segoe UI" w:hAnsi="Segoe UI" w:cs="Segoe UI"/>
-          <w:b/>
-          <w:i w:val="0"/>
-          <w:color w:val="008A7C"/>
-          <w:sz w:val="22"/>
-        </w:rPr>
-        <w:t xml:space="preserve">2.  </w:t>
-      </w:r>
-      <w:r>
-        <w:rPr>
-          <w:rFonts w:ascii="Segoe UI" w:hAnsi="Segoe UI" w:cs="Segoe UI"/>
-          <w:b w:val="0"/>
-          <w:i w:val="0"/>
-          <w:color w:val="0B1F2E"/>
-          <w:sz w:val="22"/>
-        </w:rPr>
-        <w:t>What We Delivered</w:t>
-      </w:r>
-    </w:p>
-    <w:p>
-      <w:pPr>
-        <w:tabs>
-          <w:tab w:pos="9360" w:val="right" w:leader="hyphen"/>
-        </w:tabs>
-        <w:spacing w:after="80"/>
-      </w:pPr>
-      <w:r>
-        <w:rPr>
-          <w:rFonts w:ascii="Segoe UI" w:hAnsi="Segoe UI" w:cs="Segoe UI"/>
-          <w:b/>
-          <w:i w:val="0"/>
-          <w:color w:val="008A7C"/>
-          <w:sz w:val="22"/>
-        </w:rPr>
-        <w:t xml:space="preserve">3.  </w:t>
-      </w:r>
-      <w:r>
-        <w:rPr>
-          <w:rFonts w:ascii="Segoe UI" w:hAnsi="Segoe UI" w:cs="Segoe UI"/>
-          <w:b w:val="0"/>
-          <w:i w:val="0"/>
-          <w:color w:val="0B1F2E"/>
-          <w:sz w:val="22"/>
-        </w:rPr>
-        <w:t>Demo Accounts</w:t>
-      </w:r>
-    </w:p>
-    <w:p>
-      <w:pPr>
-        <w:tabs>
-          <w:tab w:pos="9360" w:val="right" w:leader="hyphen"/>
-        </w:tabs>
-        <w:spacing w:after="80"/>
-      </w:pPr>
-      <w:r>
-        <w:rPr>
-          <w:rFonts w:ascii="Segoe UI" w:hAnsi="Segoe UI" w:cs="Segoe UI"/>
-          <w:b/>
-          <w:i w:val="0"/>
-          <w:color w:val="008A7C"/>
-          <w:sz w:val="22"/>
-        </w:rPr>
-        <w:t xml:space="preserve">4.  </w:t>
-      </w:r>
-      <w:r>
-        <w:rPr>
-          <w:rFonts w:ascii="Segoe UI" w:hAnsi="Segoe UI" w:cs="Segoe UI"/>
-          <w:b w:val="0"/>
-          <w:i w:val="0"/>
-          <w:color w:val="0B1F2E"/>
-          <w:sz w:val="22"/>
-        </w:rPr>
-        <w:t>Technology Stack</w:t>
-      </w:r>
-    </w:p>
-    <w:p>
-      <w:pPr>
-        <w:tabs>
-          <w:tab w:pos="9360" w:val="right" w:leader="hyphen"/>
-        </w:tabs>
-        <w:spacing w:after="80"/>
-      </w:pPr>
-      <w:r>
-        <w:rPr>
-          <w:rFonts w:ascii="Segoe UI" w:hAnsi="Segoe UI" w:cs="Segoe UI"/>
-          <w:b/>
-          <w:i w:val="0"/>
-          <w:color w:val="008A7C"/>
-          <w:sz w:val="22"/>
-        </w:rPr>
-        <w:t xml:space="preserve">5.  </w:t>
-      </w:r>
-      <w:r>
-        <w:rPr>
-          <w:rFonts w:ascii="Segoe UI" w:hAnsi="Segoe UI" w:cs="Segoe UI"/>
-          <w:b w:val="0"/>
-          <w:i w:val="0"/>
-          <w:color w:val="0B1F2E"/>
-          <w:sz w:val="22"/>
-        </w:rPr>
-        <w:t>Security &amp; Compliance Highlights</w:t>
-      </w:r>
-    </w:p>
-    <w:p>
-      <w:pPr>
-        <w:tabs>
-          <w:tab w:pos="9360" w:val="right" w:leader="hyphen"/>
-        </w:tabs>
-        <w:spacing w:after="80"/>
-      </w:pPr>
-      <w:r>
-        <w:rPr>
-          <w:rFonts w:ascii="Segoe UI" w:hAnsi="Segoe UI" w:cs="Segoe UI"/>
-          <w:b/>
-          <w:i w:val="0"/>
-          <w:color w:val="008A7C"/>
-          <w:sz w:val="22"/>
-        </w:rPr>
-        <w:t xml:space="preserve">6.  </w:t>
-      </w:r>
-      <w:r>
-        <w:rPr>
-          <w:rFonts w:ascii="Segoe UI" w:hAnsi="Segoe UI" w:cs="Segoe UI"/>
-          <w:b w:val="0"/>
-          <w:i w:val="0"/>
-          <w:color w:val="0B1F2E"/>
-          <w:sz w:val="22"/>
-        </w:rPr>
-        <w:t>Roadmap</w:t>
-      </w:r>
-    </w:p>
-    <w:p>
-      <w:r>
-        <w:br w:type="page"/>
+        <w:t>Loan Management  •  KHQR Payments  •  Telegram Bot  •  Android App  •  Phone OTP</w:t>
       </w:r>
     </w:p>
     <w:p>
       <w:pPr>
         <w:pStyle w:val="Heading1"/>
-        <w:spacing w:before="360" w:after="120"/>
-        <w:pBdr>
-          <w:bottom w:val="single" w:sz="12" w:space="4" w:color="00BDAA"/>
-        </w:pBdr>
       </w:pPr>
       <w:r>
-        <w:rPr>
-          <w:rFonts w:ascii="Segoe UI" w:hAnsi="Segoe UI" w:cs="Segoe UI"/>
-          <w:b/>
-          <w:i w:val="0"/>
-          <w:color w:val="0B1F2E"/>
-          <w:sz w:val="32"/>
-        </w:rPr>
+        <w:t>Table of Contents</w:t>
+      </w:r>
+    </w:p>
+    <w:p>
+      <w:r>
+        <w:t>1.  Executive Summary</w:t>
+      </w:r>
+    </w:p>
+    <w:p>
+      <w:r>
+        <w:t>2.  What We Delivered</w:t>
+      </w:r>
+    </w:p>
+    <w:p>
+      <w:r>
+        <w:t>3.  Demo Accounts</w:t>
+      </w:r>
+    </w:p>
+    <w:p>
+      <w:r>
+        <w:t>4.  Technology Stack</w:t>
+      </w:r>
+    </w:p>
+    <w:p>
+      <w:r>
+        <w:t>5.  Security &amp; Compliance Highlights</w:t>
+      </w:r>
+    </w:p>
+    <w:p>
+      <w:r>
+        <w:t>6.  Roadmap</w:t>
+      </w:r>
+    </w:p>
+    <w:p>
+      <w:pPr>
+        <w:pStyle w:val="Heading1"/>
+      </w:pPr>
+      <w:r>
         <w:t>1. Executive Summary</w:t>
       </w:r>
     </w:p>
     <w:p>
       <w:r>
-        <w:rPr>
-          <w:rFonts w:ascii="Segoe UI" w:hAnsi="Segoe UI" w:cs="Segoe UI"/>
-          <w:b w:val="0"/>
-          <w:i w:val="0"/>
-          <w:color w:val="0B1F2E"/>
-          <w:sz w:val="21"/>
-        </w:rPr>
-        <w:t>NexusFinance is a full-stack digital lending platform built for microfinance operations in Cambodia. It covers the complete lending lifecycle — from customer loan applications, through officer review and KYC verification, to repayment collection via KHQR payments — with real-time oversight through a secure web dashboard and a Telegram bot.</w:t>
+        <w:t>NexusFinance is a full-stack digital lending platform built for microfinance operations in Cambodia. It covers the complete lending lifecycle — from customer loan applications, through officer review and phone/KYC verification, to repayment collection via KHQR payments — with real-time oversight through a secure web dashboard and a Telegram bot.</w:t>
       </w:r>
-    </w:p>
-    <w:tbl>
-      <w:tblPr>
-        <w:tblStyle w:val="TableGrid"/>
-        <w:tblW w:type="auto" w:w="0"/>
-        <w:tblLook w:firstColumn="1" w:firstRow="1" w:lastColumn="0" w:lastRow="0" w:noHBand="0" w:noVBand="1" w:val="04A0"/>
-      </w:tblPr>
-      <w:tblGrid>
-        <w:gridCol w:w="9317"/>
-      </w:tblGrid>
-      <w:tr>
-        <w:tc>
-          <w:tcPr>
-            <w:tcW w:type="dxa" w:w="9317"/>
-            <w:tcBorders>
-              <w:left w:val="single" w:sz="28" w:space="0" w:color="2E7D32"/>
-            </w:tcBorders>
-            <w:shd w:val="clear" w:fill="E8F5E9"/>
-            <w:tcMar>
-              <w:top w:w="140" w:type="dxa"/>
-              <w:start w:w="200" w:type="dxa"/>
-              <w:bottom w:w="140" w:type="dxa"/>
-              <w:end w:w="200" w:type="dxa"/>
-            </w:tcMar>
-          </w:tcPr>
-          <w:p>
-            <w:pPr>
-              <w:spacing w:after="60"/>
-            </w:pPr>
-            <w:r/>
-            <w:r>
-              <w:rPr>
-                <w:rFonts w:ascii="Segoe UI" w:hAnsi="Segoe UI" w:cs="Segoe UI"/>
-                <w:b/>
-                <w:i w:val="0"/>
-                <w:color w:val="0B1F2E"/>
-                <w:sz w:val="21"/>
-              </w:rPr>
-              <w:t>Why this matters</w:t>
-            </w:r>
-          </w:p>
-          <w:p>
-            <w:pPr>
-              <w:spacing w:after="0"/>
-            </w:pPr>
-            <w:r>
-              <w:rPr>
-                <w:rFonts w:ascii="Segoe UI" w:hAnsi="Segoe UI" w:cs="Segoe UI"/>
-                <w:b w:val="0"/>
-                <w:i w:val="0"/>
-                <w:color w:val="0B1F2E"/>
-                <w:sz w:val="20"/>
-              </w:rPr>
-              <w:t>NexusFinance replaces manual, paper-based lending workflows with a secure, auditable, and bilingual (English / Khmer) digital system.</w:t>
-            </w:r>
-          </w:p>
-        </w:tc>
-      </w:tr>
-    </w:tbl>
-    <w:p>
-      <w:pPr>
-        <w:spacing w:after="40"/>
-      </w:pPr>
     </w:p>
     <w:p>
       <w:pPr>
         <w:pStyle w:val="Heading1"/>
-        <w:spacing w:before="360" w:after="120"/>
-        <w:pBdr>
-          <w:bottom w:val="single" w:sz="12" w:space="4" w:color="00BDAA"/>
-        </w:pBdr>
       </w:pPr>
       <w:r>
-        <w:rPr>
-          <w:rFonts w:ascii="Segoe UI" w:hAnsi="Segoe UI" w:cs="Segoe UI"/>
-          <w:b/>
-          <w:i w:val="0"/>
-          <w:color w:val="0B1F2E"/>
-          <w:sz w:val="32"/>
-        </w:rPr>
         <w:t>2. What We Delivered</w:t>
       </w:r>
     </w:p>
-    <w:tbl>
-      <w:tblPr>
-        <w:tblStyle w:val="TableGrid"/>
-        <w:tblW w:type="auto" w:w="0"/>
-        <w:jc w:val="center"/>
-        <w:tblLayout w:type="fixed"/>
-        <w:tblLook w:firstColumn="1" w:firstRow="1" w:lastColumn="0" w:lastRow="0" w:noHBand="0" w:noVBand="1" w:val="04A0"/>
-      </w:tblPr>
-      <w:tblGrid>
-        <w:gridCol w:w="4658"/>
-        <w:gridCol w:w="4658"/>
-      </w:tblGrid>
-      <w:tr>
-        <w:tc>
-          <w:tcPr>
-            <w:tcW w:type="dxa" w:w="2592"/>
-            <w:shd w:val="clear" w:fill="0B1F2E"/>
-            <w:tcMar>
-              <w:top w:w="80" w:type="dxa"/>
-              <w:start w:w="120" w:type="dxa"/>
-              <w:bottom w:w="80" w:type="dxa"/>
-              <w:end w:w="120" w:type="dxa"/>
-            </w:tcMar>
-            <w:vAlign w:val="center"/>
-          </w:tcPr>
-          <w:p>
-            <w:pPr>
-              <w:jc w:val="left"/>
-            </w:pPr>
-            <w:r/>
-            <w:r>
-              <w:rPr>
-                <w:rFonts w:ascii="Segoe UI" w:hAnsi="Segoe UI" w:cs="Segoe UI"/>
-                <w:b/>
-                <w:i w:val="0"/>
-                <w:color w:val="FFFFFF"/>
-                <w:sz w:val="19"/>
-              </w:rPr>
-              <w:t>Capability</w:t>
-            </w:r>
-          </w:p>
-        </w:tc>
-        <w:tc>
-          <w:tcPr>
-            <w:tcW w:type="dxa" w:w="6624"/>
-            <w:shd w:val="clear" w:fill="0B1F2E"/>
-            <w:tcMar>
-              <w:top w:w="80" w:type="dxa"/>
-              <w:start w:w="120" w:type="dxa"/>
-              <w:bottom w:w="80" w:type="dxa"/>
-              <w:end w:w="120" w:type="dxa"/>
-            </w:tcMar>
-            <w:vAlign w:val="center"/>
-          </w:tcPr>
-          <w:p>
-            <w:pPr>
-              <w:jc w:val="left"/>
-            </w:pPr>
-            <w:r/>
-            <w:r>
-              <w:rPr>
-                <w:rFonts w:ascii="Segoe UI" w:hAnsi="Segoe UI" w:cs="Segoe UI"/>
-                <w:b/>
-                <w:i w:val="0"/>
-                <w:color w:val="FFFFFF"/>
-                <w:sz w:val="19"/>
-              </w:rPr>
-              <w:t>Description</w:t>
-            </w:r>
-          </w:p>
-        </w:tc>
-      </w:tr>
-      <w:tr>
-        <w:tc>
-          <w:tcPr>
-            <w:tcW w:type="dxa" w:w="2592"/>
-            <w:tcMar>
-              <w:top w:w="80" w:type="dxa"/>
-              <w:start w:w="120" w:type="dxa"/>
-              <w:bottom w:w="80" w:type="dxa"/>
-              <w:end w:w="120" w:type="dxa"/>
-            </w:tcMar>
-            <w:vAlign w:val="center"/>
-          </w:tcPr>
-          <w:p>
-            <w:pPr>
-              <w:spacing w:after="20"/>
-            </w:pPr>
-            <w:r/>
-            <w:r>
-              <w:rPr>
-                <w:rFonts w:ascii="Segoe UI" w:hAnsi="Segoe UI" w:cs="Segoe UI"/>
-                <w:b w:val="0"/>
-                <w:i w:val="0"/>
-                <w:color w:val="0B1F2E"/>
-                <w:sz w:val="19"/>
-              </w:rPr>
-              <w:t>Web App</w:t>
-            </w:r>
-          </w:p>
-        </w:tc>
-        <w:tc>
-          <w:tcPr>
-            <w:tcW w:type="dxa" w:w="6624"/>
-            <w:tcMar>
-              <w:top w:w="80" w:type="dxa"/>
-              <w:start w:w="120" w:type="dxa"/>
-              <w:bottom w:w="80" w:type="dxa"/>
-              <w:end w:w="120" w:type="dxa"/>
-            </w:tcMar>
-            <w:vAlign w:val="center"/>
-          </w:tcPr>
-          <w:p>
-            <w:pPr>
-              <w:spacing w:after="20"/>
-            </w:pPr>
-            <w:r/>
-            <w:r>
-              <w:rPr>
-                <w:rFonts w:ascii="Segoe UI" w:hAnsi="Segoe UI" w:cs="Segoe UI"/>
-                <w:b w:val="0"/>
-                <w:i w:val="0"/>
-                <w:color w:val="0B1F2E"/>
-                <w:sz w:val="19"/>
-              </w:rPr>
-              <w:t>React SPA with three portals — Customer, Loan Officer, Super Admin</w:t>
-            </w:r>
-          </w:p>
-        </w:tc>
-      </w:tr>
-      <w:tr>
-        <w:tc>
-          <w:tcPr>
-            <w:tcW w:type="dxa" w:w="2592"/>
-            <w:shd w:val="clear" w:fill="F4F8FA"/>
-            <w:tcMar>
-              <w:top w:w="80" w:type="dxa"/>
-              <w:start w:w="120" w:type="dxa"/>
-              <w:bottom w:w="80" w:type="dxa"/>
-              <w:end w:w="120" w:type="dxa"/>
-            </w:tcMar>
-            <w:vAlign w:val="center"/>
-          </w:tcPr>
-          <w:p>
-            <w:pPr>
-              <w:spacing w:after="20"/>
-            </w:pPr>
-            <w:r/>
-            <w:r>
-              <w:rPr>
-                <w:rFonts w:ascii="Segoe UI" w:hAnsi="Segoe UI" w:cs="Segoe UI"/>
-                <w:b w:val="0"/>
-                <w:i w:val="0"/>
-                <w:color w:val="0B1F2E"/>
-                <w:sz w:val="19"/>
-              </w:rPr>
-              <w:t>Backend API</w:t>
-            </w:r>
-          </w:p>
-        </w:tc>
-        <w:tc>
-          <w:tcPr>
-            <w:tcW w:type="dxa" w:w="6624"/>
-            <w:shd w:val="clear" w:fill="F4F8FA"/>
-            <w:tcMar>
-              <w:top w:w="80" w:type="dxa"/>
-              <w:start w:w="120" w:type="dxa"/>
-              <w:bottom w:w="80" w:type="dxa"/>
-              <w:end w:w="120" w:type="dxa"/>
-            </w:tcMar>
-            <w:vAlign w:val="center"/>
-          </w:tcPr>
-          <w:p>
-            <w:pPr>
-              <w:spacing w:after="20"/>
-            </w:pPr>
-            <w:r/>
-            <w:r>
-              <w:rPr>
-                <w:rFonts w:ascii="Segoe UI" w:hAnsi="Segoe UI" w:cs="Segoe UI"/>
-                <w:b w:val="0"/>
-                <w:i w:val="0"/>
-                <w:color w:val="0B1F2E"/>
-                <w:sz w:val="19"/>
-              </w:rPr>
-              <w:t>Node.js/Express REST API with JWT authentication and audit logging</w:t>
-            </w:r>
-          </w:p>
-        </w:tc>
-      </w:tr>
-      <w:tr>
-        <w:tc>
-          <w:tcPr>
-            <w:tcW w:type="dxa" w:w="2592"/>
-            <w:tcMar>
-              <w:top w:w="80" w:type="dxa"/>
-              <w:start w:w="120" w:type="dxa"/>
-              <w:bottom w:w="80" w:type="dxa"/>
-              <w:end w:w="120" w:type="dxa"/>
-            </w:tcMar>
-            <w:vAlign w:val="center"/>
-          </w:tcPr>
-          <w:p>
-            <w:pPr>
-              <w:spacing w:after="20"/>
-            </w:pPr>
-            <w:r/>
-            <w:r>
-              <w:rPr>
-                <w:rFonts w:ascii="Segoe UI" w:hAnsi="Segoe UI" w:cs="Segoe UI"/>
-                <w:b w:val="0"/>
-                <w:i w:val="0"/>
-                <w:color w:val="0B1F2E"/>
-                <w:sz w:val="19"/>
-              </w:rPr>
-              <w:t>Auth</w:t>
-            </w:r>
-          </w:p>
-        </w:tc>
-        <w:tc>
-          <w:tcPr>
-            <w:tcW w:type="dxa" w:w="6624"/>
-            <w:tcMar>
-              <w:top w:w="80" w:type="dxa"/>
-              <w:start w:w="120" w:type="dxa"/>
-              <w:bottom w:w="80" w:type="dxa"/>
-              <w:end w:w="120" w:type="dxa"/>
-            </w:tcMar>
-            <w:vAlign w:val="center"/>
-          </w:tcPr>
-          <w:p>
-            <w:pPr>
-              <w:spacing w:after="20"/>
-            </w:pPr>
-            <w:r/>
-            <w:r>
-              <w:rPr>
-                <w:rFonts w:ascii="Segoe UI" w:hAnsi="Segoe UI" w:cs="Segoe UI"/>
-                <w:b w:val="0"/>
-                <w:i w:val="0"/>
-                <w:color w:val="0B1F2E"/>
-                <w:sz w:val="19"/>
-              </w:rPr>
-              <w:t>Email + password with Brevo OTP verification — login blocked until the email is verified</w:t>
-            </w:r>
-          </w:p>
-        </w:tc>
-      </w:tr>
-      <w:tr>
-        <w:tc>
-          <w:tcPr>
-            <w:tcW w:type="dxa" w:w="2592"/>
-            <w:shd w:val="clear" w:fill="F4F8FA"/>
-            <w:tcMar>
-              <w:top w:w="80" w:type="dxa"/>
-              <w:start w:w="120" w:type="dxa"/>
-              <w:bottom w:w="80" w:type="dxa"/>
-              <w:end w:w="120" w:type="dxa"/>
-            </w:tcMar>
-            <w:vAlign w:val="center"/>
-          </w:tcPr>
-          <w:p>
-            <w:pPr>
-              <w:spacing w:after="20"/>
-            </w:pPr>
-            <w:r/>
-            <w:r>
-              <w:rPr>
-                <w:rFonts w:ascii="Segoe UI" w:hAnsi="Segoe UI" w:cs="Segoe UI"/>
-                <w:b w:val="0"/>
-                <w:i w:val="0"/>
-                <w:color w:val="0B1F2E"/>
-                <w:sz w:val="19"/>
-              </w:rPr>
-              <w:t>Payments</w:t>
-            </w:r>
-          </w:p>
-        </w:tc>
-        <w:tc>
-          <w:tcPr>
-            <w:tcW w:type="dxa" w:w="6624"/>
-            <w:shd w:val="clear" w:fill="F4F8FA"/>
-            <w:tcMar>
-              <w:top w:w="80" w:type="dxa"/>
-              <w:start w:w="120" w:type="dxa"/>
-              <w:bottom w:w="80" w:type="dxa"/>
-              <w:end w:w="120" w:type="dxa"/>
-            </w:tcMar>
-            <w:vAlign w:val="center"/>
-          </w:tcPr>
-          <w:p>
-            <w:pPr>
-              <w:spacing w:after="20"/>
-            </w:pPr>
-            <w:r/>
-            <w:r>
-              <w:rPr>
-                <w:rFonts w:ascii="Segoe UI" w:hAnsi="Segoe UI" w:cs="Segoe UI"/>
-                <w:b w:val="0"/>
-                <w:i w:val="0"/>
-                <w:color w:val="0B1F2E"/>
-                <w:sz w:val="19"/>
-              </w:rPr>
-              <w:t>KHQR (Bakong) integration and ABA PayWay hosted checkout</w:t>
-            </w:r>
-          </w:p>
-        </w:tc>
-      </w:tr>
-      <w:tr>
-        <w:tc>
-          <w:tcPr>
-            <w:tcW w:type="dxa" w:w="2592"/>
-            <w:tcMar>
-              <w:top w:w="80" w:type="dxa"/>
-              <w:start w:w="120" w:type="dxa"/>
-              <w:bottom w:w="80" w:type="dxa"/>
-              <w:end w:w="120" w:type="dxa"/>
-            </w:tcMar>
-            <w:vAlign w:val="center"/>
-          </w:tcPr>
-          <w:p>
-            <w:pPr>
-              <w:spacing w:after="20"/>
-            </w:pPr>
-            <w:r/>
-            <w:r>
-              <w:rPr>
-                <w:rFonts w:ascii="Segoe UI" w:hAnsi="Segoe UI" w:cs="Segoe UI"/>
-                <w:b w:val="0"/>
-                <w:i w:val="0"/>
-                <w:color w:val="0B1F2E"/>
-                <w:sz w:val="19"/>
-              </w:rPr>
-              <w:t>Telegram Bot</w:t>
-            </w:r>
-          </w:p>
-        </w:tc>
-        <w:tc>
-          <w:tcPr>
-            <w:tcW w:type="dxa" w:w="6624"/>
-            <w:tcMar>
-              <w:top w:w="80" w:type="dxa"/>
-              <w:start w:w="120" w:type="dxa"/>
-              <w:bottom w:w="80" w:type="dxa"/>
-              <w:end w:w="120" w:type="dxa"/>
-            </w:tcMar>
-            <w:vAlign w:val="center"/>
-          </w:tcPr>
-          <w:p>
-            <w:pPr>
-              <w:spacing w:after="20"/>
-            </w:pPr>
-            <w:r/>
-            <w:r>
-              <w:rPr>
-                <w:rFonts w:ascii="Segoe UI" w:hAnsi="Segoe UI" w:cs="Segoe UI"/>
-                <w:b w:val="0"/>
-                <w:i w:val="0"/>
-                <w:color w:val="0B1F2E"/>
-                <w:sz w:val="19"/>
-              </w:rPr>
-              <w:t>Payment notifications, reminders, admin commands</w:t>
-            </w:r>
-          </w:p>
-        </w:tc>
-      </w:tr>
-      <w:tr>
-        <w:tc>
-          <w:tcPr>
-            <w:tcW w:type="dxa" w:w="2592"/>
-            <w:shd w:val="clear" w:fill="F4F8FA"/>
-            <w:tcMar>
-              <w:top w:w="80" w:type="dxa"/>
-              <w:start w:w="120" w:type="dxa"/>
-              <w:bottom w:w="80" w:type="dxa"/>
-              <w:end w:w="120" w:type="dxa"/>
-            </w:tcMar>
-            <w:vAlign w:val="center"/>
-          </w:tcPr>
-          <w:p>
-            <w:pPr>
-              <w:spacing w:after="20"/>
-            </w:pPr>
-            <w:r/>
-            <w:r>
-              <w:rPr>
-                <w:rFonts w:ascii="Segoe UI" w:hAnsi="Segoe UI" w:cs="Segoe UI"/>
-                <w:b w:val="0"/>
-                <w:i w:val="0"/>
-                <w:color w:val="0B1F2E"/>
-                <w:sz w:val="19"/>
-              </w:rPr>
-              <w:t>Android App</w:t>
-            </w:r>
-          </w:p>
-        </w:tc>
-        <w:tc>
-          <w:tcPr>
-            <w:tcW w:type="dxa" w:w="6624"/>
-            <w:shd w:val="clear" w:fill="F4F8FA"/>
-            <w:tcMar>
-              <w:top w:w="80" w:type="dxa"/>
-              <w:start w:w="120" w:type="dxa"/>
-              <w:bottom w:w="80" w:type="dxa"/>
-              <w:end w:w="120" w:type="dxa"/>
-            </w:tcMar>
-            <w:vAlign w:val="center"/>
-          </w:tcPr>
-          <w:p>
-            <w:pPr>
-              <w:spacing w:after="20"/>
-            </w:pPr>
-            <w:r/>
-            <w:r>
-              <w:rPr>
-                <w:rFonts w:ascii="Segoe UI" w:hAnsi="Segoe UI" w:cs="Segoe UI"/>
-                <w:b w:val="0"/>
-                <w:i w:val="0"/>
-                <w:color w:val="0B1F2E"/>
-                <w:sz w:val="19"/>
-              </w:rPr>
-              <w:t>Expo WebView shell — installable APK</w:t>
-            </w:r>
-          </w:p>
-        </w:tc>
-      </w:tr>
-      <w:tr>
-        <w:tc>
-          <w:tcPr>
-            <w:tcW w:type="dxa" w:w="2592"/>
-            <w:tcMar>
-              <w:top w:w="80" w:type="dxa"/>
-              <w:start w:w="120" w:type="dxa"/>
-              <w:bottom w:w="80" w:type="dxa"/>
-              <w:end w:w="120" w:type="dxa"/>
-            </w:tcMar>
-            <w:vAlign w:val="center"/>
-          </w:tcPr>
-          <w:p>
-            <w:pPr>
-              <w:spacing w:after="20"/>
-            </w:pPr>
-            <w:r/>
-            <w:r>
-              <w:rPr>
-                <w:rFonts w:ascii="Segoe UI" w:hAnsi="Segoe UI" w:cs="Segoe UI"/>
-                <w:b w:val="0"/>
-                <w:i w:val="0"/>
-                <w:color w:val="0B1F2E"/>
-                <w:sz w:val="19"/>
-              </w:rPr>
-              <w:t>Deployment</w:t>
-            </w:r>
-          </w:p>
-        </w:tc>
-        <w:tc>
-          <w:tcPr>
-            <w:tcW w:type="dxa" w:w="6624"/>
-            <w:tcMar>
-              <w:top w:w="80" w:type="dxa"/>
-              <w:start w:w="120" w:type="dxa"/>
-              <w:bottom w:w="80" w:type="dxa"/>
-              <w:end w:w="120" w:type="dxa"/>
-            </w:tcMar>
-            <w:vAlign w:val="center"/>
-          </w:tcPr>
-          <w:p>
-            <w:pPr>
-              <w:spacing w:after="20"/>
-            </w:pPr>
-            <w:r/>
-            <w:r>
-              <w:rPr>
-                <w:rFonts w:ascii="Segoe UI" w:hAnsi="Segoe UI" w:cs="Segoe UI"/>
-                <w:b w:val="0"/>
-                <w:i w:val="0"/>
-                <w:color w:val="0B1F2E"/>
-                <w:sz w:val="19"/>
-              </w:rPr>
-              <w:t>Vercel (frontend) + Render (backend) + Supabase (database)</w:t>
-            </w:r>
-          </w:p>
-        </w:tc>
-      </w:tr>
-    </w:tbl>
     <w:p>
       <w:pPr>
-        <w:spacing w:after="40"/>
+        <w:pStyle w:val="ListBullet"/>
       </w:pPr>
+      <w:r>
+        <w:t>Customer Portal: Loan application, balance tracking, KHQR repayment, loan progress, transaction history</w:t>
+      </w:r>
+    </w:p>
+    <w:p>
+      <w:pPr>
+        <w:pStyle w:val="ListBullet"/>
+      </w:pPr>
+      <w:r>
+        <w:t>Loan Officer Portal: Application review with status badges, credit scoring, approval workflow</w:t>
+      </w:r>
+    </w:p>
+    <w:p>
+      <w:pPr>
+        <w:pStyle w:val="ListBullet"/>
+      </w:pPr>
+      <w:r>
+        <w:t>Super Admin Portal: Analytics, user management, system configuration, audit logs</w:t>
+      </w:r>
+    </w:p>
+    <w:p>
+      <w:pPr>
+        <w:pStyle w:val="ListBullet"/>
+      </w:pPr>
+      <w:r>
+        <w:t>Authentication: Phone-based OTP (Telegram &amp; SMS) and email OTP, JWT sessions, role-based access</w:t>
+      </w:r>
+    </w:p>
+    <w:p>
+      <w:pPr>
+        <w:pStyle w:val="ListBullet"/>
+      </w:pPr>
+      <w:r>
+        <w:t>Telegram Bot: Account linking via phone sharing, payment notifications, auto-login, reminders</w:t>
+      </w:r>
+    </w:p>
+    <w:p>
+      <w:pPr>
+        <w:pStyle w:val="ListBullet"/>
+      </w:pPr>
+      <w:r>
+        <w:t>Payment Integration: KHQR (Bakong) and ABA PayWay hosted checkout with HMAC-SHA512 security</w:t>
+      </w:r>
+    </w:p>
+    <w:p>
+      <w:pPr>
+        <w:pStyle w:val="ListBullet"/>
+      </w:pPr>
+      <w:r>
+        <w:t>Database: Supabase PostgreSQL with audit logging, RLS, and transaction ledger</w:t>
+      </w:r>
     </w:p>
     <w:p>
       <w:pPr>
         <w:pStyle w:val="Heading1"/>
-        <w:spacing w:before="360" w:after="120"/>
-        <w:pBdr>
-          <w:bottom w:val="single" w:sz="12" w:space="4" w:color="00BDAA"/>
-        </w:pBdr>
       </w:pPr>
       <w:r>
-        <w:rPr>
-          <w:rFonts w:ascii="Segoe UI" w:hAnsi="Segoe UI" w:cs="Segoe UI"/>
-          <w:b/>
-          <w:i w:val="0"/>
-          <w:color w:val="0B1F2E"/>
-          <w:sz w:val="32"/>
-        </w:rPr>
         <w:t>3. Demo Accounts</w:t>
       </w:r>
     </w:p>
-    <w:tbl>
-      <w:tblPr>
-        <w:tblStyle w:val="TableGrid"/>
-        <w:tblW w:type="auto" w:w="0"/>
-        <w:jc w:val="center"/>
-        <w:tblLayout w:type="fixed"/>
-        <w:tblLook w:firstColumn="1" w:firstRow="1" w:lastColumn="0" w:lastRow="0" w:noHBand="0" w:noVBand="1" w:val="04A0"/>
-      </w:tblPr>
-      <w:tblGrid>
-        <w:gridCol w:w="3106"/>
-        <w:gridCol w:w="3106"/>
-        <w:gridCol w:w="3106"/>
-      </w:tblGrid>
-      <w:tr>
-        <w:tc>
-          <w:tcPr>
-            <w:tcW w:type="dxa" w:w="2304"/>
-            <w:shd w:val="clear" w:fill="0B1F2E"/>
-            <w:tcMar>
-              <w:top w:w="80" w:type="dxa"/>
-              <w:start w:w="120" w:type="dxa"/>
-              <w:bottom w:w="80" w:type="dxa"/>
-              <w:end w:w="120" w:type="dxa"/>
-            </w:tcMar>
-            <w:vAlign w:val="center"/>
-          </w:tcPr>
-          <w:p>
-            <w:pPr>
-              <w:jc w:val="left"/>
-            </w:pPr>
-            <w:r/>
-            <w:r>
-              <w:rPr>
-                <w:rFonts w:ascii="Segoe UI" w:hAnsi="Segoe UI" w:cs="Segoe UI"/>
-                <w:b/>
-                <w:i w:val="0"/>
-                <w:color w:val="FFFFFF"/>
-                <w:sz w:val="19"/>
-              </w:rPr>
-              <w:t>Role</w:t>
-            </w:r>
-          </w:p>
-        </w:tc>
-        <w:tc>
-          <w:tcPr>
-            <w:tcW w:type="dxa" w:w="3744"/>
-            <w:shd w:val="clear" w:fill="0B1F2E"/>
-            <w:tcMar>
-              <w:top w:w="80" w:type="dxa"/>
-              <w:start w:w="120" w:type="dxa"/>
-              <w:bottom w:w="80" w:type="dxa"/>
-              <w:end w:w="120" w:type="dxa"/>
-            </w:tcMar>
-            <w:vAlign w:val="center"/>
-          </w:tcPr>
-          <w:p>
-            <w:pPr>
-              <w:jc w:val="left"/>
-            </w:pPr>
-            <w:r/>
-            <w:r>
-              <w:rPr>
-                <w:rFonts w:ascii="Segoe UI" w:hAnsi="Segoe UI" w:cs="Segoe UI"/>
-                <w:b/>
-                <w:i w:val="0"/>
-                <w:color w:val="FFFFFF"/>
-                <w:sz w:val="19"/>
-              </w:rPr>
-              <w:t>Email</w:t>
-            </w:r>
-          </w:p>
-        </w:tc>
-        <w:tc>
-          <w:tcPr>
-            <w:tcW w:type="dxa" w:w="3168"/>
-            <w:shd w:val="clear" w:fill="0B1F2E"/>
-            <w:tcMar>
-              <w:top w:w="80" w:type="dxa"/>
-              <w:start w:w="120" w:type="dxa"/>
-              <w:bottom w:w="80" w:type="dxa"/>
-              <w:end w:w="120" w:type="dxa"/>
-            </w:tcMar>
-            <w:vAlign w:val="center"/>
-          </w:tcPr>
-          <w:p>
-            <w:pPr>
-              <w:jc w:val="left"/>
-            </w:pPr>
-            <w:r/>
-            <w:r>
-              <w:rPr>
-                <w:rFonts w:ascii="Segoe UI" w:hAnsi="Segoe UI" w:cs="Segoe UI"/>
-                <w:b/>
-                <w:i w:val="0"/>
-                <w:color w:val="FFFFFF"/>
-                <w:sz w:val="19"/>
-              </w:rPr>
-              <w:t>Password</w:t>
-            </w:r>
-          </w:p>
-        </w:tc>
-      </w:tr>
-      <w:tr>
-        <w:tc>
-          <w:tcPr>
-            <w:tcW w:type="dxa" w:w="2304"/>
-            <w:tcMar>
-              <w:top w:w="80" w:type="dxa"/>
-              <w:start w:w="120" w:type="dxa"/>
-              <w:bottom w:w="80" w:type="dxa"/>
-              <w:end w:w="120" w:type="dxa"/>
-            </w:tcMar>
-            <w:vAlign w:val="center"/>
-          </w:tcPr>
-          <w:p>
-            <w:pPr>
-              <w:spacing w:after="20"/>
-            </w:pPr>
-            <w:r/>
-            <w:r>
-              <w:rPr>
-                <w:rFonts w:ascii="Segoe UI" w:hAnsi="Segoe UI" w:cs="Segoe UI"/>
-                <w:b w:val="0"/>
-                <w:i w:val="0"/>
-                <w:color w:val="0B1F2E"/>
-                <w:sz w:val="19"/>
-              </w:rPr>
-              <w:t>Customer</w:t>
-            </w:r>
-          </w:p>
-        </w:tc>
-        <w:tc>
-          <w:tcPr>
-            <w:tcW w:type="dxa" w:w="3744"/>
-            <w:tcMar>
-              <w:top w:w="80" w:type="dxa"/>
-              <w:start w:w="120" w:type="dxa"/>
-              <w:bottom w:w="80" w:type="dxa"/>
-              <w:end w:w="120" w:type="dxa"/>
-            </w:tcMar>
-            <w:vAlign w:val="center"/>
-          </w:tcPr>
-          <w:p>
-            <w:pPr>
-              <w:spacing w:after="20"/>
-            </w:pPr>
-            <w:r/>
-            <w:r>
-              <w:rPr>
-                <w:rFonts w:ascii="Segoe UI" w:hAnsi="Segoe UI" w:cs="Segoe UI"/>
-                <w:b w:val="0"/>
-                <w:i w:val="0"/>
-                <w:color w:val="0B1F2E"/>
-                <w:sz w:val="19"/>
-              </w:rPr>
-              <w:t>customer@nexus.com</w:t>
-            </w:r>
-          </w:p>
-        </w:tc>
-        <w:tc>
-          <w:tcPr>
-            <w:tcW w:type="dxa" w:w="3168"/>
-            <w:tcMar>
-              <w:top w:w="80" w:type="dxa"/>
-              <w:start w:w="120" w:type="dxa"/>
-              <w:bottom w:w="80" w:type="dxa"/>
-              <w:end w:w="120" w:type="dxa"/>
-            </w:tcMar>
-            <w:vAlign w:val="center"/>
-          </w:tcPr>
-          <w:p>
-            <w:pPr>
-              <w:spacing w:after="20"/>
-            </w:pPr>
-            <w:r/>
-            <w:r>
-              <w:rPr>
-                <w:rFonts w:ascii="Segoe UI" w:hAnsi="Segoe UI" w:cs="Segoe UI"/>
-                <w:b w:val="0"/>
-                <w:i w:val="0"/>
-                <w:color w:val="0B1F2E"/>
-                <w:sz w:val="19"/>
-              </w:rPr>
-              <w:t>password123</w:t>
-            </w:r>
-          </w:p>
-        </w:tc>
-      </w:tr>
-      <w:tr>
-        <w:tc>
-          <w:tcPr>
-            <w:tcW w:type="dxa" w:w="2304"/>
-            <w:shd w:val="clear" w:fill="F4F8FA"/>
-            <w:tcMar>
-              <w:top w:w="80" w:type="dxa"/>
-              <w:start w:w="120" w:type="dxa"/>
-              <w:bottom w:w="80" w:type="dxa"/>
-              <w:end w:w="120" w:type="dxa"/>
-            </w:tcMar>
-            <w:vAlign w:val="center"/>
-          </w:tcPr>
-          <w:p>
-            <w:pPr>
-              <w:spacing w:after="20"/>
-            </w:pPr>
-            <w:r/>
-            <w:r>
-              <w:rPr>
-                <w:rFonts w:ascii="Segoe UI" w:hAnsi="Segoe UI" w:cs="Segoe UI"/>
-                <w:b w:val="0"/>
-                <w:i w:val="0"/>
-                <w:color w:val="0B1F2E"/>
-                <w:sz w:val="19"/>
-              </w:rPr>
-              <w:t>Loan Officer</w:t>
-            </w:r>
-          </w:p>
-        </w:tc>
-        <w:tc>
-          <w:tcPr>
-            <w:tcW w:type="dxa" w:w="3744"/>
-            <w:shd w:val="clear" w:fill="F4F8FA"/>
-            <w:tcMar>
-              <w:top w:w="80" w:type="dxa"/>
-              <w:start w:w="120" w:type="dxa"/>
-              <w:bottom w:w="80" w:type="dxa"/>
-              <w:end w:w="120" w:type="dxa"/>
-            </w:tcMar>
-            <w:vAlign w:val="center"/>
-          </w:tcPr>
-          <w:p>
-            <w:pPr>
-              <w:spacing w:after="20"/>
-            </w:pPr>
-            <w:r/>
-            <w:r>
-              <w:rPr>
-                <w:rFonts w:ascii="Segoe UI" w:hAnsi="Segoe UI" w:cs="Segoe UI"/>
-                <w:b w:val="0"/>
-                <w:i w:val="0"/>
-                <w:color w:val="0B1F2E"/>
-                <w:sz w:val="19"/>
-              </w:rPr>
-              <w:t>officer@nexus.com</w:t>
-            </w:r>
-          </w:p>
-        </w:tc>
-        <w:tc>
-          <w:tcPr>
-            <w:tcW w:type="dxa" w:w="3168"/>
-            <w:shd w:val="clear" w:fill="F4F8FA"/>
-            <w:tcMar>
-              <w:top w:w="80" w:type="dxa"/>
-              <w:start w:w="120" w:type="dxa"/>
-              <w:bottom w:w="80" w:type="dxa"/>
-              <w:end w:w="120" w:type="dxa"/>
-            </w:tcMar>
-            <w:vAlign w:val="center"/>
-          </w:tcPr>
-          <w:p>
-            <w:pPr>
-              <w:spacing w:after="20"/>
-            </w:pPr>
-            <w:r/>
-            <w:r>
-              <w:rPr>
-                <w:rFonts w:ascii="Segoe UI" w:hAnsi="Segoe UI" w:cs="Segoe UI"/>
-                <w:b w:val="0"/>
-                <w:i w:val="0"/>
-                <w:color w:val="0B1F2E"/>
-                <w:sz w:val="19"/>
-              </w:rPr>
-              <w:t>password123</w:t>
-            </w:r>
-          </w:p>
-        </w:tc>
-      </w:tr>
-      <w:tr>
-        <w:tc>
-          <w:tcPr>
-            <w:tcW w:type="dxa" w:w="2304"/>
-            <w:tcMar>
-              <w:top w:w="80" w:type="dxa"/>
-              <w:start w:w="120" w:type="dxa"/>
-              <w:bottom w:w="80" w:type="dxa"/>
-              <w:end w:w="120" w:type="dxa"/>
-            </w:tcMar>
-            <w:vAlign w:val="center"/>
-          </w:tcPr>
-          <w:p>
-            <w:pPr>
-              <w:spacing w:after="20"/>
-            </w:pPr>
-            <w:r/>
-            <w:r>
-              <w:rPr>
-                <w:rFonts w:ascii="Segoe UI" w:hAnsi="Segoe UI" w:cs="Segoe UI"/>
-                <w:b w:val="0"/>
-                <w:i w:val="0"/>
-                <w:color w:val="0B1F2E"/>
-                <w:sz w:val="19"/>
-              </w:rPr>
-              <w:t>Super Admin</w:t>
-            </w:r>
-          </w:p>
-        </w:tc>
-        <w:tc>
-          <w:tcPr>
-            <w:tcW w:type="dxa" w:w="3744"/>
-            <w:tcMar>
-              <w:top w:w="80" w:type="dxa"/>
-              <w:start w:w="120" w:type="dxa"/>
-              <w:bottom w:w="80" w:type="dxa"/>
-              <w:end w:w="120" w:type="dxa"/>
-            </w:tcMar>
-            <w:vAlign w:val="center"/>
-          </w:tcPr>
-          <w:p>
-            <w:pPr>
-              <w:spacing w:after="20"/>
-            </w:pPr>
-            <w:r/>
-            <w:r>
-              <w:rPr>
-                <w:rFonts w:ascii="Segoe UI" w:hAnsi="Segoe UI" w:cs="Segoe UI"/>
-                <w:b w:val="0"/>
-                <w:i w:val="0"/>
-                <w:color w:val="0B1F2E"/>
-                <w:sz w:val="19"/>
-              </w:rPr>
-              <w:t>admin@nexus.com</w:t>
-            </w:r>
-          </w:p>
-        </w:tc>
-        <w:tc>
-          <w:tcPr>
-            <w:tcW w:type="dxa" w:w="3168"/>
-            <w:tcMar>
-              <w:top w:w="80" w:type="dxa"/>
-              <w:start w:w="120" w:type="dxa"/>
-              <w:bottom w:w="80" w:type="dxa"/>
-              <w:end w:w="120" w:type="dxa"/>
-            </w:tcMar>
-            <w:vAlign w:val="center"/>
-          </w:tcPr>
-          <w:p>
-            <w:pPr>
-              <w:spacing w:after="20"/>
-            </w:pPr>
-            <w:r/>
-            <w:r>
-              <w:rPr>
-                <w:rFonts w:ascii="Segoe UI" w:hAnsi="Segoe UI" w:cs="Segoe UI"/>
-                <w:b w:val="0"/>
-                <w:i w:val="0"/>
-                <w:color w:val="0B1F2E"/>
-                <w:sz w:val="19"/>
-              </w:rPr>
-              <w:t>password123</w:t>
-            </w:r>
-          </w:p>
-        </w:tc>
-      </w:tr>
-    </w:tbl>
+    <w:p>
+      <w:r>
+        <w:t>All accounts use password: password123</w:t>
+      </w:r>
+    </w:p>
     <w:p>
       <w:pPr>
-        <w:spacing w:after="40"/>
+        <w:pStyle w:val="ListBullet"/>
       </w:pPr>
+      <w:r>
+        <w:t>Customer: customer@nexus.com (email verified)</w:t>
+      </w:r>
     </w:p>
-    <w:tbl>
-      <w:tblPr>
-        <w:tblStyle w:val="TableGrid"/>
-        <w:tblW w:type="auto" w:w="0"/>
-        <w:tblLook w:firstColumn="1" w:firstRow="1" w:lastColumn="0" w:lastRow="0" w:noHBand="0" w:noVBand="1" w:val="04A0"/>
-      </w:tblPr>
-      <w:tblGrid>
-        <w:gridCol w:w="9317"/>
-      </w:tblGrid>
-      <w:tr>
-        <w:tc>
-          <w:tcPr>
-            <w:tcW w:type="dxa" w:w="9317"/>
-            <w:tcBorders>
-              <w:left w:val="single" w:sz="28" w:space="0" w:color="00BDAA"/>
-            </w:tcBorders>
-            <w:shd w:val="clear" w:fill="E0F7F4"/>
-            <w:tcMar>
-              <w:top w:w="140" w:type="dxa"/>
-              <w:start w:w="200" w:type="dxa"/>
-              <w:bottom w:w="140" w:type="dxa"/>
-              <w:end w:w="200" w:type="dxa"/>
-            </w:tcMar>
-          </w:tcPr>
-          <w:p>
-            <w:pPr>
-              <w:spacing w:after="60"/>
-            </w:pPr>
-            <w:r/>
-            <w:r>
-              <w:rPr>
-                <w:rFonts w:ascii="Segoe UI" w:hAnsi="Segoe UI" w:cs="Segoe UI"/>
-                <w:b/>
-                <w:i w:val="0"/>
-                <w:color w:val="0B1F2E"/>
-                <w:sz w:val="21"/>
-              </w:rPr>
-              <w:t>Security note</w:t>
-            </w:r>
-          </w:p>
-          <w:p>
-            <w:pPr>
-              <w:spacing w:after="0"/>
-            </w:pPr>
-            <w:r>
-              <w:rPr>
-                <w:rFonts w:ascii="Segoe UI" w:hAnsi="Segoe UI" w:cs="Segoe UI"/>
-                <w:b w:val="0"/>
-                <w:i w:val="0"/>
-                <w:color w:val="0B1F2E"/>
-                <w:sz w:val="20"/>
-              </w:rPr>
-              <w:t>All passwords are stored as bcrypt hashes. OTP codes are hashed and expire after 10 minutes. All admin actions are written to an immutable audit log.</w:t>
-            </w:r>
-          </w:p>
-        </w:tc>
-      </w:tr>
-    </w:tbl>
     <w:p>
       <w:pPr>
-        <w:spacing w:after="40"/>
+        <w:pStyle w:val="ListBullet"/>
       </w:pPr>
+      <w:r>
+        <w:t>Loan Officer: officer@nexus.com (email verified)</w:t>
+      </w:r>
+    </w:p>
+    <w:p>
+      <w:pPr>
+        <w:pStyle w:val="ListBullet"/>
+      </w:pPr>
+      <w:r>
+        <w:t>Super Admin: admin@nexus.com (email verified)</w:t>
+      </w:r>
+    </w:p>
+    <w:p>
+      <w:pPr>
+        <w:pStyle w:val="ListBullet"/>
+      </w:pPr>
+      <w:r>
+        <w:t>Phone-only users: Register via Telegram phone sharing → auto-login, OTP via Telegram &amp; SMS</w:t>
+      </w:r>
     </w:p>
     <w:p>
       <w:pPr>
         <w:pStyle w:val="Heading1"/>
-        <w:spacing w:before="360" w:after="120"/>
-        <w:pBdr>
-          <w:bottom w:val="single" w:sz="12" w:space="4" w:color="00BDAA"/>
-        </w:pBdr>
       </w:pPr>
       <w:r>
-        <w:rPr>
-          <w:rFonts w:ascii="Segoe UI" w:hAnsi="Segoe UI" w:cs="Segoe UI"/>
-          <w:b/>
-          <w:i w:val="0"/>
-          <w:color w:val="0B1F2E"/>
-          <w:sz w:val="32"/>
-        </w:rPr>
         <w:t>4. Technology Stack</w:t>
       </w:r>
     </w:p>
-    <w:tbl>
-      <w:tblPr>
-        <w:tblStyle w:val="TableGrid"/>
-        <w:tblW w:type="auto" w:w="0"/>
-        <w:jc w:val="center"/>
-        <w:tblLayout w:type="fixed"/>
-        <w:tblLook w:firstColumn="1" w:firstRow="1" w:lastColumn="0" w:lastRow="0" w:noHBand="0" w:noVBand="1" w:val="04A0"/>
-      </w:tblPr>
-      <w:tblGrid>
-        <w:gridCol w:w="4658"/>
-        <w:gridCol w:w="4658"/>
-      </w:tblGrid>
-      <w:tr>
-        <w:tc>
-          <w:tcPr>
-            <w:tcW w:type="dxa" w:w="2592"/>
-            <w:shd w:val="clear" w:fill="0B1F2E"/>
-            <w:tcMar>
-              <w:top w:w="80" w:type="dxa"/>
-              <w:start w:w="120" w:type="dxa"/>
-              <w:bottom w:w="80" w:type="dxa"/>
-              <w:end w:w="120" w:type="dxa"/>
-            </w:tcMar>
-            <w:vAlign w:val="center"/>
-          </w:tcPr>
-          <w:p>
-            <w:pPr>
-              <w:jc w:val="left"/>
-            </w:pPr>
-            <w:r/>
-            <w:r>
-              <w:rPr>
-                <w:rFonts w:ascii="Segoe UI" w:hAnsi="Segoe UI" w:cs="Segoe UI"/>
-                <w:b/>
-                <w:i w:val="0"/>
-                <w:color w:val="FFFFFF"/>
-                <w:sz w:val="19"/>
-              </w:rPr>
-              <w:t>Layer</w:t>
-            </w:r>
-          </w:p>
-        </w:tc>
-        <w:tc>
-          <w:tcPr>
-            <w:tcW w:type="dxa" w:w="6624"/>
-            <w:shd w:val="clear" w:fill="0B1F2E"/>
-            <w:tcMar>
-              <w:top w:w="80" w:type="dxa"/>
-              <w:start w:w="120" w:type="dxa"/>
-              <w:bottom w:w="80" w:type="dxa"/>
-              <w:end w:w="120" w:type="dxa"/>
-            </w:tcMar>
-            <w:vAlign w:val="center"/>
-          </w:tcPr>
-          <w:p>
-            <w:pPr>
-              <w:jc w:val="left"/>
-            </w:pPr>
-            <w:r/>
-            <w:r>
-              <w:rPr>
-                <w:rFonts w:ascii="Segoe UI" w:hAnsi="Segoe UI" w:cs="Segoe UI"/>
-                <w:b/>
-                <w:i w:val="0"/>
-                <w:color w:val="FFFFFF"/>
-                <w:sz w:val="19"/>
-              </w:rPr>
-              <w:t>Technology</w:t>
-            </w:r>
-          </w:p>
-        </w:tc>
-      </w:tr>
-      <w:tr>
-        <w:tc>
-          <w:tcPr>
-            <w:tcW w:type="dxa" w:w="2592"/>
-            <w:tcMar>
-              <w:top w:w="80" w:type="dxa"/>
-              <w:start w:w="120" w:type="dxa"/>
-              <w:bottom w:w="80" w:type="dxa"/>
-              <w:end w:w="120" w:type="dxa"/>
-            </w:tcMar>
-            <w:vAlign w:val="center"/>
-          </w:tcPr>
-          <w:p>
-            <w:pPr>
-              <w:spacing w:after="20"/>
-            </w:pPr>
-            <w:r/>
-            <w:r>
-              <w:rPr>
-                <w:rFonts w:ascii="Segoe UI" w:hAnsi="Segoe UI" w:cs="Segoe UI"/>
-                <w:b w:val="0"/>
-                <w:i w:val="0"/>
-                <w:color w:val="0B1F2E"/>
-                <w:sz w:val="19"/>
-              </w:rPr>
-              <w:t>Frontend</w:t>
-            </w:r>
-          </w:p>
-        </w:tc>
-        <w:tc>
-          <w:tcPr>
-            <w:tcW w:type="dxa" w:w="6624"/>
-            <w:tcMar>
-              <w:top w:w="80" w:type="dxa"/>
-              <w:start w:w="120" w:type="dxa"/>
-              <w:bottom w:w="80" w:type="dxa"/>
-              <w:end w:w="120" w:type="dxa"/>
-            </w:tcMar>
-            <w:vAlign w:val="center"/>
-          </w:tcPr>
-          <w:p>
-            <w:pPr>
-              <w:spacing w:after="20"/>
-            </w:pPr>
-            <w:r/>
-            <w:r>
-              <w:rPr>
-                <w:rFonts w:ascii="Segoe UI" w:hAnsi="Segoe UI" w:cs="Segoe UI"/>
-                <w:b w:val="0"/>
-                <w:i w:val="0"/>
-                <w:color w:val="0B1F2E"/>
-                <w:sz w:val="19"/>
-              </w:rPr>
-              <w:t>React 18, TypeScript, Vite, Tailwind CSS</w:t>
-            </w:r>
-          </w:p>
-        </w:tc>
-      </w:tr>
-      <w:tr>
-        <w:tc>
-          <w:tcPr>
-            <w:tcW w:type="dxa" w:w="2592"/>
-            <w:shd w:val="clear" w:fill="F4F8FA"/>
-            <w:tcMar>
-              <w:top w:w="80" w:type="dxa"/>
-              <w:start w:w="120" w:type="dxa"/>
-              <w:bottom w:w="80" w:type="dxa"/>
-              <w:end w:w="120" w:type="dxa"/>
-            </w:tcMar>
-            <w:vAlign w:val="center"/>
-          </w:tcPr>
-          <w:p>
-            <w:pPr>
-              <w:spacing w:after="20"/>
-            </w:pPr>
-            <w:r/>
-            <w:r>
-              <w:rPr>
-                <w:rFonts w:ascii="Segoe UI" w:hAnsi="Segoe UI" w:cs="Segoe UI"/>
-                <w:b w:val="0"/>
-                <w:i w:val="0"/>
-                <w:color w:val="0B1F2E"/>
-                <w:sz w:val="19"/>
-              </w:rPr>
-              <w:t>Backend</w:t>
-            </w:r>
-          </w:p>
-        </w:tc>
-        <w:tc>
-          <w:tcPr>
-            <w:tcW w:type="dxa" w:w="6624"/>
-            <w:shd w:val="clear" w:fill="F4F8FA"/>
-            <w:tcMar>
-              <w:top w:w="80" w:type="dxa"/>
-              <w:start w:w="120" w:type="dxa"/>
-              <w:bottom w:w="80" w:type="dxa"/>
-              <w:end w:w="120" w:type="dxa"/>
-            </w:tcMar>
-            <w:vAlign w:val="center"/>
-          </w:tcPr>
-          <w:p>
-            <w:pPr>
-              <w:spacing w:after="20"/>
-            </w:pPr>
-            <w:r/>
-            <w:r>
-              <w:rPr>
-                <w:rFonts w:ascii="Segoe UI" w:hAnsi="Segoe UI" w:cs="Segoe UI"/>
-                <w:b w:val="0"/>
-                <w:i w:val="0"/>
-                <w:color w:val="0B1F2E"/>
-                <w:sz w:val="19"/>
-              </w:rPr>
-              <w:t>Node.js, Express, TypeScript (tsx)</w:t>
-            </w:r>
-          </w:p>
-        </w:tc>
-      </w:tr>
-      <w:tr>
-        <w:tc>
-          <w:tcPr>
-            <w:tcW w:type="dxa" w:w="2592"/>
-            <w:tcMar>
-              <w:top w:w="80" w:type="dxa"/>
-              <w:start w:w="120" w:type="dxa"/>
-              <w:bottom w:w="80" w:type="dxa"/>
-              <w:end w:w="120" w:type="dxa"/>
-            </w:tcMar>
-            <w:vAlign w:val="center"/>
-          </w:tcPr>
-          <w:p>
-            <w:pPr>
-              <w:spacing w:after="20"/>
-            </w:pPr>
-            <w:r/>
-            <w:r>
-              <w:rPr>
-                <w:rFonts w:ascii="Segoe UI" w:hAnsi="Segoe UI" w:cs="Segoe UI"/>
-                <w:b w:val="0"/>
-                <w:i w:val="0"/>
-                <w:color w:val="0B1F2E"/>
-                <w:sz w:val="19"/>
-              </w:rPr>
-              <w:t>Database</w:t>
-            </w:r>
-          </w:p>
-        </w:tc>
-        <w:tc>
-          <w:tcPr>
-            <w:tcW w:type="dxa" w:w="6624"/>
-            <w:tcMar>
-              <w:top w:w="80" w:type="dxa"/>
-              <w:start w:w="120" w:type="dxa"/>
-              <w:bottom w:w="80" w:type="dxa"/>
-              <w:end w:w="120" w:type="dxa"/>
-            </w:tcMar>
-            <w:vAlign w:val="center"/>
-          </w:tcPr>
-          <w:p>
-            <w:pPr>
-              <w:spacing w:after="20"/>
-            </w:pPr>
-            <w:r/>
-            <w:r>
-              <w:rPr>
-                <w:rFonts w:ascii="Segoe UI" w:hAnsi="Segoe UI" w:cs="Segoe UI"/>
-                <w:b w:val="0"/>
-                <w:i w:val="0"/>
-                <w:color w:val="0B1F2E"/>
-                <w:sz w:val="19"/>
-              </w:rPr>
-              <w:t>Supabase (PostgreSQL)</w:t>
-            </w:r>
-          </w:p>
-        </w:tc>
-      </w:tr>
-      <w:tr>
-        <w:tc>
-          <w:tcPr>
-            <w:tcW w:type="dxa" w:w="2592"/>
-            <w:shd w:val="clear" w:fill="F4F8FA"/>
-            <w:tcMar>
-              <w:top w:w="80" w:type="dxa"/>
-              <w:start w:w="120" w:type="dxa"/>
-              <w:bottom w:w="80" w:type="dxa"/>
-              <w:end w:w="120" w:type="dxa"/>
-            </w:tcMar>
-            <w:vAlign w:val="center"/>
-          </w:tcPr>
-          <w:p>
-            <w:pPr>
-              <w:spacing w:after="20"/>
-            </w:pPr>
-            <w:r/>
-            <w:r>
-              <w:rPr>
-                <w:rFonts w:ascii="Segoe UI" w:hAnsi="Segoe UI" w:cs="Segoe UI"/>
-                <w:b w:val="0"/>
-                <w:i w:val="0"/>
-                <w:color w:val="0B1F2E"/>
-                <w:sz w:val="19"/>
-              </w:rPr>
-              <w:t>Auth</w:t>
-            </w:r>
-          </w:p>
-        </w:tc>
-        <w:tc>
-          <w:tcPr>
-            <w:tcW w:type="dxa" w:w="6624"/>
-            <w:shd w:val="clear" w:fill="F4F8FA"/>
-            <w:tcMar>
-              <w:top w:w="80" w:type="dxa"/>
-              <w:start w:w="120" w:type="dxa"/>
-              <w:bottom w:w="80" w:type="dxa"/>
-              <w:end w:w="120" w:type="dxa"/>
-            </w:tcMar>
-            <w:vAlign w:val="center"/>
-          </w:tcPr>
-          <w:p>
-            <w:pPr>
-              <w:spacing w:after="20"/>
-            </w:pPr>
-            <w:r/>
-            <w:r>
-              <w:rPr>
-                <w:rFonts w:ascii="Segoe UI" w:hAnsi="Segoe UI" w:cs="Segoe UI"/>
-                <w:b w:val="0"/>
-                <w:i w:val="0"/>
-                <w:color w:val="0B1F2E"/>
-                <w:sz w:val="19"/>
-              </w:rPr>
-              <w:t>JWT + bcrypt + Brevo OTP email</w:t>
-            </w:r>
-          </w:p>
-        </w:tc>
-      </w:tr>
-      <w:tr>
-        <w:tc>
-          <w:tcPr>
-            <w:tcW w:type="dxa" w:w="2592"/>
-            <w:tcMar>
-              <w:top w:w="80" w:type="dxa"/>
-              <w:start w:w="120" w:type="dxa"/>
-              <w:bottom w:w="80" w:type="dxa"/>
-              <w:end w:w="120" w:type="dxa"/>
-            </w:tcMar>
-            <w:vAlign w:val="center"/>
-          </w:tcPr>
-          <w:p>
-            <w:pPr>
-              <w:spacing w:after="20"/>
-            </w:pPr>
-            <w:r/>
-            <w:r>
-              <w:rPr>
-                <w:rFonts w:ascii="Segoe UI" w:hAnsi="Segoe UI" w:cs="Segoe UI"/>
-                <w:b w:val="0"/>
-                <w:i w:val="0"/>
-                <w:color w:val="0B1F2E"/>
-                <w:sz w:val="19"/>
-              </w:rPr>
-              <w:t>Hosting</w:t>
-            </w:r>
-          </w:p>
-        </w:tc>
-        <w:tc>
-          <w:tcPr>
-            <w:tcW w:type="dxa" w:w="6624"/>
-            <w:tcMar>
-              <w:top w:w="80" w:type="dxa"/>
-              <w:start w:w="120" w:type="dxa"/>
-              <w:bottom w:w="80" w:type="dxa"/>
-              <w:end w:w="120" w:type="dxa"/>
-            </w:tcMar>
-            <w:vAlign w:val="center"/>
-          </w:tcPr>
-          <w:p>
-            <w:pPr>
-              <w:spacing w:after="20"/>
-            </w:pPr>
-            <w:r/>
-            <w:r>
-              <w:rPr>
-                <w:rFonts w:ascii="Segoe UI" w:hAnsi="Segoe UI" w:cs="Segoe UI"/>
-                <w:b w:val="0"/>
-                <w:i w:val="0"/>
-                <w:color w:val="0B1F2E"/>
-                <w:sz w:val="19"/>
-              </w:rPr>
-              <w:t>Vercel (frontend) + Render (backend)</w:t>
-            </w:r>
-          </w:p>
-        </w:tc>
-      </w:tr>
-      <w:tr>
-        <w:tc>
-          <w:tcPr>
-            <w:tcW w:type="dxa" w:w="2592"/>
-            <w:shd w:val="clear" w:fill="F4F8FA"/>
-            <w:tcMar>
-              <w:top w:w="80" w:type="dxa"/>
-              <w:start w:w="120" w:type="dxa"/>
-              <w:bottom w:w="80" w:type="dxa"/>
-              <w:end w:w="120" w:type="dxa"/>
-            </w:tcMar>
-            <w:vAlign w:val="center"/>
-          </w:tcPr>
-          <w:p>
-            <w:pPr>
-              <w:spacing w:after="20"/>
-            </w:pPr>
-            <w:r/>
-            <w:r>
-              <w:rPr>
-                <w:rFonts w:ascii="Segoe UI" w:hAnsi="Segoe UI" w:cs="Segoe UI"/>
-                <w:b w:val="0"/>
-                <w:i w:val="0"/>
-                <w:color w:val="0B1F2E"/>
-                <w:sz w:val="19"/>
-              </w:rPr>
-              <w:t>Payments</w:t>
-            </w:r>
-          </w:p>
-        </w:tc>
-        <w:tc>
-          <w:tcPr>
-            <w:tcW w:type="dxa" w:w="6624"/>
-            <w:shd w:val="clear" w:fill="F4F8FA"/>
-            <w:tcMar>
-              <w:top w:w="80" w:type="dxa"/>
-              <w:start w:w="120" w:type="dxa"/>
-              <w:bottom w:w="80" w:type="dxa"/>
-              <w:end w:w="120" w:type="dxa"/>
-            </w:tcMar>
-            <w:vAlign w:val="center"/>
-          </w:tcPr>
-          <w:p>
-            <w:pPr>
-              <w:spacing w:after="20"/>
-            </w:pPr>
-            <w:r/>
-            <w:r>
-              <w:rPr>
-                <w:rFonts w:ascii="Segoe UI" w:hAnsi="Segoe UI" w:cs="Segoe UI"/>
-                <w:b w:val="0"/>
-                <w:i w:val="0"/>
-                <w:color w:val="0B1F2E"/>
-                <w:sz w:val="19"/>
-              </w:rPr>
-              <w:t>KHQR / EMVCo QR, ABA PayWay (sandbox)</w:t>
-            </w:r>
-          </w:p>
-        </w:tc>
-      </w:tr>
-      <w:tr>
-        <w:tc>
-          <w:tcPr>
-            <w:tcW w:type="dxa" w:w="2592"/>
-            <w:tcMar>
-              <w:top w:w="80" w:type="dxa"/>
-              <w:start w:w="120" w:type="dxa"/>
-              <w:bottom w:w="80" w:type="dxa"/>
-              <w:end w:w="120" w:type="dxa"/>
-            </w:tcMar>
-            <w:vAlign w:val="center"/>
-          </w:tcPr>
-          <w:p>
-            <w:pPr>
-              <w:spacing w:after="20"/>
-            </w:pPr>
-            <w:r/>
-            <w:r>
-              <w:rPr>
-                <w:rFonts w:ascii="Segoe UI" w:hAnsi="Segoe UI" w:cs="Segoe UI"/>
-                <w:b w:val="0"/>
-                <w:i w:val="0"/>
-                <w:color w:val="0B1F2E"/>
-                <w:sz w:val="19"/>
-              </w:rPr>
-              <w:t>Notifications</w:t>
-            </w:r>
-          </w:p>
-        </w:tc>
-        <w:tc>
-          <w:tcPr>
-            <w:tcW w:type="dxa" w:w="6624"/>
-            <w:tcMar>
-              <w:top w:w="80" w:type="dxa"/>
-              <w:start w:w="120" w:type="dxa"/>
-              <w:bottom w:w="80" w:type="dxa"/>
-              <w:end w:w="120" w:type="dxa"/>
-            </w:tcMar>
-            <w:vAlign w:val="center"/>
-          </w:tcPr>
-          <w:p>
-            <w:pPr>
-              <w:spacing w:after="20"/>
-            </w:pPr>
-            <w:r/>
-            <w:r>
-              <w:rPr>
-                <w:rFonts w:ascii="Segoe UI" w:hAnsi="Segoe UI" w:cs="Segoe UI"/>
-                <w:b w:val="0"/>
-                <w:i w:val="0"/>
-                <w:color w:val="0B1F2E"/>
-                <w:sz w:val="19"/>
-              </w:rPr>
-              <w:t>Telegram Bot API, Brevo transactional email</w:t>
-            </w:r>
-          </w:p>
-        </w:tc>
-      </w:tr>
-      <w:tr>
-        <w:tc>
-          <w:tcPr>
-            <w:tcW w:type="dxa" w:w="2592"/>
-            <w:shd w:val="clear" w:fill="F4F8FA"/>
-            <w:tcMar>
-              <w:top w:w="80" w:type="dxa"/>
-              <w:start w:w="120" w:type="dxa"/>
-              <w:bottom w:w="80" w:type="dxa"/>
-              <w:end w:w="120" w:type="dxa"/>
-            </w:tcMar>
-            <w:vAlign w:val="center"/>
-          </w:tcPr>
-          <w:p>
-            <w:pPr>
-              <w:spacing w:after="20"/>
-            </w:pPr>
-            <w:r/>
-            <w:r>
-              <w:rPr>
-                <w:rFonts w:ascii="Segoe UI" w:hAnsi="Segoe UI" w:cs="Segoe UI"/>
-                <w:b w:val="0"/>
-                <w:i w:val="0"/>
-                <w:color w:val="0B1F2E"/>
-                <w:sz w:val="19"/>
-              </w:rPr>
-              <w:t>Mobile</w:t>
-            </w:r>
-          </w:p>
-        </w:tc>
-        <w:tc>
-          <w:tcPr>
-            <w:tcW w:type="dxa" w:w="6624"/>
-            <w:shd w:val="clear" w:fill="F4F8FA"/>
-            <w:tcMar>
-              <w:top w:w="80" w:type="dxa"/>
-              <w:start w:w="120" w:type="dxa"/>
-              <w:bottom w:w="80" w:type="dxa"/>
-              <w:end w:w="120" w:type="dxa"/>
-            </w:tcMar>
-            <w:vAlign w:val="center"/>
-          </w:tcPr>
-          <w:p>
-            <w:pPr>
-              <w:spacing w:after="20"/>
-            </w:pPr>
-            <w:r/>
-            <w:r>
-              <w:rPr>
-                <w:rFonts w:ascii="Segoe UI" w:hAnsi="Segoe UI" w:cs="Segoe UI"/>
-                <w:b w:val="0"/>
-                <w:i w:val="0"/>
-                <w:color w:val="0B1F2E"/>
-                <w:sz w:val="19"/>
-              </w:rPr>
-              <w:t>Expo SDK 57, React Native WebView</w:t>
-            </w:r>
-          </w:p>
-        </w:tc>
-      </w:tr>
-    </w:tbl>
     <w:p>
       <w:pPr>
-        <w:spacing w:after="40"/>
+        <w:pStyle w:val="ListBullet"/>
       </w:pPr>
+      <w:r>
+        <w:t>Frontend: React 18 + TypeScript + Vite, CSS custom properties (dark/light mode), Vercel deployment</w:t>
+      </w:r>
+    </w:p>
+    <w:p>
+      <w:pPr>
+        <w:pStyle w:val="ListBullet"/>
+      </w:pPr>
+      <w:r>
+        <w:t>Backend: Express.js + TypeScript, JWT auth with role middleware, Supabase PostgreSQL</w:t>
+      </w:r>
+    </w:p>
+    <w:p>
+      <w:pPr>
+        <w:pStyle w:val="ListBullet"/>
+      </w:pPr>
+      <w:r>
+        <w:t>Payments: KHQR (Bakong EMVCo), ABA PayWay Purchase API (HMAC-SHA512, hosted checkout)</w:t>
+      </w:r>
+    </w:p>
+    <w:p>
+      <w:pPr>
+        <w:pStyle w:val="ListBullet"/>
+      </w:pPr>
+      <w:r>
+        <w:t>Telegram: Bot API for notifications, WebApp for phone sharing, auto-login via deep link</w:t>
+      </w:r>
+    </w:p>
+    <w:p>
+      <w:pPr>
+        <w:pStyle w:val="ListBullet"/>
+      </w:pPr>
+      <w:r>
+        <w:t>SMS: Twilio for OTP fallback delivery</w:t>
+      </w:r>
+    </w:p>
+    <w:p>
+      <w:pPr>
+        <w:pStyle w:val="ListBullet"/>
+      </w:pPr>
+      <w:r>
+        <w:t>Hosting: Vercel (frontend) + Render (backend), GitHub auto-deploys</w:t>
+      </w:r>
     </w:p>
     <w:p>
       <w:pPr>
         <w:pStyle w:val="Heading1"/>
-        <w:spacing w:before="360" w:after="120"/>
-        <w:pBdr>
-          <w:bottom w:val="single" w:sz="12" w:space="4" w:color="00BDAA"/>
-        </w:pBdr>
       </w:pPr>
       <w:r>
-        <w:rPr>
-          <w:rFonts w:ascii="Segoe UI" w:hAnsi="Segoe UI" w:cs="Segoe UI"/>
-          <w:b/>
-          <w:i w:val="0"/>
-          <w:color w:val="0B1F2E"/>
-          <w:sz w:val="32"/>
-        </w:rPr>
         <w:t>5. Security &amp; Compliance Highlights</w:t>
       </w:r>
     </w:p>
     <w:p>
       <w:pPr>
         <w:pStyle w:val="ListBullet"/>
-        <w:spacing w:after="60"/>
-        <w:ind w:left="432"/>
       </w:pPr>
       <w:r>
-        <w:rPr>
-          <w:rFonts w:ascii="Segoe UI" w:hAnsi="Segoe UI" w:cs="Segoe UI"/>
-          <w:b w:val="0"/>
-          <w:i w:val="0"/>
-          <w:color w:val="0B1F2E"/>
-          <w:sz w:val="21"/>
-        </w:rPr>
-        <w:t>JWT sessions with server-side role enforcement (customer / loan-officer / super-admin)</w:t>
+        <w:t>Phone-based OTP (Telegram bot + SMS/Twilio fallback) and email OTP — parallel verification channels</w:t>
       </w:r>
     </w:p>
     <w:p>
       <w:pPr>
         <w:pStyle w:val="ListBullet"/>
-        <w:spacing w:after="60"/>
-        <w:ind w:left="432"/>
       </w:pPr>
       <w:r>
-        <w:rPr>
-          <w:rFonts w:ascii="Segoe UI" w:hAnsi="Segoe UI" w:cs="Segoe UI"/>
-          <w:b w:val="0"/>
-          <w:i w:val="0"/>
-          <w:color w:val="0B1F2E"/>
-          <w:sz w:val="21"/>
-        </w:rPr>
+        <w:t>JWT sessions with server-side role enforcement (customer / loan-officer / admin / super-admin)</w:t>
+      </w:r>
+    </w:p>
+    <w:p>
+      <w:pPr>
+        <w:pStyle w:val="ListBullet"/>
+      </w:pPr>
+      <w:r>
         <w:t>Bcrypt password hashing — no plain-text credentials stored</w:t>
       </w:r>
     </w:p>
     <w:p>
       <w:pPr>
         <w:pStyle w:val="ListBullet"/>
-        <w:spacing w:after="60"/>
-        <w:ind w:left="432"/>
       </w:pPr>
       <w:r>
-        <w:rPr>
-          <w:rFonts w:ascii="Segoe UI" w:hAnsi="Segoe UI" w:cs="Segoe UI"/>
-          <w:b w:val="0"/>
-          <w:i w:val="0"/>
-          <w:color w:val="0B1F2E"/>
-          <w:sz w:val="21"/>
-        </w:rPr>
-        <w:t>Email OTP verification required before first login (new accounts are locked until verified)</w:t>
+        <w:t>Full audit log with timestamps for every sensitive action (append-only, Super Admin viewable)</w:t>
       </w:r>
     </w:p>
     <w:p>
       <w:pPr>
         <w:pStyle w:val="ListBullet"/>
-        <w:spacing w:after="60"/>
-        <w:ind w:left="432"/>
       </w:pPr>
       <w:r>
-        <w:rPr>
-          <w:rFonts w:ascii="Segoe UI" w:hAnsi="Segoe UI" w:cs="Segoe UI"/>
-          <w:b w:val="0"/>
-          <w:i w:val="0"/>
-          <w:color w:val="0B1F2E"/>
-          <w:sz w:val="21"/>
-        </w:rPr>
-        <w:t>Full audit log with timestamps for every sensitive action</w:t>
-      </w:r>
-    </w:p>
-    <w:p>
-      <w:pPr>
-        <w:pStyle w:val="ListBullet"/>
-        <w:spacing w:after="60"/>
-        <w:ind w:left="432"/>
-      </w:pPr>
-      <w:r>
-        <w:rPr>
-          <w:rFonts w:ascii="Segoe UI" w:hAnsi="Segoe UI" w:cs="Segoe UI"/>
-          <w:b w:val="0"/>
-          <w:i w:val="0"/>
-          <w:color w:val="0B1F2E"/>
-          <w:sz w:val="21"/>
-        </w:rPr>
         <w:t>Rate limiting on auth endpoints to prevent brute force</w:t>
       </w:r>
     </w:p>
     <w:p>
       <w:pPr>
         <w:pStyle w:val="ListBullet"/>
-        <w:spacing w:after="60"/>
-        <w:ind w:left="432"/>
       </w:pPr>
       <w:r>
-        <w:rPr>
-          <w:rFonts w:ascii="Segoe UI" w:hAnsi="Segoe UI" w:cs="Segoe UI"/>
-          <w:b w:val="0"/>
-          <w:i w:val="0"/>
-          <w:color w:val="0B1F2E"/>
-          <w:sz w:val="21"/>
-        </w:rPr>
-        <w:t>Environment variables keep all secrets out of the codebase</w:t>
+        <w:t>Environment variables keep all secrets out of the codebase; OTP codes never stored in plain text</w:t>
+      </w:r>
+    </w:p>
+    <w:p>
+      <w:pPr>
+        <w:pStyle w:val="ListBullet"/>
+      </w:pPr>
+      <w:r>
+        <w:t>ABA PayWay: HMAC-SHA512 signed purchase requests, webhook verification, hosted checkout on ABA PCI pages</w:t>
       </w:r>
     </w:p>
     <w:p>
       <w:pPr>
         <w:pStyle w:val="Heading1"/>
-        <w:spacing w:before="360" w:after="120"/>
-        <w:pBdr>
-          <w:bottom w:val="single" w:sz="12" w:space="4" w:color="00BDAA"/>
-        </w:pBdr>
       </w:pPr>
       <w:r>
-        <w:rPr>
-          <w:rFonts w:ascii="Segoe UI" w:hAnsi="Segoe UI" w:cs="Segoe UI"/>
-          <w:b/>
-          <w:i w:val="0"/>
-          <w:color w:val="0B1F2E"/>
-          <w:sz w:val="32"/>
-        </w:rPr>
         <w:t>6. Roadmap</w:t>
       </w:r>
     </w:p>
     <w:p>
-      <w:pPr>
-        <w:spacing w:after="80"/>
-        <w:ind w:left="216"/>
-      </w:pPr>
       <w:r>
-        <w:rPr>
-          <w:rFonts w:ascii="Segoe UI" w:hAnsi="Segoe UI" w:cs="Segoe UI"/>
-          <w:b/>
-          <w:i w:val="0"/>
-          <w:color w:val="008A7C"/>
-          <w:sz w:val="21"/>
-        </w:rPr>
-        <w:t xml:space="preserve">☑  </w:t>
-      </w:r>
-      <w:r>
-        <w:rPr>
-          <w:rFonts w:ascii="Segoe UI" w:hAnsi="Segoe UI" w:cs="Segoe UI"/>
-          <w:b w:val="0"/>
-          <w:i w:val="0"/>
-          <w:color w:val="0B1F2E"/>
-          <w:sz w:val="21"/>
-        </w:rPr>
-        <w:t>Go live with ABA PayWay production checkout</w:t>
+        <w:t>☑  Go live with ABA PayWay production checkout</w:t>
       </w:r>
     </w:p>
     <w:p>
-      <w:pPr>
-        <w:spacing w:after="80"/>
-        <w:ind w:left="216"/>
-      </w:pPr>
       <w:r>
-        <w:rPr>
-          <w:rFonts w:ascii="Segoe UI" w:hAnsi="Segoe UI" w:cs="Segoe UI"/>
-          <w:b/>
-          <w:i w:val="0"/>
-          <w:color w:val="008A7C"/>
-          <w:sz w:val="21"/>
-        </w:rPr>
-        <w:t xml:space="preserve">☑  </w:t>
-      </w:r>
-      <w:r>
-        <w:rPr>
-          <w:rFonts w:ascii="Segoe UI" w:hAnsi="Segoe UI" w:cs="Segoe UI"/>
-          <w:b w:val="0"/>
-          <w:i w:val="0"/>
-          <w:color w:val="0B1F2E"/>
-          <w:sz w:val="21"/>
-        </w:rPr>
-        <w:t>Add ACLEDA bank integration for payment notifications</w:t>
+        <w:t>☐  Add ACLEDA bank integration for payment notifications</w:t>
       </w:r>
     </w:p>
     <w:p>
-      <w:pPr>
-        <w:spacing w:after="80"/>
-        <w:ind w:left="216"/>
-      </w:pPr>
       <w:r>
-        <w:rPr>
-          <w:rFonts w:ascii="Segoe UI" w:hAnsi="Segoe UI" w:cs="Segoe UI"/>
-          <w:b/>
-          <w:i w:val="0"/>
-          <w:color w:val="008A7C"/>
-          <w:sz w:val="21"/>
-        </w:rPr>
-        <w:t xml:space="preserve">☑  </w:t>
-      </w:r>
-      <w:r>
-        <w:rPr>
-          <w:rFonts w:ascii="Segoe UI" w:hAnsi="Segoe UI" w:cs="Segoe UI"/>
-          <w:b w:val="0"/>
-          <w:i w:val="0"/>
-          <w:color w:val="0B1F2E"/>
-          <w:sz w:val="21"/>
-        </w:rPr>
-        <w:t>Connect Vercel auto-deploys (already connected)</w:t>
+        <w:t>☑  Connect Vercel auto-deploys (already connected)</w:t>
       </w:r>
     </w:p>
     <w:p>
-      <w:pPr>
-        <w:spacing w:after="80"/>
-        <w:ind w:left="216"/>
-      </w:pPr>
       <w:r>
-        <w:rPr>
-          <w:rFonts w:ascii="Segoe UI" w:hAnsi="Segoe UI" w:cs="Segoe UI"/>
-          <w:b/>
-          <w:i w:val="0"/>
-          <w:color w:val="008A7C"/>
-          <w:sz w:val="21"/>
-        </w:rPr>
-        <w:t xml:space="preserve">☑  </w:t>
-      </w:r>
-      <w:r>
-        <w:rPr>
-          <w:rFonts w:ascii="Segoe UI" w:hAnsi="Segoe UI" w:cs="Segoe UI"/>
-          <w:b w:val="0"/>
-          <w:i w:val="0"/>
-          <w:color w:val="0B1F2E"/>
-          <w:sz w:val="21"/>
-        </w:rPr>
-        <w:t>Add Google OAuth sign-in (deferred)</w:t>
+        <w:t>☐  Add Google OAuth sign-in (deferred)</w:t>
       </w:r>
     </w:p>
     <w:p>
-      <w:pPr>
-        <w:spacing w:after="80"/>
-        <w:ind w:left="216"/>
-      </w:pPr>
       <w:r>
-        <w:rPr>
-          <w:rFonts w:ascii="Segoe UI" w:hAnsi="Segoe UI" w:cs="Segoe UI"/>
-          <w:b/>
-          <w:i w:val="0"/>
-          <w:color w:val="008A7C"/>
-          <w:sz w:val="21"/>
-        </w:rPr>
-        <w:t xml:space="preserve">☑  </w:t>
+        <w:t>☐  Launch customer mobile app to app stores</w:t>
       </w:r>
+    </w:p>
+    <w:p>
       <w:r>
-        <w:rPr>
-          <w:rFonts w:ascii="Segoe UI" w:hAnsi="Segoe UI" w:cs="Segoe UI"/>
-          <w:b w:val="0"/>
-          <w:i w:val="0"/>
-          <w:color w:val="0B1F2E"/>
-          <w:sz w:val="21"/>
-        </w:rPr>
-        <w:t>Launch customer mobile app to app stores</w:t>
+        <w:t>☑  Phone-based OTP with Telegram &amp; SMS delivery</w:t>
+      </w:r>
+    </w:p>
+    <w:p>
+      <w:r>
+        <w:t>☑  Auto-login after Telegram phone sharing</w:t>
+      </w:r>
+    </w:p>
+    <w:p>
+      <w:r>
+        <w:t>☑  Loan progress tracking on customer dashboard</w:t>
       </w:r>
     </w:p>
     <w:sectPr>
-      <w:headerReference w:type="default" r:id="rId9"/>
-      <w:footerReference w:type="default" r:id="rId10"/>
-      <w:pgSz w:w="11909" w:h="16834"/>
-      <w:pgMar w:top="1152" w:right="1296" w:bottom="1152" w:left="1296" w:header="720" w:footer="720" w:gutter="0"/>
+      <w:pgSz w:w="12240" w:h="15840"/>
+      <w:pgMar w:top="1440" w:right="1800" w:bottom="1440" w:left="1800" w:header="720" w:footer="720" w:gutter="0"/>
       <w:cols w:space="720"/>
       <w:docGrid w:linePitch="360"/>
     </w:sectPr>
   </w:body>
 </w:document>
-</file>
-
-<file path=word/footer1.xml><?xml version="1.0" encoding="utf-8"?>
-<w:ftr xmlns:m="http://schemas.openxmlformats.org/officeDocument/2006/math" xmlns:mc="http://schemas.openxmlformats.org/markup-compatibility/2006" xmlns:mo="http://schemas.microsoft.com/office/mac/office/2008/main" xmlns:mv="urn:schemas-microsoft-com:mac:vml" xmlns:o="urn:schemas-microsoft-com:office:office" xmlns:r="http://schemas.openxmlformats.org/officeDocument/2006/relationships" xmlns:v="urn:schemas-microsoft-com:vml" xmlns:w10="urn:schemas-microsoft-com:office:word" xmlns:w14="http://schemas.microsoft.com/office/word/2010/wordml" xmlns:w="http://schemas.openxmlformats.org/wordprocessingml/2006/main" xmlns:wne="http://schemas.microsoft.com/office/word/2006/wordml" xmlns:wp14="http://schemas.microsoft.com/office/word/2010/wordprocessingDrawing" xmlns:wp="http://schemas.openxmlformats.org/drawingml/2006/wordprocessingDrawing" xmlns:wpc="http://schemas.microsoft.com/office/word/2010/wordprocessingCanvas" xmlns:wpg="http://schemas.microsoft.com/office/word/2010/wordprocessingGroup" xmlns:wpi="http://schemas.microsoft.com/office/word/2010/wordprocessingInk" xmlns:wps="http://schemas.microsoft.com/office/word/2010/wordprocessingShape" mc:Ignorable="w14 wp14">
-  <w:p>
-    <w:pPr>
-      <w:pStyle w:val="Footer"/>
-      <w:jc w:val="center"/>
-    </w:pPr>
-    <w:r/>
-    <w:r>
-      <w:rPr>
-        <w:rFonts w:ascii="Segoe UI" w:hAnsi="Segoe UI" w:cs="Segoe UI"/>
-        <w:b w:val="0"/>
-        <w:i w:val="0"/>
-        <w:color w:val="6B7A89"/>
-        <w:sz w:val="16"/>
-      </w:rPr>
-      <w:t>NexusFinance — Executive Overview  •  NF-DOC-001  •  Internal &amp; Confidential</w:t>
-    </w:r>
-    <w:r>
-      <w:rPr>
-        <w:rFonts w:ascii="Segoe UI" w:hAnsi="Segoe UI" w:cs="Segoe UI"/>
-        <w:b w:val="0"/>
-        <w:i w:val="0"/>
-        <w:color w:val="6B7A89"/>
-        <w:sz w:val="16"/>
-      </w:rPr>
-      <w:t xml:space="preserve">  •  Page </w:t>
-    </w:r>
-    <w:r>
-      <w:fldChar w:fldCharType="begin"/>
-      <w:instrText xml:space="preserve">PAGE</w:instrText>
-      <w:fldChar w:fldCharType="separate"/>
-      <w:t>1</w:t>
-      <w:fldChar w:fldCharType="end"/>
-    </w:r>
-  </w:p>
-</w:ftr>
-</file>
-
-<file path=word/header1.xml><?xml version="1.0" encoding="utf-8"?>
-<w:hdr xmlns:m="http://schemas.openxmlformats.org/officeDocument/2006/math" xmlns:mc="http://schemas.openxmlformats.org/markup-compatibility/2006" xmlns:mo="http://schemas.microsoft.com/office/mac/office/2008/main" xmlns:mv="urn:schemas-microsoft-com:mac:vml" xmlns:o="urn:schemas-microsoft-com:office:office" xmlns:r="http://schemas.openxmlformats.org/officeDocument/2006/relationships" xmlns:v="urn:schemas-microsoft-com:vml" xmlns:w10="urn:schemas-microsoft-com:office:word" xmlns:w14="http://schemas.microsoft.com/office/word/2010/wordml" xmlns:w="http://schemas.openxmlformats.org/wordprocessingml/2006/main" xmlns:wne="http://schemas.microsoft.com/office/word/2006/wordml" xmlns:wp14="http://schemas.microsoft.com/office/word/2010/wordprocessingDrawing" xmlns:wp="http://schemas.openxmlformats.org/drawingml/2006/wordprocessingDrawing" xmlns:wpc="http://schemas.microsoft.com/office/word/2010/wordprocessingCanvas" xmlns:wpg="http://schemas.microsoft.com/office/word/2010/wordprocessingGroup" xmlns:wpi="http://schemas.microsoft.com/office/word/2010/wordprocessingInk" xmlns:wps="http://schemas.microsoft.com/office/word/2010/wordprocessingShape" mc:Ignorable="w14 wp14">
-  <w:p>
-    <w:pPr>
-      <w:pStyle w:val="Header"/>
-    </w:pPr>
-    <w:r/>
-  </w:p>
-</w:hdr>
 </file>
 
 <file path=word/numbering.xml><?xml version="1.0" encoding="utf-8"?>
@@ -2925,14 +726,6 @@
     <w:name w:val="Normal"/>
     <w:qFormat/>
     <w:rsid w:val="00FC693F"/>
-    <w:pPr>
-      <w:spacing w:after="140" w:line="324" w:lineRule="auto"/>
-    </w:pPr>
-    <w:rPr>
-      <w:rFonts w:ascii="Segoe UI" w:hAnsi="Segoe UI" w:cs="Segoe UI"/>
-      <w:color w:val="0B1F2E"/>
-      <w:sz w:val="21"/>
-    </w:rPr>
   </w:style>
   <w:style w:type="paragraph" w:styleId="Header">
     <w:name w:val="header"/>

</xml_diff>

<commit_message>
feat: redesign Auth & Login page with animated background, floating glass cards, and modern fintech styling
</commit_message>
<xml_diff>
--- a/DOC/EN/NF-DOC-001_Executive_Overview_EN.docx
+++ b/DOC/EN/NF-DOC-001_Executive_Overview_EN.docx
@@ -2,365 +2,2696 @@
 <file path=word/document.xml><?xml version="1.0" encoding="utf-8"?>
 <w:document xmlns:wpc="http://schemas.microsoft.com/office/word/2010/wordprocessingCanvas" xmlns:mo="http://schemas.microsoft.com/office/mac/office/2008/main" xmlns:mc="http://schemas.openxmlformats.org/markup-compatibility/2006" xmlns:mv="urn:schemas-microsoft-com:mac:vml" xmlns:o="urn:schemas-microsoft-com:office:office" xmlns:r="http://schemas.openxmlformats.org/officeDocument/2006/relationships" xmlns:m="http://schemas.openxmlformats.org/officeDocument/2006/math" xmlns:v="urn:schemas-microsoft-com:vml" xmlns:wp14="http://schemas.microsoft.com/office/word/2010/wordprocessingDrawing" xmlns:wp="http://schemas.openxmlformats.org/drawingml/2006/wordprocessingDrawing" xmlns:w10="urn:schemas-microsoft-com:office:word" xmlns:w="http://schemas.openxmlformats.org/wordprocessingml/2006/main" xmlns:w14="http://schemas.microsoft.com/office/word/2010/wordml" xmlns:wpg="http://schemas.microsoft.com/office/word/2010/wordprocessingGroup" xmlns:wpi="http://schemas.microsoft.com/office/word/2010/wordprocessingInk" xmlns:wne="http://schemas.microsoft.com/office/word/2006/wordml" xmlns:wps="http://schemas.microsoft.com/office/word/2010/wordprocessingShape" mc:Ignorable="w14 wp14">
   <w:body>
+    <w:tbl>
+      <w:tblPr>
+        <w:tblStyle w:val="TableGrid"/>
+        <w:tblW w:type="auto" w:w="0"/>
+        <w:tblLook w:firstColumn="1" w:firstRow="1" w:lastColumn="0" w:lastRow="0" w:noHBand="0" w:noVBand="1" w:val="04A0"/>
+      </w:tblPr>
+      <w:tblGrid>
+        <w:gridCol w:w="9317"/>
+      </w:tblGrid>
+      <w:tr>
+        <w:tc>
+          <w:tcPr>
+            <w:tcW w:type="dxa" w:w="9317"/>
+            <w:shd w:val="clear" w:fill="0B1F2E"/>
+            <w:tcMar>
+              <w:top w:w="180" w:type="dxa"/>
+              <w:start w:w="240" w:type="dxa"/>
+              <w:bottom w:w="180" w:type="dxa"/>
+              <w:end w:w="240" w:type="dxa"/>
+            </w:tcMar>
+          </w:tcPr>
+          <w:p>
+            <w:r/>
+            <w:r>
+              <w:rPr>
+                <w:rFonts w:ascii="Segoe UI" w:hAnsi="Segoe UI" w:cs="Segoe UI"/>
+                <w:b/>
+                <w:i w:val="0"/>
+                <w:color w:val="00BDAA"/>
+                <w:sz w:val="26"/>
+              </w:rPr>
+              <w:t>NEXUSFINANCE</w:t>
+            </w:r>
+          </w:p>
+          <w:p>
+            <w:pPr>
+              <w:spacing w:after="0"/>
+            </w:pPr>
+            <w:r>
+              <w:rPr>
+                <w:rFonts w:ascii="Segoe UI" w:hAnsi="Segoe UI" w:cs="Segoe UI"/>
+                <w:b w:val="0"/>
+                <w:i w:val="0"/>
+                <w:color w:val="9FB4C4"/>
+                <w:sz w:val="18"/>
+              </w:rPr>
+              <w:t>Secure • Modern • Cutting-edge  |  Lending Platform for Cambodia</w:t>
+            </w:r>
+          </w:p>
+        </w:tc>
+      </w:tr>
+    </w:tbl>
     <w:p>
       <w:pPr>
-        <w:pStyle w:val="Title"/>
+        <w:spacing w:after="40"/>
+      </w:pPr>
+    </w:p>
+    <w:p>
+      <w:pPr>
+        <w:spacing w:after="600"/>
+      </w:pPr>
+    </w:p>
+    <w:p>
+      <w:pPr>
+        <w:spacing w:after="120"/>
+        <w:jc w:val="left"/>
       </w:pPr>
       <w:r>
+        <w:rPr>
+          <w:rFonts w:ascii="Segoe UI" w:hAnsi="Segoe UI" w:cs="Segoe UI"/>
+          <w:b/>
+          <w:i w:val="0"/>
+          <w:color w:val="0B1F2E"/>
+          <w:sz w:val="68"/>
+        </w:rPr>
         <w:t>NexusFinance — Executive Overview</w:t>
       </w:r>
     </w:p>
     <w:p>
+      <w:pPr>
+        <w:pBdr>
+          <w:bottom w:val="single" w:sz="24" w:space="4" w:color="00BDAA"/>
+        </w:pBdr>
+        <w:spacing w:after="240"/>
+      </w:pPr>
+    </w:p>
+    <w:p>
+      <w:pPr>
+        <w:spacing w:after="80"/>
+      </w:pPr>
       <w:r>
+        <w:rPr>
+          <w:rFonts w:ascii="Segoe UI" w:hAnsi="Segoe UI" w:cs="Segoe UI"/>
+          <w:b w:val="0"/>
+          <w:i w:val="0"/>
+          <w:color w:val="475A6B"/>
+          <w:sz w:val="26"/>
+        </w:rPr>
         <w:t>Digital Lending Platform for Cambodia</w:t>
       </w:r>
     </w:p>
     <w:p>
+      <w:pPr>
+        <w:spacing w:after="0"/>
+      </w:pPr>
       <w:r>
+        <w:rPr>
+          <w:rFonts w:ascii="Segoe UI" w:hAnsi="Segoe UI" w:cs="Segoe UI"/>
+          <w:b/>
+          <w:i w:val="0"/>
+          <w:color w:val="008A7C"/>
+          <w:sz w:val="20"/>
+        </w:rPr>
         <w:t>EN</w:t>
       </w:r>
     </w:p>
     <w:p>
+      <w:pPr>
+        <w:spacing w:after="600"/>
+      </w:pPr>
+    </w:p>
+    <w:tbl>
+      <w:tblPr>
+        <w:tblStyle w:val="TableGrid"/>
+        <w:tblW w:type="auto" w:w="0"/>
+        <w:tblLook w:firstColumn="1" w:firstRow="1" w:lastColumn="0" w:lastRow="0" w:noHBand="0" w:noVBand="1" w:val="04A0"/>
+      </w:tblPr>
+      <w:tblGrid>
+        <w:gridCol w:w="4658"/>
+        <w:gridCol w:w="4658"/>
+      </w:tblGrid>
+      <w:tr>
+        <w:tc>
+          <w:tcPr>
+            <w:tcW w:type="dxa" w:w="3168"/>
+            <w:shd w:val="clear" w:fill="F4F8FA"/>
+            <w:tcMar>
+              <w:top w:w="80" w:type="dxa"/>
+              <w:start w:w="120" w:type="dxa"/>
+              <w:bottom w:w="80" w:type="dxa"/>
+              <w:end w:w="120" w:type="dxa"/>
+            </w:tcMar>
+          </w:tcPr>
+          <w:p>
+            <w:r/>
+            <w:r>
+              <w:rPr>
+                <w:rFonts w:ascii="Segoe UI" w:hAnsi="Segoe UI" w:cs="Segoe UI"/>
+                <w:b/>
+                <w:i w:val="0"/>
+                <w:color w:val="0B1F2E"/>
+                <w:sz w:val="20"/>
+              </w:rPr>
+              <w:t>Document Number</w:t>
+            </w:r>
+          </w:p>
+        </w:tc>
+        <w:tc>
+          <w:tcPr>
+            <w:tcW w:type="dxa" w:w="6048"/>
+            <w:tcMar>
+              <w:top w:w="80" w:type="dxa"/>
+              <w:start w:w="120" w:type="dxa"/>
+              <w:bottom w:w="80" w:type="dxa"/>
+              <w:end w:w="120" w:type="dxa"/>
+            </w:tcMar>
+          </w:tcPr>
+          <w:p>
+            <w:r/>
+            <w:r>
+              <w:rPr>
+                <w:rFonts w:ascii="Segoe UI" w:hAnsi="Segoe UI" w:cs="Segoe UI"/>
+                <w:b w:val="0"/>
+                <w:i w:val="0"/>
+                <w:color w:val="475A6B"/>
+                <w:sz w:val="20"/>
+              </w:rPr>
+              <w:t>NF-DOC-001</w:t>
+            </w:r>
+          </w:p>
+        </w:tc>
+      </w:tr>
+      <w:tr>
+        <w:tc>
+          <w:tcPr>
+            <w:tcW w:type="dxa" w:w="3168"/>
+            <w:shd w:val="clear" w:fill="F4F8FA"/>
+            <w:tcMar>
+              <w:top w:w="80" w:type="dxa"/>
+              <w:start w:w="120" w:type="dxa"/>
+              <w:bottom w:w="80" w:type="dxa"/>
+              <w:end w:w="120" w:type="dxa"/>
+            </w:tcMar>
+          </w:tcPr>
+          <w:p>
+            <w:r/>
+            <w:r>
+              <w:rPr>
+                <w:rFonts w:ascii="Segoe UI" w:hAnsi="Segoe UI" w:cs="Segoe UI"/>
+                <w:b/>
+                <w:i w:val="0"/>
+                <w:color w:val="0B1F2E"/>
+                <w:sz w:val="20"/>
+              </w:rPr>
+              <w:t>Version</w:t>
+            </w:r>
+          </w:p>
+        </w:tc>
+        <w:tc>
+          <w:tcPr>
+            <w:tcW w:type="dxa" w:w="6048"/>
+            <w:tcMar>
+              <w:top w:w="80" w:type="dxa"/>
+              <w:start w:w="120" w:type="dxa"/>
+              <w:bottom w:w="80" w:type="dxa"/>
+              <w:end w:w="120" w:type="dxa"/>
+            </w:tcMar>
+          </w:tcPr>
+          <w:p>
+            <w:r/>
+            <w:r>
+              <w:rPr>
+                <w:rFonts w:ascii="Segoe UI" w:hAnsi="Segoe UI" w:cs="Segoe UI"/>
+                <w:b w:val="0"/>
+                <w:i w:val="0"/>
+                <w:color w:val="475A6B"/>
+                <w:sz w:val="20"/>
+              </w:rPr>
+              <w:t>1.1</w:t>
+            </w:r>
+          </w:p>
+        </w:tc>
+      </w:tr>
+      <w:tr>
+        <w:tc>
+          <w:tcPr>
+            <w:tcW w:type="dxa" w:w="3168"/>
+            <w:shd w:val="clear" w:fill="F4F8FA"/>
+            <w:tcMar>
+              <w:top w:w="80" w:type="dxa"/>
+              <w:start w:w="120" w:type="dxa"/>
+              <w:bottom w:w="80" w:type="dxa"/>
+              <w:end w:w="120" w:type="dxa"/>
+            </w:tcMar>
+          </w:tcPr>
+          <w:p>
+            <w:r/>
+            <w:r>
+              <w:rPr>
+                <w:rFonts w:ascii="Segoe UI" w:hAnsi="Segoe UI" w:cs="Segoe UI"/>
+                <w:b/>
+                <w:i w:val="0"/>
+                <w:color w:val="0B1F2E"/>
+                <w:sz w:val="20"/>
+              </w:rPr>
+              <w:t>Date</w:t>
+            </w:r>
+          </w:p>
+        </w:tc>
+        <w:tc>
+          <w:tcPr>
+            <w:tcW w:type="dxa" w:w="6048"/>
+            <w:tcMar>
+              <w:top w:w="80" w:type="dxa"/>
+              <w:start w:w="120" w:type="dxa"/>
+              <w:bottom w:w="80" w:type="dxa"/>
+              <w:end w:w="120" w:type="dxa"/>
+            </w:tcMar>
+          </w:tcPr>
+          <w:p>
+            <w:r/>
+            <w:r>
+              <w:rPr>
+                <w:rFonts w:ascii="Segoe UI" w:hAnsi="Segoe UI" w:cs="Segoe UI"/>
+                <w:b w:val="0"/>
+                <w:i w:val="0"/>
+                <w:color w:val="475A6B"/>
+                <w:sz w:val="20"/>
+              </w:rPr>
+              <w:t>August 2026</w:t>
+            </w:r>
+          </w:p>
+        </w:tc>
+      </w:tr>
+      <w:tr>
+        <w:tc>
+          <w:tcPr>
+            <w:tcW w:type="dxa" w:w="3168"/>
+            <w:shd w:val="clear" w:fill="F4F8FA"/>
+            <w:tcMar>
+              <w:top w:w="80" w:type="dxa"/>
+              <w:start w:w="120" w:type="dxa"/>
+              <w:bottom w:w="80" w:type="dxa"/>
+              <w:end w:w="120" w:type="dxa"/>
+            </w:tcMar>
+          </w:tcPr>
+          <w:p>
+            <w:r/>
+            <w:r>
+              <w:rPr>
+                <w:rFonts w:ascii="Segoe UI" w:hAnsi="Segoe UI" w:cs="Segoe UI"/>
+                <w:b/>
+                <w:i w:val="0"/>
+                <w:color w:val="0B1F2E"/>
+                <w:sz w:val="20"/>
+              </w:rPr>
+              <w:t>Prepared By</w:t>
+            </w:r>
+          </w:p>
+        </w:tc>
+        <w:tc>
+          <w:tcPr>
+            <w:tcW w:type="dxa" w:w="6048"/>
+            <w:tcMar>
+              <w:top w:w="80" w:type="dxa"/>
+              <w:start w:w="120" w:type="dxa"/>
+              <w:bottom w:w="80" w:type="dxa"/>
+              <w:end w:w="120" w:type="dxa"/>
+            </w:tcMar>
+          </w:tcPr>
+          <w:p>
+            <w:r/>
+            <w:r>
+              <w:rPr>
+                <w:rFonts w:ascii="Segoe UI" w:hAnsi="Segoe UI" w:cs="Segoe UI"/>
+                <w:b w:val="0"/>
+                <w:i w:val="0"/>
+                <w:color w:val="475A6B"/>
+                <w:sz w:val="20"/>
+              </w:rPr>
+              <w:t>NDX Digital Support</w:t>
+            </w:r>
+          </w:p>
+        </w:tc>
+      </w:tr>
+      <w:tr>
+        <w:tc>
+          <w:tcPr>
+            <w:tcW w:type="dxa" w:w="3168"/>
+            <w:shd w:val="clear" w:fill="F4F8FA"/>
+            <w:tcMar>
+              <w:top w:w="80" w:type="dxa"/>
+              <w:start w:w="120" w:type="dxa"/>
+              <w:bottom w:w="80" w:type="dxa"/>
+              <w:end w:w="120" w:type="dxa"/>
+            </w:tcMar>
+          </w:tcPr>
+          <w:p>
+            <w:r/>
+            <w:r>
+              <w:rPr>
+                <w:rFonts w:ascii="Segoe UI" w:hAnsi="Segoe UI" w:cs="Segoe UI"/>
+                <w:b/>
+                <w:i w:val="0"/>
+                <w:color w:val="0B1F2E"/>
+                <w:sz w:val="20"/>
+              </w:rPr>
+              <w:t>Classification</w:t>
+            </w:r>
+          </w:p>
+        </w:tc>
+        <w:tc>
+          <w:tcPr>
+            <w:tcW w:type="dxa" w:w="6048"/>
+            <w:tcMar>
+              <w:top w:w="80" w:type="dxa"/>
+              <w:start w:w="120" w:type="dxa"/>
+              <w:bottom w:w="80" w:type="dxa"/>
+              <w:end w:w="120" w:type="dxa"/>
+            </w:tcMar>
+          </w:tcPr>
+          <w:p>
+            <w:r/>
+            <w:r>
+              <w:rPr>
+                <w:rFonts w:ascii="Segoe UI" w:hAnsi="Segoe UI" w:cs="Segoe UI"/>
+                <w:b w:val="0"/>
+                <w:i w:val="0"/>
+                <w:color w:val="475A6B"/>
+                <w:sz w:val="20"/>
+              </w:rPr>
+              <w:t>Internal &amp; Confidential</w:t>
+            </w:r>
+          </w:p>
+        </w:tc>
+      </w:tr>
+    </w:tbl>
+    <w:p>
+      <w:pPr>
+        <w:spacing w:after="280"/>
+      </w:pPr>
+    </w:p>
+    <w:p>
       <w:r>
-        <w:t>Loan Management  •  KHQR Payments  •  Telegram Bot  •  Android App  •  Phone OTP</w:t>
+        <w:rPr>
+          <w:rFonts w:ascii="Segoe UI" w:hAnsi="Segoe UI" w:cs="Segoe UI"/>
+          <w:b w:val="0"/>
+          <w:i w:val="0"/>
+          <w:color w:val="6B7A89"/>
+          <w:sz w:val="18"/>
+        </w:rPr>
+        <w:t>Loan Management  •  KHQR Payments  •  Telegram Bot  •  Android App</w:t>
+      </w:r>
+    </w:p>
+    <w:p>
+      <w:r>
+        <w:br w:type="page"/>
+      </w:r>
+    </w:p>
+    <w:p>
+      <w:pPr>
+        <w:spacing w:after="120"/>
+        <w:pBdr>
+          <w:bottom w:val="single" w:sz="12" w:space="4" w:color="00BDAA"/>
+        </w:pBdr>
+      </w:pPr>
+      <w:r>
+        <w:rPr>
+          <w:rFonts w:ascii="Segoe UI" w:hAnsi="Segoe UI" w:cs="Segoe UI"/>
+          <w:b/>
+          <w:i w:val="0"/>
+          <w:color w:val="0B1F2E"/>
+          <w:sz w:val="32"/>
+        </w:rPr>
+        <w:t>Table of Contents</w:t>
+      </w:r>
+    </w:p>
+    <w:p>
+      <w:pPr>
+        <w:spacing w:after="160"/>
+      </w:pPr>
+    </w:p>
+    <w:p>
+      <w:pPr>
+        <w:tabs>
+          <w:tab w:pos="9360" w:val="right" w:leader="hyphen"/>
+        </w:tabs>
+        <w:spacing w:after="80"/>
+      </w:pPr>
+      <w:r>
+        <w:rPr>
+          <w:rFonts w:ascii="Segoe UI" w:hAnsi="Segoe UI" w:cs="Segoe UI"/>
+          <w:b/>
+          <w:i w:val="0"/>
+          <w:color w:val="008A7C"/>
+          <w:sz w:val="22"/>
+        </w:rPr>
+        <w:t xml:space="preserve">1.  </w:t>
+      </w:r>
+      <w:r>
+        <w:rPr>
+          <w:rFonts w:ascii="Segoe UI" w:hAnsi="Segoe UI" w:cs="Segoe UI"/>
+          <w:b w:val="0"/>
+          <w:i w:val="0"/>
+          <w:color w:val="0B1F2E"/>
+          <w:sz w:val="22"/>
+        </w:rPr>
+        <w:t>Executive Summary</w:t>
+      </w:r>
+    </w:p>
+    <w:p>
+      <w:pPr>
+        <w:tabs>
+          <w:tab w:pos="9360" w:val="right" w:leader="hyphen"/>
+        </w:tabs>
+        <w:spacing w:after="80"/>
+      </w:pPr>
+      <w:r>
+        <w:rPr>
+          <w:rFonts w:ascii="Segoe UI" w:hAnsi="Segoe UI" w:cs="Segoe UI"/>
+          <w:b/>
+          <w:i w:val="0"/>
+          <w:color w:val="008A7C"/>
+          <w:sz w:val="22"/>
+        </w:rPr>
+        <w:t xml:space="preserve">2.  </w:t>
+      </w:r>
+      <w:r>
+        <w:rPr>
+          <w:rFonts w:ascii="Segoe UI" w:hAnsi="Segoe UI" w:cs="Segoe UI"/>
+          <w:b w:val="0"/>
+          <w:i w:val="0"/>
+          <w:color w:val="0B1F2E"/>
+          <w:sz w:val="22"/>
+        </w:rPr>
+        <w:t>What We Delivered</w:t>
+      </w:r>
+    </w:p>
+    <w:p>
+      <w:pPr>
+        <w:tabs>
+          <w:tab w:pos="9360" w:val="right" w:leader="hyphen"/>
+        </w:tabs>
+        <w:spacing w:after="80"/>
+      </w:pPr>
+      <w:r>
+        <w:rPr>
+          <w:rFonts w:ascii="Segoe UI" w:hAnsi="Segoe UI" w:cs="Segoe UI"/>
+          <w:b/>
+          <w:i w:val="0"/>
+          <w:color w:val="008A7C"/>
+          <w:sz w:val="22"/>
+        </w:rPr>
+        <w:t xml:space="preserve">3.  </w:t>
+      </w:r>
+      <w:r>
+        <w:rPr>
+          <w:rFonts w:ascii="Segoe UI" w:hAnsi="Segoe UI" w:cs="Segoe UI"/>
+          <w:b w:val="0"/>
+          <w:i w:val="0"/>
+          <w:color w:val="0B1F2E"/>
+          <w:sz w:val="22"/>
+        </w:rPr>
+        <w:t>Demo Accounts</w:t>
+      </w:r>
+    </w:p>
+    <w:p>
+      <w:pPr>
+        <w:tabs>
+          <w:tab w:pos="9360" w:val="right" w:leader="hyphen"/>
+        </w:tabs>
+        <w:spacing w:after="80"/>
+      </w:pPr>
+      <w:r>
+        <w:rPr>
+          <w:rFonts w:ascii="Segoe UI" w:hAnsi="Segoe UI" w:cs="Segoe UI"/>
+          <w:b/>
+          <w:i w:val="0"/>
+          <w:color w:val="008A7C"/>
+          <w:sz w:val="22"/>
+        </w:rPr>
+        <w:t xml:space="preserve">4.  </w:t>
+      </w:r>
+      <w:r>
+        <w:rPr>
+          <w:rFonts w:ascii="Segoe UI" w:hAnsi="Segoe UI" w:cs="Segoe UI"/>
+          <w:b w:val="0"/>
+          <w:i w:val="0"/>
+          <w:color w:val="0B1F2E"/>
+          <w:sz w:val="22"/>
+        </w:rPr>
+        <w:t>Technology Stack</w:t>
+      </w:r>
+    </w:p>
+    <w:p>
+      <w:pPr>
+        <w:tabs>
+          <w:tab w:pos="9360" w:val="right" w:leader="hyphen"/>
+        </w:tabs>
+        <w:spacing w:after="80"/>
+      </w:pPr>
+      <w:r>
+        <w:rPr>
+          <w:rFonts w:ascii="Segoe UI" w:hAnsi="Segoe UI" w:cs="Segoe UI"/>
+          <w:b/>
+          <w:i w:val="0"/>
+          <w:color w:val="008A7C"/>
+          <w:sz w:val="22"/>
+        </w:rPr>
+        <w:t xml:space="preserve">5.  </w:t>
+      </w:r>
+      <w:r>
+        <w:rPr>
+          <w:rFonts w:ascii="Segoe UI" w:hAnsi="Segoe UI" w:cs="Segoe UI"/>
+          <w:b w:val="0"/>
+          <w:i w:val="0"/>
+          <w:color w:val="0B1F2E"/>
+          <w:sz w:val="22"/>
+        </w:rPr>
+        <w:t>Security &amp; Compliance Highlights</w:t>
+      </w:r>
+    </w:p>
+    <w:p>
+      <w:pPr>
+        <w:tabs>
+          <w:tab w:pos="9360" w:val="right" w:leader="hyphen"/>
+        </w:tabs>
+        <w:spacing w:after="80"/>
+      </w:pPr>
+      <w:r>
+        <w:rPr>
+          <w:rFonts w:ascii="Segoe UI" w:hAnsi="Segoe UI" w:cs="Segoe UI"/>
+          <w:b/>
+          <w:i w:val="0"/>
+          <w:color w:val="008A7C"/>
+          <w:sz w:val="22"/>
+        </w:rPr>
+        <w:t xml:space="preserve">6.  </w:t>
+      </w:r>
+      <w:r>
+        <w:rPr>
+          <w:rFonts w:ascii="Segoe UI" w:hAnsi="Segoe UI" w:cs="Segoe UI"/>
+          <w:b w:val="0"/>
+          <w:i w:val="0"/>
+          <w:color w:val="0B1F2E"/>
+          <w:sz w:val="22"/>
+        </w:rPr>
+        <w:t>Roadmap</w:t>
+      </w:r>
+    </w:p>
+    <w:p>
+      <w:r>
+        <w:br w:type="page"/>
       </w:r>
     </w:p>
     <w:p>
       <w:pPr>
         <w:pStyle w:val="Heading1"/>
+        <w:spacing w:before="360" w:after="120"/>
+        <w:pBdr>
+          <w:bottom w:val="single" w:sz="12" w:space="4" w:color="00BDAA"/>
+        </w:pBdr>
       </w:pPr>
       <w:r>
-        <w:t>Table of Contents</w:t>
-      </w:r>
-    </w:p>
-    <w:p>
-      <w:r>
-        <w:t>1.  Executive Summary</w:t>
-      </w:r>
-    </w:p>
-    <w:p>
-      <w:r>
-        <w:t>2.  What We Delivered</w:t>
-      </w:r>
-    </w:p>
-    <w:p>
-      <w:r>
-        <w:t>3.  Demo Accounts</w:t>
-      </w:r>
-    </w:p>
-    <w:p>
-      <w:r>
-        <w:t>4.  Technology Stack</w:t>
-      </w:r>
-    </w:p>
-    <w:p>
-      <w:r>
-        <w:t>5.  Security &amp; Compliance Highlights</w:t>
-      </w:r>
-    </w:p>
-    <w:p>
-      <w:r>
-        <w:t>6.  Roadmap</w:t>
-      </w:r>
-    </w:p>
-    <w:p>
-      <w:pPr>
-        <w:pStyle w:val="Heading1"/>
-      </w:pPr>
-      <w:r>
+        <w:rPr>
+          <w:rFonts w:ascii="Segoe UI" w:hAnsi="Segoe UI" w:cs="Segoe UI"/>
+          <w:b/>
+          <w:i w:val="0"/>
+          <w:color w:val="0B1F2E"/>
+          <w:sz w:val="32"/>
+        </w:rPr>
         <w:t>1. Executive Summary</w:t>
       </w:r>
     </w:p>
     <w:p>
       <w:r>
-        <w:t>NexusFinance is a full-stack digital lending platform built for microfinance operations in Cambodia. It covers the complete lending lifecycle — from customer loan applications, through officer review and phone/KYC verification, to repayment collection via KHQR payments — with real-time oversight through a secure web dashboard and a Telegram bot.</w:t>
+        <w:rPr>
+          <w:rFonts w:ascii="Segoe UI" w:hAnsi="Segoe UI" w:cs="Segoe UI"/>
+          <w:b w:val="0"/>
+          <w:i w:val="0"/>
+          <w:color w:val="0B1F2E"/>
+          <w:sz w:val="21"/>
+        </w:rPr>
+        <w:t>NexusFinance is a full-stack digital lending platform built for microfinance operations in Cambodia. It covers the complete lending lifecycle — from customer loan applications, through officer review and KYC verification, to repayment collection via KHQR payments — with real-time oversight through a secure web dashboard and a Telegram bot.</w:t>
       </w:r>
+    </w:p>
+    <w:tbl>
+      <w:tblPr>
+        <w:tblStyle w:val="TableGrid"/>
+        <w:tblW w:type="auto" w:w="0"/>
+        <w:tblLook w:firstColumn="1" w:firstRow="1" w:lastColumn="0" w:lastRow="0" w:noHBand="0" w:noVBand="1" w:val="04A0"/>
+      </w:tblPr>
+      <w:tblGrid>
+        <w:gridCol w:w="9317"/>
+      </w:tblGrid>
+      <w:tr>
+        <w:tc>
+          <w:tcPr>
+            <w:tcW w:type="dxa" w:w="9317"/>
+            <w:tcBorders>
+              <w:left w:val="single" w:sz="28" w:space="0" w:color="2E7D32"/>
+            </w:tcBorders>
+            <w:shd w:val="clear" w:fill="E8F5E9"/>
+            <w:tcMar>
+              <w:top w:w="140" w:type="dxa"/>
+              <w:start w:w="200" w:type="dxa"/>
+              <w:bottom w:w="140" w:type="dxa"/>
+              <w:end w:w="200" w:type="dxa"/>
+            </w:tcMar>
+          </w:tcPr>
+          <w:p>
+            <w:pPr>
+              <w:spacing w:after="60"/>
+            </w:pPr>
+            <w:r/>
+            <w:r>
+              <w:rPr>
+                <w:rFonts w:ascii="Segoe UI" w:hAnsi="Segoe UI" w:cs="Segoe UI"/>
+                <w:b/>
+                <w:i w:val="0"/>
+                <w:color w:val="0B1F2E"/>
+                <w:sz w:val="21"/>
+              </w:rPr>
+              <w:t>Why this matters</w:t>
+            </w:r>
+          </w:p>
+          <w:p>
+            <w:pPr>
+              <w:spacing w:after="0"/>
+            </w:pPr>
+            <w:r>
+              <w:rPr>
+                <w:rFonts w:ascii="Segoe UI" w:hAnsi="Segoe UI" w:cs="Segoe UI"/>
+                <w:b w:val="0"/>
+                <w:i w:val="0"/>
+                <w:color w:val="0B1F2E"/>
+                <w:sz w:val="20"/>
+              </w:rPr>
+              <w:t>NexusFinance replaces manual, paper-based lending workflows with a secure, auditable, and bilingual (English / Khmer) digital system.</w:t>
+            </w:r>
+          </w:p>
+        </w:tc>
+      </w:tr>
+    </w:tbl>
+    <w:p>
+      <w:pPr>
+        <w:spacing w:after="40"/>
+      </w:pPr>
     </w:p>
     <w:p>
       <w:pPr>
         <w:pStyle w:val="Heading1"/>
+        <w:spacing w:before="360" w:after="120"/>
+        <w:pBdr>
+          <w:bottom w:val="single" w:sz="12" w:space="4" w:color="00BDAA"/>
+        </w:pBdr>
       </w:pPr>
       <w:r>
+        <w:rPr>
+          <w:rFonts w:ascii="Segoe UI" w:hAnsi="Segoe UI" w:cs="Segoe UI"/>
+          <w:b/>
+          <w:i w:val="0"/>
+          <w:color w:val="0B1F2E"/>
+          <w:sz w:val="32"/>
+        </w:rPr>
         <w:t>2. What We Delivered</w:t>
       </w:r>
     </w:p>
+    <w:tbl>
+      <w:tblPr>
+        <w:tblStyle w:val="TableGrid"/>
+        <w:tblW w:type="auto" w:w="0"/>
+        <w:jc w:val="center"/>
+        <w:tblLayout w:type="fixed"/>
+        <w:tblLook w:firstColumn="1" w:firstRow="1" w:lastColumn="0" w:lastRow="0" w:noHBand="0" w:noVBand="1" w:val="04A0"/>
+      </w:tblPr>
+      <w:tblGrid>
+        <w:gridCol w:w="4658"/>
+        <w:gridCol w:w="4658"/>
+      </w:tblGrid>
+      <w:tr>
+        <w:tc>
+          <w:tcPr>
+            <w:tcW w:type="dxa" w:w="2592"/>
+            <w:shd w:val="clear" w:fill="0B1F2E"/>
+            <w:tcMar>
+              <w:top w:w="80" w:type="dxa"/>
+              <w:start w:w="120" w:type="dxa"/>
+              <w:bottom w:w="80" w:type="dxa"/>
+              <w:end w:w="120" w:type="dxa"/>
+            </w:tcMar>
+            <w:vAlign w:val="center"/>
+          </w:tcPr>
+          <w:p>
+            <w:pPr>
+              <w:jc w:val="left"/>
+            </w:pPr>
+            <w:r/>
+            <w:r>
+              <w:rPr>
+                <w:rFonts w:ascii="Segoe UI" w:hAnsi="Segoe UI" w:cs="Segoe UI"/>
+                <w:b/>
+                <w:i w:val="0"/>
+                <w:color w:val="FFFFFF"/>
+                <w:sz w:val="19"/>
+              </w:rPr>
+              <w:t>Capability</w:t>
+            </w:r>
+          </w:p>
+        </w:tc>
+        <w:tc>
+          <w:tcPr>
+            <w:tcW w:type="dxa" w:w="6624"/>
+            <w:shd w:val="clear" w:fill="0B1F2E"/>
+            <w:tcMar>
+              <w:top w:w="80" w:type="dxa"/>
+              <w:start w:w="120" w:type="dxa"/>
+              <w:bottom w:w="80" w:type="dxa"/>
+              <w:end w:w="120" w:type="dxa"/>
+            </w:tcMar>
+            <w:vAlign w:val="center"/>
+          </w:tcPr>
+          <w:p>
+            <w:pPr>
+              <w:jc w:val="left"/>
+            </w:pPr>
+            <w:r/>
+            <w:r>
+              <w:rPr>
+                <w:rFonts w:ascii="Segoe UI" w:hAnsi="Segoe UI" w:cs="Segoe UI"/>
+                <w:b/>
+                <w:i w:val="0"/>
+                <w:color w:val="FFFFFF"/>
+                <w:sz w:val="19"/>
+              </w:rPr>
+              <w:t>Description</w:t>
+            </w:r>
+          </w:p>
+        </w:tc>
+      </w:tr>
+      <w:tr>
+        <w:tc>
+          <w:tcPr>
+            <w:tcW w:type="dxa" w:w="2592"/>
+            <w:tcMar>
+              <w:top w:w="80" w:type="dxa"/>
+              <w:start w:w="120" w:type="dxa"/>
+              <w:bottom w:w="80" w:type="dxa"/>
+              <w:end w:w="120" w:type="dxa"/>
+            </w:tcMar>
+            <w:vAlign w:val="center"/>
+          </w:tcPr>
+          <w:p>
+            <w:pPr>
+              <w:spacing w:after="20"/>
+            </w:pPr>
+            <w:r/>
+            <w:r>
+              <w:rPr>
+                <w:rFonts w:ascii="Segoe UI" w:hAnsi="Segoe UI" w:cs="Segoe UI"/>
+                <w:b w:val="0"/>
+                <w:i w:val="0"/>
+                <w:color w:val="0B1F2E"/>
+                <w:sz w:val="19"/>
+              </w:rPr>
+              <w:t>Web App</w:t>
+            </w:r>
+          </w:p>
+        </w:tc>
+        <w:tc>
+          <w:tcPr>
+            <w:tcW w:type="dxa" w:w="6624"/>
+            <w:tcMar>
+              <w:top w:w="80" w:type="dxa"/>
+              <w:start w:w="120" w:type="dxa"/>
+              <w:bottom w:w="80" w:type="dxa"/>
+              <w:end w:w="120" w:type="dxa"/>
+            </w:tcMar>
+            <w:vAlign w:val="center"/>
+          </w:tcPr>
+          <w:p>
+            <w:pPr>
+              <w:spacing w:after="20"/>
+            </w:pPr>
+            <w:r/>
+            <w:r>
+              <w:rPr>
+                <w:rFonts w:ascii="Segoe UI" w:hAnsi="Segoe UI" w:cs="Segoe UI"/>
+                <w:b w:val="0"/>
+                <w:i w:val="0"/>
+                <w:color w:val="0B1F2E"/>
+                <w:sz w:val="19"/>
+              </w:rPr>
+              <w:t>React SPA with three portals — Customer, Loan Officer, Super Admin</w:t>
+            </w:r>
+          </w:p>
+        </w:tc>
+      </w:tr>
+      <w:tr>
+        <w:tc>
+          <w:tcPr>
+            <w:tcW w:type="dxa" w:w="2592"/>
+            <w:shd w:val="clear" w:fill="F4F8FA"/>
+            <w:tcMar>
+              <w:top w:w="80" w:type="dxa"/>
+              <w:start w:w="120" w:type="dxa"/>
+              <w:bottom w:w="80" w:type="dxa"/>
+              <w:end w:w="120" w:type="dxa"/>
+            </w:tcMar>
+            <w:vAlign w:val="center"/>
+          </w:tcPr>
+          <w:p>
+            <w:pPr>
+              <w:spacing w:after="20"/>
+            </w:pPr>
+            <w:r/>
+            <w:r>
+              <w:rPr>
+                <w:rFonts w:ascii="Segoe UI" w:hAnsi="Segoe UI" w:cs="Segoe UI"/>
+                <w:b w:val="0"/>
+                <w:i w:val="0"/>
+                <w:color w:val="0B1F2E"/>
+                <w:sz w:val="19"/>
+              </w:rPr>
+              <w:t>Backend API</w:t>
+            </w:r>
+          </w:p>
+        </w:tc>
+        <w:tc>
+          <w:tcPr>
+            <w:tcW w:type="dxa" w:w="6624"/>
+            <w:shd w:val="clear" w:fill="F4F8FA"/>
+            <w:tcMar>
+              <w:top w:w="80" w:type="dxa"/>
+              <w:start w:w="120" w:type="dxa"/>
+              <w:bottom w:w="80" w:type="dxa"/>
+              <w:end w:w="120" w:type="dxa"/>
+            </w:tcMar>
+            <w:vAlign w:val="center"/>
+          </w:tcPr>
+          <w:p>
+            <w:pPr>
+              <w:spacing w:after="20"/>
+            </w:pPr>
+            <w:r/>
+            <w:r>
+              <w:rPr>
+                <w:rFonts w:ascii="Segoe UI" w:hAnsi="Segoe UI" w:cs="Segoe UI"/>
+                <w:b w:val="0"/>
+                <w:i w:val="0"/>
+                <w:color w:val="0B1F2E"/>
+                <w:sz w:val="19"/>
+              </w:rPr>
+              <w:t>Node.js/Express REST API with JWT authentication and audit logging</w:t>
+            </w:r>
+          </w:p>
+        </w:tc>
+      </w:tr>
+      <w:tr>
+        <w:tc>
+          <w:tcPr>
+            <w:tcW w:type="dxa" w:w="2592"/>
+            <w:tcMar>
+              <w:top w:w="80" w:type="dxa"/>
+              <w:start w:w="120" w:type="dxa"/>
+              <w:bottom w:w="80" w:type="dxa"/>
+              <w:end w:w="120" w:type="dxa"/>
+            </w:tcMar>
+            <w:vAlign w:val="center"/>
+          </w:tcPr>
+          <w:p>
+            <w:pPr>
+              <w:spacing w:after="20"/>
+            </w:pPr>
+            <w:r/>
+            <w:r>
+              <w:rPr>
+                <w:rFonts w:ascii="Segoe UI" w:hAnsi="Segoe UI" w:cs="Segoe UI"/>
+                <w:b w:val="0"/>
+                <w:i w:val="0"/>
+                <w:color w:val="0B1F2E"/>
+                <w:sz w:val="19"/>
+              </w:rPr>
+              <w:t>Auth</w:t>
+            </w:r>
+          </w:p>
+        </w:tc>
+        <w:tc>
+          <w:tcPr>
+            <w:tcW w:type="dxa" w:w="6624"/>
+            <w:tcMar>
+              <w:top w:w="80" w:type="dxa"/>
+              <w:start w:w="120" w:type="dxa"/>
+              <w:bottom w:w="80" w:type="dxa"/>
+              <w:end w:w="120" w:type="dxa"/>
+            </w:tcMar>
+            <w:vAlign w:val="center"/>
+          </w:tcPr>
+          <w:p>
+            <w:pPr>
+              <w:spacing w:after="20"/>
+            </w:pPr>
+            <w:r/>
+            <w:r>
+              <w:rPr>
+                <w:rFonts w:ascii="Segoe UI" w:hAnsi="Segoe UI" w:cs="Segoe UI"/>
+                <w:b w:val="0"/>
+                <w:i w:val="0"/>
+                <w:color w:val="0B1F2E"/>
+                <w:sz w:val="19"/>
+              </w:rPr>
+              <w:t>Email or phone + password with OTP verification (Brevo email or Telegram/SMS) — login blocked until verified</w:t>
+            </w:r>
+          </w:p>
+        </w:tc>
+      </w:tr>
+      <w:tr>
+        <w:tc>
+          <w:tcPr>
+            <w:tcW w:type="dxa" w:w="2592"/>
+            <w:shd w:val="clear" w:fill="F4F8FA"/>
+            <w:tcMar>
+              <w:top w:w="80" w:type="dxa"/>
+              <w:start w:w="120" w:type="dxa"/>
+              <w:bottom w:w="80" w:type="dxa"/>
+              <w:end w:w="120" w:type="dxa"/>
+            </w:tcMar>
+            <w:vAlign w:val="center"/>
+          </w:tcPr>
+          <w:p>
+            <w:pPr>
+              <w:spacing w:after="20"/>
+            </w:pPr>
+            <w:r/>
+            <w:r>
+              <w:rPr>
+                <w:rFonts w:ascii="Segoe UI" w:hAnsi="Segoe UI" w:cs="Segoe UI"/>
+                <w:b w:val="0"/>
+                <w:i w:val="0"/>
+                <w:color w:val="0B1F2E"/>
+                <w:sz w:val="19"/>
+              </w:rPr>
+              <w:t>Payments</w:t>
+            </w:r>
+          </w:p>
+        </w:tc>
+        <w:tc>
+          <w:tcPr>
+            <w:tcW w:type="dxa" w:w="6624"/>
+            <w:shd w:val="clear" w:fill="F4F8FA"/>
+            <w:tcMar>
+              <w:top w:w="80" w:type="dxa"/>
+              <w:start w:w="120" w:type="dxa"/>
+              <w:bottom w:w="80" w:type="dxa"/>
+              <w:end w:w="120" w:type="dxa"/>
+            </w:tcMar>
+            <w:vAlign w:val="center"/>
+          </w:tcPr>
+          <w:p>
+            <w:pPr>
+              <w:spacing w:after="20"/>
+            </w:pPr>
+            <w:r/>
+            <w:r>
+              <w:rPr>
+                <w:rFonts w:ascii="Segoe UI" w:hAnsi="Segoe UI" w:cs="Segoe UI"/>
+                <w:b w:val="0"/>
+                <w:i w:val="0"/>
+                <w:color w:val="0B1F2E"/>
+                <w:sz w:val="19"/>
+              </w:rPr>
+              <w:t>KHQR (Bakong) integration and ABA PayWay hosted checkout</w:t>
+            </w:r>
+          </w:p>
+        </w:tc>
+      </w:tr>
+      <w:tr>
+        <w:tc>
+          <w:tcPr>
+            <w:tcW w:type="dxa" w:w="2592"/>
+            <w:tcMar>
+              <w:top w:w="80" w:type="dxa"/>
+              <w:start w:w="120" w:type="dxa"/>
+              <w:bottom w:w="80" w:type="dxa"/>
+              <w:end w:w="120" w:type="dxa"/>
+            </w:tcMar>
+            <w:vAlign w:val="center"/>
+          </w:tcPr>
+          <w:p>
+            <w:pPr>
+              <w:spacing w:after="20"/>
+            </w:pPr>
+            <w:r/>
+            <w:r>
+              <w:rPr>
+                <w:rFonts w:ascii="Segoe UI" w:hAnsi="Segoe UI" w:cs="Segoe UI"/>
+                <w:b w:val="0"/>
+                <w:i w:val="0"/>
+                <w:color w:val="0B1F2E"/>
+                <w:sz w:val="19"/>
+              </w:rPr>
+              <w:t>Telegram Bot</w:t>
+            </w:r>
+          </w:p>
+        </w:tc>
+        <w:tc>
+          <w:tcPr>
+            <w:tcW w:type="dxa" w:w="6624"/>
+            <w:tcMar>
+              <w:top w:w="80" w:type="dxa"/>
+              <w:start w:w="120" w:type="dxa"/>
+              <w:bottom w:w="80" w:type="dxa"/>
+              <w:end w:w="120" w:type="dxa"/>
+            </w:tcMar>
+            <w:vAlign w:val="center"/>
+          </w:tcPr>
+          <w:p>
+            <w:pPr>
+              <w:spacing w:after="20"/>
+            </w:pPr>
+            <w:r/>
+            <w:r>
+              <w:rPr>
+                <w:rFonts w:ascii="Segoe UI" w:hAnsi="Segoe UI" w:cs="Segoe UI"/>
+                <w:b w:val="0"/>
+                <w:i w:val="0"/>
+                <w:color w:val="0B1F2E"/>
+                <w:sz w:val="19"/>
+              </w:rPr>
+              <w:t>Payment notifications, reminders, admin commands, phone linking, password/phone changes</w:t>
+            </w:r>
+          </w:p>
+        </w:tc>
+      </w:tr>
+      <w:tr>
+        <w:tc>
+          <w:tcPr>
+            <w:tcW w:type="dxa" w:w="2592"/>
+            <w:shd w:val="clear" w:fill="F4F8FA"/>
+            <w:tcMar>
+              <w:top w:w="80" w:type="dxa"/>
+              <w:start w:w="120" w:type="dxa"/>
+              <w:bottom w:w="80" w:type="dxa"/>
+              <w:end w:w="120" w:type="dxa"/>
+            </w:tcMar>
+            <w:vAlign w:val="center"/>
+          </w:tcPr>
+          <w:p>
+            <w:pPr>
+              <w:spacing w:after="20"/>
+            </w:pPr>
+            <w:r/>
+            <w:r>
+              <w:rPr>
+                <w:rFonts w:ascii="Segoe UI" w:hAnsi="Segoe UI" w:cs="Segoe UI"/>
+                <w:b w:val="0"/>
+                <w:i w:val="0"/>
+                <w:color w:val="0B1F2E"/>
+                <w:sz w:val="19"/>
+              </w:rPr>
+              <w:t>Android App</w:t>
+            </w:r>
+          </w:p>
+        </w:tc>
+        <w:tc>
+          <w:tcPr>
+            <w:tcW w:type="dxa" w:w="6624"/>
+            <w:shd w:val="clear" w:fill="F4F8FA"/>
+            <w:tcMar>
+              <w:top w:w="80" w:type="dxa"/>
+              <w:start w:w="120" w:type="dxa"/>
+              <w:bottom w:w="80" w:type="dxa"/>
+              <w:end w:w="120" w:type="dxa"/>
+            </w:tcMar>
+            <w:vAlign w:val="center"/>
+          </w:tcPr>
+          <w:p>
+            <w:pPr>
+              <w:spacing w:after="20"/>
+            </w:pPr>
+            <w:r/>
+            <w:r>
+              <w:rPr>
+                <w:rFonts w:ascii="Segoe UI" w:hAnsi="Segoe UI" w:cs="Segoe UI"/>
+                <w:b w:val="0"/>
+                <w:i w:val="0"/>
+                <w:color w:val="0B1F2E"/>
+                <w:sz w:val="19"/>
+              </w:rPr>
+              <w:t>Expo WebView shell — installable APK</w:t>
+            </w:r>
+          </w:p>
+        </w:tc>
+      </w:tr>
+      <w:tr>
+        <w:tc>
+          <w:tcPr>
+            <w:tcW w:type="dxa" w:w="2592"/>
+            <w:tcMar>
+              <w:top w:w="80" w:type="dxa"/>
+              <w:start w:w="120" w:type="dxa"/>
+              <w:bottom w:w="80" w:type="dxa"/>
+              <w:end w:w="120" w:type="dxa"/>
+            </w:tcMar>
+            <w:vAlign w:val="center"/>
+          </w:tcPr>
+          <w:p>
+            <w:pPr>
+              <w:spacing w:after="20"/>
+            </w:pPr>
+            <w:r/>
+            <w:r>
+              <w:rPr>
+                <w:rFonts w:ascii="Segoe UI" w:hAnsi="Segoe UI" w:cs="Segoe UI"/>
+                <w:b w:val="0"/>
+                <w:i w:val="0"/>
+                <w:color w:val="0B1F2E"/>
+                <w:sz w:val="19"/>
+              </w:rPr>
+              <w:t>Deployment</w:t>
+            </w:r>
+          </w:p>
+        </w:tc>
+        <w:tc>
+          <w:tcPr>
+            <w:tcW w:type="dxa" w:w="6624"/>
+            <w:tcMar>
+              <w:top w:w="80" w:type="dxa"/>
+              <w:start w:w="120" w:type="dxa"/>
+              <w:bottom w:w="80" w:type="dxa"/>
+              <w:end w:w="120" w:type="dxa"/>
+            </w:tcMar>
+            <w:vAlign w:val="center"/>
+          </w:tcPr>
+          <w:p>
+            <w:pPr>
+              <w:spacing w:after="20"/>
+            </w:pPr>
+            <w:r/>
+            <w:r>
+              <w:rPr>
+                <w:rFonts w:ascii="Segoe UI" w:hAnsi="Segoe UI" w:cs="Segoe UI"/>
+                <w:b w:val="0"/>
+                <w:i w:val="0"/>
+                <w:color w:val="0B1F2E"/>
+                <w:sz w:val="19"/>
+              </w:rPr>
+              <w:t>Vercel (frontend) + Render (backend) + Supabase (database)</w:t>
+            </w:r>
+          </w:p>
+        </w:tc>
+      </w:tr>
+    </w:tbl>
     <w:p>
       <w:pPr>
-        <w:pStyle w:val="ListBullet"/>
+        <w:spacing w:after="40"/>
       </w:pPr>
-      <w:r>
-        <w:t>Customer Portal: Loan application, balance tracking, KHQR repayment, loan progress, transaction history</w:t>
-      </w:r>
-    </w:p>
-    <w:p>
-      <w:pPr>
-        <w:pStyle w:val="ListBullet"/>
-      </w:pPr>
-      <w:r>
-        <w:t>Loan Officer Portal: Application review with status badges, credit scoring, approval workflow</w:t>
-      </w:r>
-    </w:p>
-    <w:p>
-      <w:pPr>
-        <w:pStyle w:val="ListBullet"/>
-      </w:pPr>
-      <w:r>
-        <w:t>Super Admin Portal: Analytics, user management, system configuration, audit logs</w:t>
-      </w:r>
-    </w:p>
-    <w:p>
-      <w:pPr>
-        <w:pStyle w:val="ListBullet"/>
-      </w:pPr>
-      <w:r>
-        <w:t>Authentication: Phone-based OTP (Telegram &amp; SMS) and email OTP, JWT sessions, role-based access</w:t>
-      </w:r>
-    </w:p>
-    <w:p>
-      <w:pPr>
-        <w:pStyle w:val="ListBullet"/>
-      </w:pPr>
-      <w:r>
-        <w:t>Telegram Bot: Account linking via phone sharing, payment notifications, auto-login, reminders</w:t>
-      </w:r>
-    </w:p>
-    <w:p>
-      <w:pPr>
-        <w:pStyle w:val="ListBullet"/>
-      </w:pPr>
-      <w:r>
-        <w:t>Payment Integration: KHQR (Bakong) and ABA PayWay hosted checkout with HMAC-SHA512 security</w:t>
-      </w:r>
-    </w:p>
-    <w:p>
-      <w:pPr>
-        <w:pStyle w:val="ListBullet"/>
-      </w:pPr>
-      <w:r>
-        <w:t>Database: Supabase PostgreSQL with audit logging, RLS, and transaction ledger</w:t>
-      </w:r>
     </w:p>
     <w:p>
       <w:pPr>
         <w:pStyle w:val="Heading1"/>
+        <w:spacing w:before="360" w:after="120"/>
+        <w:pBdr>
+          <w:bottom w:val="single" w:sz="12" w:space="4" w:color="00BDAA"/>
+        </w:pBdr>
       </w:pPr>
       <w:r>
+        <w:rPr>
+          <w:rFonts w:ascii="Segoe UI" w:hAnsi="Segoe UI" w:cs="Segoe UI"/>
+          <w:b/>
+          <w:i w:val="0"/>
+          <w:color w:val="0B1F2E"/>
+          <w:sz w:val="32"/>
+        </w:rPr>
         <w:t>3. Demo Accounts</w:t>
       </w:r>
     </w:p>
-    <w:p>
-      <w:r>
-        <w:t>All accounts use password: password123</w:t>
-      </w:r>
-    </w:p>
+    <w:tbl>
+      <w:tblPr>
+        <w:tblStyle w:val="TableGrid"/>
+        <w:tblW w:type="auto" w:w="0"/>
+        <w:jc w:val="center"/>
+        <w:tblLayout w:type="fixed"/>
+        <w:tblLook w:firstColumn="1" w:firstRow="1" w:lastColumn="0" w:lastRow="0" w:noHBand="0" w:noVBand="1" w:val="04A0"/>
+      </w:tblPr>
+      <w:tblGrid>
+        <w:gridCol w:w="2329"/>
+        <w:gridCol w:w="2329"/>
+        <w:gridCol w:w="2329"/>
+        <w:gridCol w:w="2329"/>
+      </w:tblGrid>
+      <w:tr>
+        <w:tc>
+          <w:tcPr>
+            <w:tcW w:type="dxa" w:w="2016"/>
+            <w:shd w:val="clear" w:fill="0B1F2E"/>
+            <w:tcMar>
+              <w:top w:w="80" w:type="dxa"/>
+              <w:start w:w="120" w:type="dxa"/>
+              <w:bottom w:w="80" w:type="dxa"/>
+              <w:end w:w="120" w:type="dxa"/>
+            </w:tcMar>
+            <w:vAlign w:val="center"/>
+          </w:tcPr>
+          <w:p>
+            <w:pPr>
+              <w:jc w:val="left"/>
+            </w:pPr>
+            <w:r/>
+            <w:r>
+              <w:rPr>
+                <w:rFonts w:ascii="Segoe UI" w:hAnsi="Segoe UI" w:cs="Segoe UI"/>
+                <w:b/>
+                <w:i w:val="0"/>
+                <w:color w:val="FFFFFF"/>
+                <w:sz w:val="19"/>
+              </w:rPr>
+              <w:t>Role</w:t>
+            </w:r>
+          </w:p>
+        </w:tc>
+        <w:tc>
+          <w:tcPr>
+            <w:tcW w:type="dxa" w:w="3168"/>
+            <w:shd w:val="clear" w:fill="0B1F2E"/>
+            <w:tcMar>
+              <w:top w:w="80" w:type="dxa"/>
+              <w:start w:w="120" w:type="dxa"/>
+              <w:bottom w:w="80" w:type="dxa"/>
+              <w:end w:w="120" w:type="dxa"/>
+            </w:tcMar>
+            <w:vAlign w:val="center"/>
+          </w:tcPr>
+          <w:p>
+            <w:pPr>
+              <w:jc w:val="left"/>
+            </w:pPr>
+            <w:r/>
+            <w:r>
+              <w:rPr>
+                <w:rFonts w:ascii="Segoe UI" w:hAnsi="Segoe UI" w:cs="Segoe UI"/>
+                <w:b/>
+                <w:i w:val="0"/>
+                <w:color w:val="FFFFFF"/>
+                <w:sz w:val="19"/>
+              </w:rPr>
+              <w:t>Email</w:t>
+            </w:r>
+          </w:p>
+        </w:tc>
+        <w:tc>
+          <w:tcPr>
+            <w:tcW w:type="dxa" w:w="2304"/>
+            <w:shd w:val="clear" w:fill="0B1F2E"/>
+            <w:tcMar>
+              <w:top w:w="80" w:type="dxa"/>
+              <w:start w:w="120" w:type="dxa"/>
+              <w:bottom w:w="80" w:type="dxa"/>
+              <w:end w:w="120" w:type="dxa"/>
+            </w:tcMar>
+            <w:vAlign w:val="center"/>
+          </w:tcPr>
+          <w:p>
+            <w:pPr>
+              <w:jc w:val="left"/>
+            </w:pPr>
+            <w:r/>
+            <w:r>
+              <w:rPr>
+                <w:rFonts w:ascii="Segoe UI" w:hAnsi="Segoe UI" w:cs="Segoe UI"/>
+                <w:b/>
+                <w:i w:val="0"/>
+                <w:color w:val="FFFFFF"/>
+                <w:sz w:val="19"/>
+              </w:rPr>
+              <w:t>Phone</w:t>
+            </w:r>
+          </w:p>
+        </w:tc>
+        <w:tc>
+          <w:tcPr>
+            <w:tcW w:type="dxa" w:w="1728"/>
+            <w:shd w:val="clear" w:fill="0B1F2E"/>
+            <w:tcMar>
+              <w:top w:w="80" w:type="dxa"/>
+              <w:start w:w="120" w:type="dxa"/>
+              <w:bottom w:w="80" w:type="dxa"/>
+              <w:end w:w="120" w:type="dxa"/>
+            </w:tcMar>
+            <w:vAlign w:val="center"/>
+          </w:tcPr>
+          <w:p>
+            <w:pPr>
+              <w:jc w:val="left"/>
+            </w:pPr>
+            <w:r/>
+            <w:r>
+              <w:rPr>
+                <w:rFonts w:ascii="Segoe UI" w:hAnsi="Segoe UI" w:cs="Segoe UI"/>
+                <w:b/>
+                <w:i w:val="0"/>
+                <w:color w:val="FFFFFF"/>
+                <w:sz w:val="19"/>
+              </w:rPr>
+              <w:t>Password</w:t>
+            </w:r>
+          </w:p>
+        </w:tc>
+      </w:tr>
+      <w:tr>
+        <w:tc>
+          <w:tcPr>
+            <w:tcW w:type="dxa" w:w="2016"/>
+            <w:tcMar>
+              <w:top w:w="80" w:type="dxa"/>
+              <w:start w:w="120" w:type="dxa"/>
+              <w:bottom w:w="80" w:type="dxa"/>
+              <w:end w:w="120" w:type="dxa"/>
+            </w:tcMar>
+            <w:vAlign w:val="center"/>
+          </w:tcPr>
+          <w:p>
+            <w:pPr>
+              <w:spacing w:after="20"/>
+            </w:pPr>
+            <w:r/>
+            <w:r>
+              <w:rPr>
+                <w:rFonts w:ascii="Segoe UI" w:hAnsi="Segoe UI" w:cs="Segoe UI"/>
+                <w:b w:val="0"/>
+                <w:i w:val="0"/>
+                <w:color w:val="0B1F2E"/>
+                <w:sz w:val="19"/>
+              </w:rPr>
+              <w:t>Customer</w:t>
+            </w:r>
+          </w:p>
+        </w:tc>
+        <w:tc>
+          <w:tcPr>
+            <w:tcW w:type="dxa" w:w="3168"/>
+            <w:tcMar>
+              <w:top w:w="80" w:type="dxa"/>
+              <w:start w:w="120" w:type="dxa"/>
+              <w:bottom w:w="80" w:type="dxa"/>
+              <w:end w:w="120" w:type="dxa"/>
+            </w:tcMar>
+            <w:vAlign w:val="center"/>
+          </w:tcPr>
+          <w:p>
+            <w:pPr>
+              <w:spacing w:after="20"/>
+            </w:pPr>
+            <w:r/>
+            <w:r>
+              <w:rPr>
+                <w:rFonts w:ascii="Segoe UI" w:hAnsi="Segoe UI" w:cs="Segoe UI"/>
+                <w:b w:val="0"/>
+                <w:i w:val="0"/>
+                <w:color w:val="0B1F2E"/>
+                <w:sz w:val="19"/>
+              </w:rPr>
+              <w:t>customer@nexus.com</w:t>
+            </w:r>
+          </w:p>
+        </w:tc>
+        <w:tc>
+          <w:tcPr>
+            <w:tcW w:type="dxa" w:w="2304"/>
+            <w:tcMar>
+              <w:top w:w="80" w:type="dxa"/>
+              <w:start w:w="120" w:type="dxa"/>
+              <w:bottom w:w="80" w:type="dxa"/>
+              <w:end w:w="120" w:type="dxa"/>
+            </w:tcMar>
+            <w:vAlign w:val="center"/>
+          </w:tcPr>
+          <w:p>
+            <w:pPr>
+              <w:spacing w:after="20"/>
+            </w:pPr>
+            <w:r/>
+            <w:r>
+              <w:rPr>
+                <w:rFonts w:ascii="Segoe UI" w:hAnsi="Segoe UI" w:cs="Segoe UI"/>
+                <w:b w:val="0"/>
+                <w:i w:val="0"/>
+                <w:color w:val="0B1F2E"/>
+                <w:sz w:val="19"/>
+              </w:rPr>
+              <w:t>85570961423</w:t>
+            </w:r>
+          </w:p>
+        </w:tc>
+        <w:tc>
+          <w:tcPr>
+            <w:tcW w:type="dxa" w:w="1728"/>
+            <w:tcMar>
+              <w:top w:w="80" w:type="dxa"/>
+              <w:start w:w="120" w:type="dxa"/>
+              <w:bottom w:w="80" w:type="dxa"/>
+              <w:end w:w="120" w:type="dxa"/>
+            </w:tcMar>
+            <w:vAlign w:val="center"/>
+          </w:tcPr>
+          <w:p>
+            <w:pPr>
+              <w:spacing w:after="20"/>
+            </w:pPr>
+            <w:r/>
+            <w:r>
+              <w:rPr>
+                <w:rFonts w:ascii="Segoe UI" w:hAnsi="Segoe UI" w:cs="Segoe UI"/>
+                <w:b w:val="0"/>
+                <w:i w:val="0"/>
+                <w:color w:val="0B1F2E"/>
+                <w:sz w:val="19"/>
+              </w:rPr>
+              <w:t>password123</w:t>
+            </w:r>
+          </w:p>
+        </w:tc>
+      </w:tr>
+      <w:tr>
+        <w:tc>
+          <w:tcPr>
+            <w:tcW w:type="dxa" w:w="2016"/>
+            <w:shd w:val="clear" w:fill="F4F8FA"/>
+            <w:tcMar>
+              <w:top w:w="80" w:type="dxa"/>
+              <w:start w:w="120" w:type="dxa"/>
+              <w:bottom w:w="80" w:type="dxa"/>
+              <w:end w:w="120" w:type="dxa"/>
+            </w:tcMar>
+            <w:vAlign w:val="center"/>
+          </w:tcPr>
+          <w:p>
+            <w:pPr>
+              <w:spacing w:after="20"/>
+            </w:pPr>
+            <w:r/>
+            <w:r>
+              <w:rPr>
+                <w:rFonts w:ascii="Segoe UI" w:hAnsi="Segoe UI" w:cs="Segoe UI"/>
+                <w:b w:val="0"/>
+                <w:i w:val="0"/>
+                <w:color w:val="0B1F2E"/>
+                <w:sz w:val="19"/>
+              </w:rPr>
+              <w:t>Loan Officer</w:t>
+            </w:r>
+          </w:p>
+        </w:tc>
+        <w:tc>
+          <w:tcPr>
+            <w:tcW w:type="dxa" w:w="3168"/>
+            <w:shd w:val="clear" w:fill="F4F8FA"/>
+            <w:tcMar>
+              <w:top w:w="80" w:type="dxa"/>
+              <w:start w:w="120" w:type="dxa"/>
+              <w:bottom w:w="80" w:type="dxa"/>
+              <w:end w:w="120" w:type="dxa"/>
+            </w:tcMar>
+            <w:vAlign w:val="center"/>
+          </w:tcPr>
+          <w:p>
+            <w:pPr>
+              <w:spacing w:after="20"/>
+            </w:pPr>
+            <w:r/>
+            <w:r>
+              <w:rPr>
+                <w:rFonts w:ascii="Segoe UI" w:hAnsi="Segoe UI" w:cs="Segoe UI"/>
+                <w:b w:val="0"/>
+                <w:i w:val="0"/>
+                <w:color w:val="0B1F2E"/>
+                <w:sz w:val="19"/>
+              </w:rPr>
+              <w:t>officer@nexus.com</w:t>
+            </w:r>
+          </w:p>
+        </w:tc>
+        <w:tc>
+          <w:tcPr>
+            <w:tcW w:type="dxa" w:w="2304"/>
+            <w:shd w:val="clear" w:fill="F4F8FA"/>
+            <w:tcMar>
+              <w:top w:w="80" w:type="dxa"/>
+              <w:start w:w="120" w:type="dxa"/>
+              <w:bottom w:w="80" w:type="dxa"/>
+              <w:end w:w="120" w:type="dxa"/>
+            </w:tcMar>
+            <w:vAlign w:val="center"/>
+          </w:tcPr>
+          <w:p>
+            <w:pPr>
+              <w:spacing w:after="20"/>
+            </w:pPr>
+            <w:r/>
+            <w:r>
+              <w:rPr>
+                <w:rFonts w:ascii="Segoe UI" w:hAnsi="Segoe UI" w:cs="Segoe UI"/>
+                <w:b w:val="0"/>
+                <w:i w:val="0"/>
+                <w:color w:val="0B1F2E"/>
+                <w:sz w:val="19"/>
+              </w:rPr>
+              <w:t>85570961424</w:t>
+            </w:r>
+          </w:p>
+        </w:tc>
+        <w:tc>
+          <w:tcPr>
+            <w:tcW w:type="dxa" w:w="1728"/>
+            <w:shd w:val="clear" w:fill="F4F8FA"/>
+            <w:tcMar>
+              <w:top w:w="80" w:type="dxa"/>
+              <w:start w:w="120" w:type="dxa"/>
+              <w:bottom w:w="80" w:type="dxa"/>
+              <w:end w:w="120" w:type="dxa"/>
+            </w:tcMar>
+            <w:vAlign w:val="center"/>
+          </w:tcPr>
+          <w:p>
+            <w:pPr>
+              <w:spacing w:after="20"/>
+            </w:pPr>
+            <w:r/>
+            <w:r>
+              <w:rPr>
+                <w:rFonts w:ascii="Segoe UI" w:hAnsi="Segoe UI" w:cs="Segoe UI"/>
+                <w:b w:val="0"/>
+                <w:i w:val="0"/>
+                <w:color w:val="0B1F2E"/>
+                <w:sz w:val="19"/>
+              </w:rPr>
+              <w:t>password123</w:t>
+            </w:r>
+          </w:p>
+        </w:tc>
+      </w:tr>
+      <w:tr>
+        <w:tc>
+          <w:tcPr>
+            <w:tcW w:type="dxa" w:w="2016"/>
+            <w:tcMar>
+              <w:top w:w="80" w:type="dxa"/>
+              <w:start w:w="120" w:type="dxa"/>
+              <w:bottom w:w="80" w:type="dxa"/>
+              <w:end w:w="120" w:type="dxa"/>
+            </w:tcMar>
+            <w:vAlign w:val="center"/>
+          </w:tcPr>
+          <w:p>
+            <w:pPr>
+              <w:spacing w:after="20"/>
+            </w:pPr>
+            <w:r/>
+            <w:r>
+              <w:rPr>
+                <w:rFonts w:ascii="Segoe UI" w:hAnsi="Segoe UI" w:cs="Segoe UI"/>
+                <w:b w:val="0"/>
+                <w:i w:val="0"/>
+                <w:color w:val="0B1F2E"/>
+                <w:sz w:val="19"/>
+              </w:rPr>
+              <w:t>Super Admin</w:t>
+            </w:r>
+          </w:p>
+        </w:tc>
+        <w:tc>
+          <w:tcPr>
+            <w:tcW w:type="dxa" w:w="3168"/>
+            <w:tcMar>
+              <w:top w:w="80" w:type="dxa"/>
+              <w:start w:w="120" w:type="dxa"/>
+              <w:bottom w:w="80" w:type="dxa"/>
+              <w:end w:w="120" w:type="dxa"/>
+            </w:tcMar>
+            <w:vAlign w:val="center"/>
+          </w:tcPr>
+          <w:p>
+            <w:pPr>
+              <w:spacing w:after="20"/>
+            </w:pPr>
+            <w:r/>
+            <w:r>
+              <w:rPr>
+                <w:rFonts w:ascii="Segoe UI" w:hAnsi="Segoe UI" w:cs="Segoe UI"/>
+                <w:b w:val="0"/>
+                <w:i w:val="0"/>
+                <w:color w:val="0B1F2E"/>
+                <w:sz w:val="19"/>
+              </w:rPr>
+              <w:t>admin@nexus.com</w:t>
+            </w:r>
+          </w:p>
+        </w:tc>
+        <w:tc>
+          <w:tcPr>
+            <w:tcW w:type="dxa" w:w="2304"/>
+            <w:tcMar>
+              <w:top w:w="80" w:type="dxa"/>
+              <w:start w:w="120" w:type="dxa"/>
+              <w:bottom w:w="80" w:type="dxa"/>
+              <w:end w:w="120" w:type="dxa"/>
+            </w:tcMar>
+            <w:vAlign w:val="center"/>
+          </w:tcPr>
+          <w:p>
+            <w:pPr>
+              <w:spacing w:after="20"/>
+            </w:pPr>
+            <w:r/>
+            <w:r>
+              <w:rPr>
+                <w:rFonts w:ascii="Segoe UI" w:hAnsi="Segoe UI" w:cs="Segoe UI"/>
+                <w:b w:val="0"/>
+                <w:i w:val="0"/>
+                <w:color w:val="0B1F2E"/>
+                <w:sz w:val="19"/>
+              </w:rPr>
+              <w:t>85570961425</w:t>
+            </w:r>
+          </w:p>
+        </w:tc>
+        <w:tc>
+          <w:tcPr>
+            <w:tcW w:type="dxa" w:w="1728"/>
+            <w:tcMar>
+              <w:top w:w="80" w:type="dxa"/>
+              <w:start w:w="120" w:type="dxa"/>
+              <w:bottom w:w="80" w:type="dxa"/>
+              <w:end w:w="120" w:type="dxa"/>
+            </w:tcMar>
+            <w:vAlign w:val="center"/>
+          </w:tcPr>
+          <w:p>
+            <w:pPr>
+              <w:spacing w:after="20"/>
+            </w:pPr>
+            <w:r/>
+            <w:r>
+              <w:rPr>
+                <w:rFonts w:ascii="Segoe UI" w:hAnsi="Segoe UI" w:cs="Segoe UI"/>
+                <w:b w:val="0"/>
+                <w:i w:val="0"/>
+                <w:color w:val="0B1F2E"/>
+                <w:sz w:val="19"/>
+              </w:rPr>
+              <w:t>password123</w:t>
+            </w:r>
+          </w:p>
+        </w:tc>
+      </w:tr>
+    </w:tbl>
     <w:p>
       <w:pPr>
-        <w:pStyle w:val="ListBullet"/>
+        <w:spacing w:after="40"/>
       </w:pPr>
-      <w:r>
-        <w:t>Customer: customer@nexus.com (email verified)</w:t>
-      </w:r>
     </w:p>
+    <w:tbl>
+      <w:tblPr>
+        <w:tblStyle w:val="TableGrid"/>
+        <w:tblW w:type="auto" w:w="0"/>
+        <w:tblLook w:firstColumn="1" w:firstRow="1" w:lastColumn="0" w:lastRow="0" w:noHBand="0" w:noVBand="1" w:val="04A0"/>
+      </w:tblPr>
+      <w:tblGrid>
+        <w:gridCol w:w="9317"/>
+      </w:tblGrid>
+      <w:tr>
+        <w:tc>
+          <w:tcPr>
+            <w:tcW w:type="dxa" w:w="9317"/>
+            <w:tcBorders>
+              <w:left w:val="single" w:sz="28" w:space="0" w:color="00BDAA"/>
+            </w:tcBorders>
+            <w:shd w:val="clear" w:fill="E0F7F4"/>
+            <w:tcMar>
+              <w:top w:w="140" w:type="dxa"/>
+              <w:start w:w="200" w:type="dxa"/>
+              <w:bottom w:w="140" w:type="dxa"/>
+              <w:end w:w="200" w:type="dxa"/>
+            </w:tcMar>
+          </w:tcPr>
+          <w:p>
+            <w:pPr>
+              <w:spacing w:after="60"/>
+            </w:pPr>
+            <w:r/>
+            <w:r>
+              <w:rPr>
+                <w:rFonts w:ascii="Segoe UI" w:hAnsi="Segoe UI" w:cs="Segoe UI"/>
+                <w:b/>
+                <w:i w:val="0"/>
+                <w:color w:val="0B1F2E"/>
+                <w:sz w:val="21"/>
+              </w:rPr>
+              <w:t>Security note</w:t>
+            </w:r>
+          </w:p>
+          <w:p>
+            <w:pPr>
+              <w:spacing w:after="0"/>
+            </w:pPr>
+            <w:r>
+              <w:rPr>
+                <w:rFonts w:ascii="Segoe UI" w:hAnsi="Segoe UI" w:cs="Segoe UI"/>
+                <w:b w:val="0"/>
+                <w:i w:val="0"/>
+                <w:color w:val="0B1F2E"/>
+                <w:sz w:val="20"/>
+              </w:rPr>
+              <w:t>All passwords are stored as bcrypt hashes. OTP codes are hashed and expire after 10 minutes. All admin actions are written to an immutable audit log.</w:t>
+            </w:r>
+          </w:p>
+        </w:tc>
+      </w:tr>
+    </w:tbl>
     <w:p>
       <w:pPr>
-        <w:pStyle w:val="ListBullet"/>
+        <w:spacing w:after="40"/>
       </w:pPr>
-      <w:r>
-        <w:t>Loan Officer: officer@nexus.com (email verified)</w:t>
-      </w:r>
-    </w:p>
-    <w:p>
-      <w:pPr>
-        <w:pStyle w:val="ListBullet"/>
-      </w:pPr>
-      <w:r>
-        <w:t>Super Admin: admin@nexus.com (email verified)</w:t>
-      </w:r>
-    </w:p>
-    <w:p>
-      <w:pPr>
-        <w:pStyle w:val="ListBullet"/>
-      </w:pPr>
-      <w:r>
-        <w:t>Phone-only users: Register via Telegram phone sharing → auto-login, OTP via Telegram &amp; SMS</w:t>
-      </w:r>
     </w:p>
     <w:p>
       <w:pPr>
         <w:pStyle w:val="Heading1"/>
+        <w:spacing w:before="360" w:after="120"/>
+        <w:pBdr>
+          <w:bottom w:val="single" w:sz="12" w:space="4" w:color="00BDAA"/>
+        </w:pBdr>
       </w:pPr>
       <w:r>
+        <w:rPr>
+          <w:rFonts w:ascii="Segoe UI" w:hAnsi="Segoe UI" w:cs="Segoe UI"/>
+          <w:b/>
+          <w:i w:val="0"/>
+          <w:color w:val="0B1F2E"/>
+          <w:sz w:val="32"/>
+        </w:rPr>
         <w:t>4. Technology Stack</w:t>
       </w:r>
     </w:p>
+    <w:tbl>
+      <w:tblPr>
+        <w:tblStyle w:val="TableGrid"/>
+        <w:tblW w:type="auto" w:w="0"/>
+        <w:jc w:val="center"/>
+        <w:tblLayout w:type="fixed"/>
+        <w:tblLook w:firstColumn="1" w:firstRow="1" w:lastColumn="0" w:lastRow="0" w:noHBand="0" w:noVBand="1" w:val="04A0"/>
+      </w:tblPr>
+      <w:tblGrid>
+        <w:gridCol w:w="4658"/>
+        <w:gridCol w:w="4658"/>
+      </w:tblGrid>
+      <w:tr>
+        <w:tc>
+          <w:tcPr>
+            <w:tcW w:type="dxa" w:w="2592"/>
+            <w:shd w:val="clear" w:fill="0B1F2E"/>
+            <w:tcMar>
+              <w:top w:w="80" w:type="dxa"/>
+              <w:start w:w="120" w:type="dxa"/>
+              <w:bottom w:w="80" w:type="dxa"/>
+              <w:end w:w="120" w:type="dxa"/>
+            </w:tcMar>
+            <w:vAlign w:val="center"/>
+          </w:tcPr>
+          <w:p>
+            <w:pPr>
+              <w:jc w:val="left"/>
+            </w:pPr>
+            <w:r/>
+            <w:r>
+              <w:rPr>
+                <w:rFonts w:ascii="Segoe UI" w:hAnsi="Segoe UI" w:cs="Segoe UI"/>
+                <w:b/>
+                <w:i w:val="0"/>
+                <w:color w:val="FFFFFF"/>
+                <w:sz w:val="19"/>
+              </w:rPr>
+              <w:t>Layer</w:t>
+            </w:r>
+          </w:p>
+        </w:tc>
+        <w:tc>
+          <w:tcPr>
+            <w:tcW w:type="dxa" w:w="6624"/>
+            <w:shd w:val="clear" w:fill="0B1F2E"/>
+            <w:tcMar>
+              <w:top w:w="80" w:type="dxa"/>
+              <w:start w:w="120" w:type="dxa"/>
+              <w:bottom w:w="80" w:type="dxa"/>
+              <w:end w:w="120" w:type="dxa"/>
+            </w:tcMar>
+            <w:vAlign w:val="center"/>
+          </w:tcPr>
+          <w:p>
+            <w:pPr>
+              <w:jc w:val="left"/>
+            </w:pPr>
+            <w:r/>
+            <w:r>
+              <w:rPr>
+                <w:rFonts w:ascii="Segoe UI" w:hAnsi="Segoe UI" w:cs="Segoe UI"/>
+                <w:b/>
+                <w:i w:val="0"/>
+                <w:color w:val="FFFFFF"/>
+                <w:sz w:val="19"/>
+              </w:rPr>
+              <w:t>Technology</w:t>
+            </w:r>
+          </w:p>
+        </w:tc>
+      </w:tr>
+      <w:tr>
+        <w:tc>
+          <w:tcPr>
+            <w:tcW w:type="dxa" w:w="2592"/>
+            <w:tcMar>
+              <w:top w:w="80" w:type="dxa"/>
+              <w:start w:w="120" w:type="dxa"/>
+              <w:bottom w:w="80" w:type="dxa"/>
+              <w:end w:w="120" w:type="dxa"/>
+            </w:tcMar>
+            <w:vAlign w:val="center"/>
+          </w:tcPr>
+          <w:p>
+            <w:pPr>
+              <w:spacing w:after="20"/>
+            </w:pPr>
+            <w:r/>
+            <w:r>
+              <w:rPr>
+                <w:rFonts w:ascii="Segoe UI" w:hAnsi="Segoe UI" w:cs="Segoe UI"/>
+                <w:b w:val="0"/>
+                <w:i w:val="0"/>
+                <w:color w:val="0B1F2E"/>
+                <w:sz w:val="19"/>
+              </w:rPr>
+              <w:t>Frontend</w:t>
+            </w:r>
+          </w:p>
+        </w:tc>
+        <w:tc>
+          <w:tcPr>
+            <w:tcW w:type="dxa" w:w="6624"/>
+            <w:tcMar>
+              <w:top w:w="80" w:type="dxa"/>
+              <w:start w:w="120" w:type="dxa"/>
+              <w:bottom w:w="80" w:type="dxa"/>
+              <w:end w:w="120" w:type="dxa"/>
+            </w:tcMar>
+            <w:vAlign w:val="center"/>
+          </w:tcPr>
+          <w:p>
+            <w:pPr>
+              <w:spacing w:after="20"/>
+            </w:pPr>
+            <w:r/>
+            <w:r>
+              <w:rPr>
+                <w:rFonts w:ascii="Segoe UI" w:hAnsi="Segoe UI" w:cs="Segoe UI"/>
+                <w:b w:val="0"/>
+                <w:i w:val="0"/>
+                <w:color w:val="0B1F2E"/>
+                <w:sz w:val="19"/>
+              </w:rPr>
+              <w:t>React 18, TypeScript, Vite, Tailwind CSS</w:t>
+            </w:r>
+          </w:p>
+        </w:tc>
+      </w:tr>
+      <w:tr>
+        <w:tc>
+          <w:tcPr>
+            <w:tcW w:type="dxa" w:w="2592"/>
+            <w:shd w:val="clear" w:fill="F4F8FA"/>
+            <w:tcMar>
+              <w:top w:w="80" w:type="dxa"/>
+              <w:start w:w="120" w:type="dxa"/>
+              <w:bottom w:w="80" w:type="dxa"/>
+              <w:end w:w="120" w:type="dxa"/>
+            </w:tcMar>
+            <w:vAlign w:val="center"/>
+          </w:tcPr>
+          <w:p>
+            <w:pPr>
+              <w:spacing w:after="20"/>
+            </w:pPr>
+            <w:r/>
+            <w:r>
+              <w:rPr>
+                <w:rFonts w:ascii="Segoe UI" w:hAnsi="Segoe UI" w:cs="Segoe UI"/>
+                <w:b w:val="0"/>
+                <w:i w:val="0"/>
+                <w:color w:val="0B1F2E"/>
+                <w:sz w:val="19"/>
+              </w:rPr>
+              <w:t>Backend</w:t>
+            </w:r>
+          </w:p>
+        </w:tc>
+        <w:tc>
+          <w:tcPr>
+            <w:tcW w:type="dxa" w:w="6624"/>
+            <w:shd w:val="clear" w:fill="F4F8FA"/>
+            <w:tcMar>
+              <w:top w:w="80" w:type="dxa"/>
+              <w:start w:w="120" w:type="dxa"/>
+              <w:bottom w:w="80" w:type="dxa"/>
+              <w:end w:w="120" w:type="dxa"/>
+            </w:tcMar>
+            <w:vAlign w:val="center"/>
+          </w:tcPr>
+          <w:p>
+            <w:pPr>
+              <w:spacing w:after="20"/>
+            </w:pPr>
+            <w:r/>
+            <w:r>
+              <w:rPr>
+                <w:rFonts w:ascii="Segoe UI" w:hAnsi="Segoe UI" w:cs="Segoe UI"/>
+                <w:b w:val="0"/>
+                <w:i w:val="0"/>
+                <w:color w:val="0B1F2E"/>
+                <w:sz w:val="19"/>
+              </w:rPr>
+              <w:t>Node.js, Express, TypeScript (tsx)</w:t>
+            </w:r>
+          </w:p>
+        </w:tc>
+      </w:tr>
+      <w:tr>
+        <w:tc>
+          <w:tcPr>
+            <w:tcW w:type="dxa" w:w="2592"/>
+            <w:tcMar>
+              <w:top w:w="80" w:type="dxa"/>
+              <w:start w:w="120" w:type="dxa"/>
+              <w:bottom w:w="80" w:type="dxa"/>
+              <w:end w:w="120" w:type="dxa"/>
+            </w:tcMar>
+            <w:vAlign w:val="center"/>
+          </w:tcPr>
+          <w:p>
+            <w:pPr>
+              <w:spacing w:after="20"/>
+            </w:pPr>
+            <w:r/>
+            <w:r>
+              <w:rPr>
+                <w:rFonts w:ascii="Segoe UI" w:hAnsi="Segoe UI" w:cs="Segoe UI"/>
+                <w:b w:val="0"/>
+                <w:i w:val="0"/>
+                <w:color w:val="0B1F2E"/>
+                <w:sz w:val="19"/>
+              </w:rPr>
+              <w:t>Database</w:t>
+            </w:r>
+          </w:p>
+        </w:tc>
+        <w:tc>
+          <w:tcPr>
+            <w:tcW w:type="dxa" w:w="6624"/>
+            <w:tcMar>
+              <w:top w:w="80" w:type="dxa"/>
+              <w:start w:w="120" w:type="dxa"/>
+              <w:bottom w:w="80" w:type="dxa"/>
+              <w:end w:w="120" w:type="dxa"/>
+            </w:tcMar>
+            <w:vAlign w:val="center"/>
+          </w:tcPr>
+          <w:p>
+            <w:pPr>
+              <w:spacing w:after="20"/>
+            </w:pPr>
+            <w:r/>
+            <w:r>
+              <w:rPr>
+                <w:rFonts w:ascii="Segoe UI" w:hAnsi="Segoe UI" w:cs="Segoe UI"/>
+                <w:b w:val="0"/>
+                <w:i w:val="0"/>
+                <w:color w:val="0B1F2E"/>
+                <w:sz w:val="19"/>
+              </w:rPr>
+              <w:t>Supabase (PostgreSQL)</w:t>
+            </w:r>
+          </w:p>
+        </w:tc>
+      </w:tr>
+      <w:tr>
+        <w:tc>
+          <w:tcPr>
+            <w:tcW w:type="dxa" w:w="2592"/>
+            <w:shd w:val="clear" w:fill="F4F8FA"/>
+            <w:tcMar>
+              <w:top w:w="80" w:type="dxa"/>
+              <w:start w:w="120" w:type="dxa"/>
+              <w:bottom w:w="80" w:type="dxa"/>
+              <w:end w:w="120" w:type="dxa"/>
+            </w:tcMar>
+            <w:vAlign w:val="center"/>
+          </w:tcPr>
+          <w:p>
+            <w:pPr>
+              <w:spacing w:after="20"/>
+            </w:pPr>
+            <w:r/>
+            <w:r>
+              <w:rPr>
+                <w:rFonts w:ascii="Segoe UI" w:hAnsi="Segoe UI" w:cs="Segoe UI"/>
+                <w:b w:val="0"/>
+                <w:i w:val="0"/>
+                <w:color w:val="0B1F2E"/>
+                <w:sz w:val="19"/>
+              </w:rPr>
+              <w:t>Auth</w:t>
+            </w:r>
+          </w:p>
+        </w:tc>
+        <w:tc>
+          <w:tcPr>
+            <w:tcW w:type="dxa" w:w="6624"/>
+            <w:shd w:val="clear" w:fill="F4F8FA"/>
+            <w:tcMar>
+              <w:top w:w="80" w:type="dxa"/>
+              <w:start w:w="120" w:type="dxa"/>
+              <w:bottom w:w="80" w:type="dxa"/>
+              <w:end w:w="120" w:type="dxa"/>
+            </w:tcMar>
+            <w:vAlign w:val="center"/>
+          </w:tcPr>
+          <w:p>
+            <w:pPr>
+              <w:spacing w:after="20"/>
+            </w:pPr>
+            <w:r/>
+            <w:r>
+              <w:rPr>
+                <w:rFonts w:ascii="Segoe UI" w:hAnsi="Segoe UI" w:cs="Segoe UI"/>
+                <w:b w:val="0"/>
+                <w:i w:val="0"/>
+                <w:color w:val="0B1F2E"/>
+                <w:sz w:val="19"/>
+              </w:rPr>
+              <w:t>JWT + bcrypt + Brevo OTP email / Telegram OTP / SMS</w:t>
+            </w:r>
+          </w:p>
+        </w:tc>
+      </w:tr>
+      <w:tr>
+        <w:tc>
+          <w:tcPr>
+            <w:tcW w:type="dxa" w:w="2592"/>
+            <w:tcMar>
+              <w:top w:w="80" w:type="dxa"/>
+              <w:start w:w="120" w:type="dxa"/>
+              <w:bottom w:w="80" w:type="dxa"/>
+              <w:end w:w="120" w:type="dxa"/>
+            </w:tcMar>
+            <w:vAlign w:val="center"/>
+          </w:tcPr>
+          <w:p>
+            <w:pPr>
+              <w:spacing w:after="20"/>
+            </w:pPr>
+            <w:r/>
+            <w:r>
+              <w:rPr>
+                <w:rFonts w:ascii="Segoe UI" w:hAnsi="Segoe UI" w:cs="Segoe UI"/>
+                <w:b w:val="0"/>
+                <w:i w:val="0"/>
+                <w:color w:val="0B1F2E"/>
+                <w:sz w:val="19"/>
+              </w:rPr>
+              <w:t>Hosting</w:t>
+            </w:r>
+          </w:p>
+        </w:tc>
+        <w:tc>
+          <w:tcPr>
+            <w:tcW w:type="dxa" w:w="6624"/>
+            <w:tcMar>
+              <w:top w:w="80" w:type="dxa"/>
+              <w:start w:w="120" w:type="dxa"/>
+              <w:bottom w:w="80" w:type="dxa"/>
+              <w:end w:w="120" w:type="dxa"/>
+            </w:tcMar>
+            <w:vAlign w:val="center"/>
+          </w:tcPr>
+          <w:p>
+            <w:pPr>
+              <w:spacing w:after="20"/>
+            </w:pPr>
+            <w:r/>
+            <w:r>
+              <w:rPr>
+                <w:rFonts w:ascii="Segoe UI" w:hAnsi="Segoe UI" w:cs="Segoe UI"/>
+                <w:b w:val="0"/>
+                <w:i w:val="0"/>
+                <w:color w:val="0B1F2E"/>
+                <w:sz w:val="19"/>
+              </w:rPr>
+              <w:t>Vercel (frontend) + Render (backend)</w:t>
+            </w:r>
+          </w:p>
+        </w:tc>
+      </w:tr>
+      <w:tr>
+        <w:tc>
+          <w:tcPr>
+            <w:tcW w:type="dxa" w:w="2592"/>
+            <w:shd w:val="clear" w:fill="F4F8FA"/>
+            <w:tcMar>
+              <w:top w:w="80" w:type="dxa"/>
+              <w:start w:w="120" w:type="dxa"/>
+              <w:bottom w:w="80" w:type="dxa"/>
+              <w:end w:w="120" w:type="dxa"/>
+            </w:tcMar>
+            <w:vAlign w:val="center"/>
+          </w:tcPr>
+          <w:p>
+            <w:pPr>
+              <w:spacing w:after="20"/>
+            </w:pPr>
+            <w:r/>
+            <w:r>
+              <w:rPr>
+                <w:rFonts w:ascii="Segoe UI" w:hAnsi="Segoe UI" w:cs="Segoe UI"/>
+                <w:b w:val="0"/>
+                <w:i w:val="0"/>
+                <w:color w:val="0B1F2E"/>
+                <w:sz w:val="19"/>
+              </w:rPr>
+              <w:t>Payments</w:t>
+            </w:r>
+          </w:p>
+        </w:tc>
+        <w:tc>
+          <w:tcPr>
+            <w:tcW w:type="dxa" w:w="6624"/>
+            <w:shd w:val="clear" w:fill="F4F8FA"/>
+            <w:tcMar>
+              <w:top w:w="80" w:type="dxa"/>
+              <w:start w:w="120" w:type="dxa"/>
+              <w:bottom w:w="80" w:type="dxa"/>
+              <w:end w:w="120" w:type="dxa"/>
+            </w:tcMar>
+            <w:vAlign w:val="center"/>
+          </w:tcPr>
+          <w:p>
+            <w:pPr>
+              <w:spacing w:after="20"/>
+            </w:pPr>
+            <w:r/>
+            <w:r>
+              <w:rPr>
+                <w:rFonts w:ascii="Segoe UI" w:hAnsi="Segoe UI" w:cs="Segoe UI"/>
+                <w:b w:val="0"/>
+                <w:i w:val="0"/>
+                <w:color w:val="0B1F2E"/>
+                <w:sz w:val="19"/>
+              </w:rPr>
+              <w:t>KHQR / EMVCo QR, ABA PayWay (sandbox)</w:t>
+            </w:r>
+          </w:p>
+        </w:tc>
+      </w:tr>
+      <w:tr>
+        <w:tc>
+          <w:tcPr>
+            <w:tcW w:type="dxa" w:w="2592"/>
+            <w:tcMar>
+              <w:top w:w="80" w:type="dxa"/>
+              <w:start w:w="120" w:type="dxa"/>
+              <w:bottom w:w="80" w:type="dxa"/>
+              <w:end w:w="120" w:type="dxa"/>
+            </w:tcMar>
+            <w:vAlign w:val="center"/>
+          </w:tcPr>
+          <w:p>
+            <w:pPr>
+              <w:spacing w:after="20"/>
+            </w:pPr>
+            <w:r/>
+            <w:r>
+              <w:rPr>
+                <w:rFonts w:ascii="Segoe UI" w:hAnsi="Segoe UI" w:cs="Segoe UI"/>
+                <w:b w:val="0"/>
+                <w:i w:val="0"/>
+                <w:color w:val="0B1F2E"/>
+                <w:sz w:val="19"/>
+              </w:rPr>
+              <w:t>Notifications</w:t>
+            </w:r>
+          </w:p>
+        </w:tc>
+        <w:tc>
+          <w:tcPr>
+            <w:tcW w:type="dxa" w:w="6624"/>
+            <w:tcMar>
+              <w:top w:w="80" w:type="dxa"/>
+              <w:start w:w="120" w:type="dxa"/>
+              <w:bottom w:w="80" w:type="dxa"/>
+              <w:end w:w="120" w:type="dxa"/>
+            </w:tcMar>
+            <w:vAlign w:val="center"/>
+          </w:tcPr>
+          <w:p>
+            <w:pPr>
+              <w:spacing w:after="20"/>
+            </w:pPr>
+            <w:r/>
+            <w:r>
+              <w:rPr>
+                <w:rFonts w:ascii="Segoe UI" w:hAnsi="Segoe UI" w:cs="Segoe UI"/>
+                <w:b w:val="0"/>
+                <w:i w:val="0"/>
+                <w:color w:val="0B1F2E"/>
+                <w:sz w:val="19"/>
+              </w:rPr>
+              <w:t>Telegram Bot API, Brevo transactional email, Brevo SMS</w:t>
+            </w:r>
+          </w:p>
+        </w:tc>
+      </w:tr>
+      <w:tr>
+        <w:tc>
+          <w:tcPr>
+            <w:tcW w:type="dxa" w:w="2592"/>
+            <w:shd w:val="clear" w:fill="F4F8FA"/>
+            <w:tcMar>
+              <w:top w:w="80" w:type="dxa"/>
+              <w:start w:w="120" w:type="dxa"/>
+              <w:bottom w:w="80" w:type="dxa"/>
+              <w:end w:w="120" w:type="dxa"/>
+            </w:tcMar>
+            <w:vAlign w:val="center"/>
+          </w:tcPr>
+          <w:p>
+            <w:pPr>
+              <w:spacing w:after="20"/>
+            </w:pPr>
+            <w:r/>
+            <w:r>
+              <w:rPr>
+                <w:rFonts w:ascii="Segoe UI" w:hAnsi="Segoe UI" w:cs="Segoe UI"/>
+                <w:b w:val="0"/>
+                <w:i w:val="0"/>
+                <w:color w:val="0B1F2E"/>
+                <w:sz w:val="19"/>
+              </w:rPr>
+              <w:t>Mobile</w:t>
+            </w:r>
+          </w:p>
+        </w:tc>
+        <w:tc>
+          <w:tcPr>
+            <w:tcW w:type="dxa" w:w="6624"/>
+            <w:shd w:val="clear" w:fill="F4F8FA"/>
+            <w:tcMar>
+              <w:top w:w="80" w:type="dxa"/>
+              <w:start w:w="120" w:type="dxa"/>
+              <w:bottom w:w="80" w:type="dxa"/>
+              <w:end w:w="120" w:type="dxa"/>
+            </w:tcMar>
+            <w:vAlign w:val="center"/>
+          </w:tcPr>
+          <w:p>
+            <w:pPr>
+              <w:spacing w:after="20"/>
+            </w:pPr>
+            <w:r/>
+            <w:r>
+              <w:rPr>
+                <w:rFonts w:ascii="Segoe UI" w:hAnsi="Segoe UI" w:cs="Segoe UI"/>
+                <w:b w:val="0"/>
+                <w:i w:val="0"/>
+                <w:color w:val="0B1F2E"/>
+                <w:sz w:val="19"/>
+              </w:rPr>
+              <w:t>Expo SDK 57, React Native WebView</w:t>
+            </w:r>
+          </w:p>
+        </w:tc>
+      </w:tr>
+    </w:tbl>
     <w:p>
       <w:pPr>
-        <w:pStyle w:val="ListBullet"/>
+        <w:spacing w:after="40"/>
       </w:pPr>
-      <w:r>
-        <w:t>Frontend: React 18 + TypeScript + Vite, CSS custom properties (dark/light mode), Vercel deployment</w:t>
-      </w:r>
-    </w:p>
-    <w:p>
-      <w:pPr>
-        <w:pStyle w:val="ListBullet"/>
-      </w:pPr>
-      <w:r>
-        <w:t>Backend: Express.js + TypeScript, JWT auth with role middleware, Supabase PostgreSQL</w:t>
-      </w:r>
-    </w:p>
-    <w:p>
-      <w:pPr>
-        <w:pStyle w:val="ListBullet"/>
-      </w:pPr>
-      <w:r>
-        <w:t>Payments: KHQR (Bakong EMVCo), ABA PayWay Purchase API (HMAC-SHA512, hosted checkout)</w:t>
-      </w:r>
-    </w:p>
-    <w:p>
-      <w:pPr>
-        <w:pStyle w:val="ListBullet"/>
-      </w:pPr>
-      <w:r>
-        <w:t>Telegram: Bot API for notifications, WebApp for phone sharing, auto-login via deep link</w:t>
-      </w:r>
-    </w:p>
-    <w:p>
-      <w:pPr>
-        <w:pStyle w:val="ListBullet"/>
-      </w:pPr>
-      <w:r>
-        <w:t>SMS: Twilio for OTP fallback delivery</w:t>
-      </w:r>
-    </w:p>
-    <w:p>
-      <w:pPr>
-        <w:pStyle w:val="ListBullet"/>
-      </w:pPr>
-      <w:r>
-        <w:t>Hosting: Vercel (frontend) + Render (backend), GitHub auto-deploys</w:t>
-      </w:r>
     </w:p>
     <w:p>
       <w:pPr>
         <w:pStyle w:val="Heading1"/>
+        <w:spacing w:before="360" w:after="120"/>
+        <w:pBdr>
+          <w:bottom w:val="single" w:sz="12" w:space="4" w:color="00BDAA"/>
+        </w:pBdr>
       </w:pPr>
       <w:r>
+        <w:rPr>
+          <w:rFonts w:ascii="Segoe UI" w:hAnsi="Segoe UI" w:cs="Segoe UI"/>
+          <w:b/>
+          <w:i w:val="0"/>
+          <w:color w:val="0B1F2E"/>
+          <w:sz w:val="32"/>
+        </w:rPr>
         <w:t>5. Security &amp; Compliance Highlights</w:t>
       </w:r>
     </w:p>
     <w:p>
       <w:pPr>
         <w:pStyle w:val="ListBullet"/>
+        <w:spacing w:after="60"/>
+        <w:ind w:left="432"/>
       </w:pPr>
       <w:r>
-        <w:t>Phone-based OTP (Telegram bot + SMS/Twilio fallback) and email OTP — parallel verification channels</w:t>
-      </w:r>
-    </w:p>
-    <w:p>
-      <w:pPr>
-        <w:pStyle w:val="ListBullet"/>
-      </w:pPr>
-      <w:r>
+        <w:rPr>
+          <w:rFonts w:ascii="Segoe UI" w:hAnsi="Segoe UI" w:cs="Segoe UI"/>
+          <w:b w:val="0"/>
+          <w:i w:val="0"/>
+          <w:color w:val="0B1F2E"/>
+          <w:sz w:val="21"/>
+        </w:rPr>
         <w:t>JWT sessions with server-side role enforcement (customer / loan-officer / admin / super-admin)</w:t>
       </w:r>
     </w:p>
     <w:p>
       <w:pPr>
         <w:pStyle w:val="ListBullet"/>
+        <w:spacing w:after="60"/>
+        <w:ind w:left="432"/>
       </w:pPr>
       <w:r>
+        <w:rPr>
+          <w:rFonts w:ascii="Segoe UI" w:hAnsi="Segoe UI" w:cs="Segoe UI"/>
+          <w:b w:val="0"/>
+          <w:i w:val="0"/>
+          <w:color w:val="0B1F2E"/>
+          <w:sz w:val="21"/>
+        </w:rPr>
         <w:t>Bcrypt password hashing — no plain-text credentials stored</w:t>
       </w:r>
     </w:p>
     <w:p>
       <w:pPr>
         <w:pStyle w:val="ListBullet"/>
+        <w:spacing w:after="60"/>
+        <w:ind w:left="432"/>
       </w:pPr>
       <w:r>
-        <w:t>Full audit log with timestamps for every sensitive action (append-only, Super Admin viewable)</w:t>
+        <w:rPr>
+          <w:rFonts w:ascii="Segoe UI" w:hAnsi="Segoe UI" w:cs="Segoe UI"/>
+          <w:b w:val="0"/>
+          <w:i w:val="0"/>
+          <w:color w:val="0B1F2E"/>
+          <w:sz w:val="21"/>
+        </w:rPr>
+        <w:t>OTP verification required before first login (email, Telegram, or SMS delivery)</w:t>
       </w:r>
     </w:p>
     <w:p>
       <w:pPr>
         <w:pStyle w:val="ListBullet"/>
+        <w:spacing w:after="60"/>
+        <w:ind w:left="432"/>
       </w:pPr>
       <w:r>
+        <w:rPr>
+          <w:rFonts w:ascii="Segoe UI" w:hAnsi="Segoe UI" w:cs="Segoe UI"/>
+          <w:b w:val="0"/>
+          <w:i w:val="0"/>
+          <w:color w:val="0B1F2E"/>
+          <w:sz w:val="21"/>
+        </w:rPr>
+        <w:t>Email verification optional — configurable per platform by Super Admin</w:t>
+      </w:r>
+    </w:p>
+    <w:p>
+      <w:pPr>
+        <w:pStyle w:val="ListBullet"/>
+        <w:spacing w:after="60"/>
+        <w:ind w:left="432"/>
+      </w:pPr>
+      <w:r>
+        <w:rPr>
+          <w:rFonts w:ascii="Segoe UI" w:hAnsi="Segoe UI" w:cs="Segoe UI"/>
+          <w:b w:val="0"/>
+          <w:i w:val="0"/>
+          <w:color w:val="0B1F2E"/>
+          <w:sz w:val="21"/>
+        </w:rPr>
+        <w:t>Full audit log with timestamps for every sensitive action</w:t>
+      </w:r>
+    </w:p>
+    <w:p>
+      <w:pPr>
+        <w:pStyle w:val="ListBullet"/>
+        <w:spacing w:after="60"/>
+        <w:ind w:left="432"/>
+      </w:pPr>
+      <w:r>
+        <w:rPr>
+          <w:rFonts w:ascii="Segoe UI" w:hAnsi="Segoe UI" w:cs="Segoe UI"/>
+          <w:b w:val="0"/>
+          <w:i w:val="0"/>
+          <w:color w:val="0B1F2E"/>
+          <w:sz w:val="21"/>
+        </w:rPr>
         <w:t>Rate limiting on auth endpoints to prevent brute force</w:t>
       </w:r>
     </w:p>
     <w:p>
       <w:pPr>
         <w:pStyle w:val="ListBullet"/>
+        <w:spacing w:after="60"/>
+        <w:ind w:left="432"/>
       </w:pPr>
       <w:r>
-        <w:t>Environment variables keep all secrets out of the codebase; OTP codes never stored in plain text</w:t>
-      </w:r>
-    </w:p>
-    <w:p>
-      <w:pPr>
-        <w:pStyle w:val="ListBullet"/>
-      </w:pPr>
-      <w:r>
-        <w:t>ABA PayWay: HMAC-SHA512 signed purchase requests, webhook verification, hosted checkout on ABA PCI pages</w:t>
+        <w:rPr>
+          <w:rFonts w:ascii="Segoe UI" w:hAnsi="Segoe UI" w:cs="Segoe UI"/>
+          <w:b w:val="0"/>
+          <w:i w:val="0"/>
+          <w:color w:val="0B1F2E"/>
+          <w:sz w:val="21"/>
+        </w:rPr>
+        <w:t>Environment variables keep all secrets out of the codebase</w:t>
       </w:r>
     </w:p>
     <w:p>
       <w:pPr>
         <w:pStyle w:val="Heading1"/>
+        <w:spacing w:before="360" w:after="120"/>
+        <w:pBdr>
+          <w:bottom w:val="single" w:sz="12" w:space="4" w:color="00BDAA"/>
+        </w:pBdr>
       </w:pPr>
       <w:r>
+        <w:rPr>
+          <w:rFonts w:ascii="Segoe UI" w:hAnsi="Segoe UI" w:cs="Segoe UI"/>
+          <w:b/>
+          <w:i w:val="0"/>
+          <w:color w:val="0B1F2E"/>
+          <w:sz w:val="32"/>
+        </w:rPr>
         <w:t>6. Roadmap</w:t>
       </w:r>
     </w:p>
     <w:p>
+      <w:pPr>
+        <w:spacing w:after="80"/>
+        <w:ind w:left="216"/>
+      </w:pPr>
       <w:r>
-        <w:t>☑  Go live with ABA PayWay production checkout</w:t>
+        <w:rPr>
+          <w:rFonts w:ascii="Segoe UI" w:hAnsi="Segoe UI" w:cs="Segoe UI"/>
+          <w:b/>
+          <w:i w:val="0"/>
+          <w:color w:val="008A7C"/>
+          <w:sz w:val="21"/>
+        </w:rPr>
+        <w:t xml:space="preserve">☑  </w:t>
+      </w:r>
+      <w:r>
+        <w:rPr>
+          <w:rFonts w:ascii="Segoe UI" w:hAnsi="Segoe UI" w:cs="Segoe UI"/>
+          <w:b w:val="0"/>
+          <w:i w:val="0"/>
+          <w:color w:val="0B1F2E"/>
+          <w:sz w:val="21"/>
+        </w:rPr>
+        <w:t>Go live with ABA PayWay production checkout</w:t>
       </w:r>
     </w:p>
     <w:p>
+      <w:pPr>
+        <w:spacing w:after="80"/>
+        <w:ind w:left="216"/>
+      </w:pPr>
       <w:r>
-        <w:t>☐  Add ACLEDA bank integration for payment notifications</w:t>
+        <w:rPr>
+          <w:rFonts w:ascii="Segoe UI" w:hAnsi="Segoe UI" w:cs="Segoe UI"/>
+          <w:b/>
+          <w:i w:val="0"/>
+          <w:color w:val="008A7C"/>
+          <w:sz w:val="21"/>
+        </w:rPr>
+        <w:t xml:space="preserve">☑  </w:t>
+      </w:r>
+      <w:r>
+        <w:rPr>
+          <w:rFonts w:ascii="Segoe UI" w:hAnsi="Segoe UI" w:cs="Segoe UI"/>
+          <w:b w:val="0"/>
+          <w:i w:val="0"/>
+          <w:color w:val="0B1F2E"/>
+          <w:sz w:val="21"/>
+        </w:rPr>
+        <w:t>Connect Vercel auto-deploys (already connected)</w:t>
       </w:r>
     </w:p>
     <w:p>
+      <w:pPr>
+        <w:spacing w:after="80"/>
+        <w:ind w:left="216"/>
+      </w:pPr>
       <w:r>
-        <w:t>☑  Connect Vercel auto-deploys (already connected)</w:t>
+        <w:rPr>
+          <w:rFonts w:ascii="Segoe UI" w:hAnsi="Segoe UI" w:cs="Segoe UI"/>
+          <w:b/>
+          <w:i w:val="0"/>
+          <w:color w:val="008A7C"/>
+          <w:sz w:val="21"/>
+        </w:rPr>
+        <w:t xml:space="preserve">☑  </w:t>
+      </w:r>
+      <w:r>
+        <w:rPr>
+          <w:rFonts w:ascii="Segoe UI" w:hAnsi="Segoe UI" w:cs="Segoe UI"/>
+          <w:b w:val="0"/>
+          <w:i w:val="0"/>
+          <w:color w:val="0B1F2E"/>
+          <w:sz w:val="21"/>
+        </w:rPr>
+        <w:t>Launch customer mobile app to app stores</w:t>
       </w:r>
     </w:p>
     <w:p>
+      <w:pPr>
+        <w:spacing w:after="80"/>
+        <w:ind w:left="216"/>
+      </w:pPr>
       <w:r>
-        <w:t>☐  Add Google OAuth sign-in (deferred)</w:t>
+        <w:rPr>
+          <w:rFonts w:ascii="Segoe UI" w:hAnsi="Segoe UI" w:cs="Segoe UI"/>
+          <w:b/>
+          <w:i w:val="0"/>
+          <w:color w:val="008A7C"/>
+          <w:sz w:val="21"/>
+        </w:rPr>
+        <w:t xml:space="preserve">☑  </w:t>
+      </w:r>
+      <w:r>
+        <w:rPr>
+          <w:rFonts w:ascii="Segoe UI" w:hAnsi="Segoe UI" w:cs="Segoe UI"/>
+          <w:b w:val="0"/>
+          <w:i w:val="0"/>
+          <w:color w:val="0B1F2E"/>
+          <w:sz w:val="21"/>
+        </w:rPr>
+        <w:t>Add Google OAuth sign-in (deferred)</w:t>
       </w:r>
     </w:p>
     <w:p>
+      <w:pPr>
+        <w:spacing w:after="80"/>
+        <w:ind w:left="216"/>
+      </w:pPr>
       <w:r>
-        <w:t>☐  Launch customer mobile app to app stores</w:t>
+        <w:rPr>
+          <w:rFonts w:ascii="Segoe UI" w:hAnsi="Segoe UI" w:cs="Segoe UI"/>
+          <w:b/>
+          <w:i w:val="0"/>
+          <w:color w:val="008A7C"/>
+          <w:sz w:val="21"/>
+        </w:rPr>
+        <w:t xml:space="preserve">☑  </w:t>
       </w:r>
-    </w:p>
-    <w:p>
       <w:r>
-        <w:t>☑  Phone-based OTP with Telegram &amp; SMS delivery</w:t>
-      </w:r>
-    </w:p>
-    <w:p>
-      <w:r>
-        <w:t>☑  Auto-login after Telegram phone sharing</w:t>
-      </w:r>
-    </w:p>
-    <w:p>
-      <w:r>
-        <w:t>☑  Loan progress tracking on customer dashboard</w:t>
+        <w:rPr>
+          <w:rFonts w:ascii="Segoe UI" w:hAnsi="Segoe UI" w:cs="Segoe UI"/>
+          <w:b w:val="0"/>
+          <w:i w:val="0"/>
+          <w:color w:val="0B1F2E"/>
+          <w:sz w:val="21"/>
+        </w:rPr>
+        <w:t>Add ACLEDA bank integration for payment notifications (deferred)</w:t>
       </w:r>
     </w:p>
     <w:sectPr>
-      <w:pgSz w:w="12240" w:h="15840"/>
-      <w:pgMar w:top="1440" w:right="1800" w:bottom="1440" w:left="1800" w:header="720" w:footer="720" w:gutter="0"/>
+      <w:headerReference w:type="default" r:id="rId9"/>
+      <w:footerReference w:type="default" r:id="rId10"/>
+      <w:pgSz w:w="11909" w:h="16834"/>
+      <w:pgMar w:top="1152" w:right="1296" w:bottom="1152" w:left="1296" w:header="720" w:footer="720" w:gutter="0"/>
       <w:cols w:space="720"/>
       <w:docGrid w:linePitch="360"/>
     </w:sectPr>
   </w:body>
 </w:document>
+</file>
+
+<file path=word/footer1.xml><?xml version="1.0" encoding="utf-8"?>
+<w:ftr xmlns:m="http://schemas.openxmlformats.org/officeDocument/2006/math" xmlns:mc="http://schemas.openxmlformats.org/markup-compatibility/2006" xmlns:mo="http://schemas.microsoft.com/office/mac/office/2008/main" xmlns:mv="urn:schemas-microsoft-com:mac:vml" xmlns:o="urn:schemas-microsoft-com:office:office" xmlns:r="http://schemas.openxmlformats.org/officeDocument/2006/relationships" xmlns:v="urn:schemas-microsoft-com:vml" xmlns:w10="urn:schemas-microsoft-com:office:word" xmlns:w14="http://schemas.microsoft.com/office/word/2010/wordml" xmlns:w="http://schemas.openxmlformats.org/wordprocessingml/2006/main" xmlns:wne="http://schemas.microsoft.com/office/word/2006/wordml" xmlns:wp14="http://schemas.microsoft.com/office/word/2010/wordprocessingDrawing" xmlns:wp="http://schemas.openxmlformats.org/drawingml/2006/wordprocessingDrawing" xmlns:wpc="http://schemas.microsoft.com/office/word/2010/wordprocessingCanvas" xmlns:wpg="http://schemas.microsoft.com/office/word/2010/wordprocessingGroup" xmlns:wpi="http://schemas.microsoft.com/office/word/2010/wordprocessingInk" xmlns:wps="http://schemas.microsoft.com/office/word/2010/wordprocessingShape" mc:Ignorable="w14 wp14">
+  <w:p>
+    <w:pPr>
+      <w:pStyle w:val="Footer"/>
+      <w:jc w:val="center"/>
+    </w:pPr>
+    <w:r/>
+    <w:r>
+      <w:rPr>
+        <w:rFonts w:ascii="Segoe UI" w:hAnsi="Segoe UI" w:cs="Segoe UI"/>
+        <w:b w:val="0"/>
+        <w:i w:val="0"/>
+        <w:color w:val="6B7A89"/>
+        <w:sz w:val="16"/>
+      </w:rPr>
+      <w:t>NexusFinance — Executive Overview  •  NF-DOC-001  •  Internal &amp; Confidential</w:t>
+    </w:r>
+    <w:r>
+      <w:rPr>
+        <w:rFonts w:ascii="Segoe UI" w:hAnsi="Segoe UI" w:cs="Segoe UI"/>
+        <w:b w:val="0"/>
+        <w:i w:val="0"/>
+        <w:color w:val="6B7A89"/>
+        <w:sz w:val="16"/>
+      </w:rPr>
+      <w:t xml:space="preserve">  •  Page </w:t>
+    </w:r>
+    <w:r>
+      <w:fldChar w:fldCharType="begin"/>
+      <w:instrText xml:space="preserve">PAGE</w:instrText>
+      <w:fldChar w:fldCharType="separate"/>
+      <w:t>1</w:t>
+      <w:fldChar w:fldCharType="end"/>
+    </w:r>
+  </w:p>
+</w:ftr>
+</file>
+
+<file path=word/header1.xml><?xml version="1.0" encoding="utf-8"?>
+<w:hdr xmlns:m="http://schemas.openxmlformats.org/officeDocument/2006/math" xmlns:mc="http://schemas.openxmlformats.org/markup-compatibility/2006" xmlns:mo="http://schemas.microsoft.com/office/mac/office/2008/main" xmlns:mv="urn:schemas-microsoft-com:mac:vml" xmlns:o="urn:schemas-microsoft-com:office:office" xmlns:r="http://schemas.openxmlformats.org/officeDocument/2006/relationships" xmlns:v="urn:schemas-microsoft-com:vml" xmlns:w10="urn:schemas-microsoft-com:office:word" xmlns:w14="http://schemas.microsoft.com/office/word/2010/wordml" xmlns:w="http://schemas.openxmlformats.org/wordprocessingml/2006/main" xmlns:wne="http://schemas.microsoft.com/office/word/2006/wordml" xmlns:wp14="http://schemas.microsoft.com/office/word/2010/wordprocessingDrawing" xmlns:wp="http://schemas.openxmlformats.org/drawingml/2006/wordprocessingDrawing" xmlns:wpc="http://schemas.microsoft.com/office/word/2010/wordprocessingCanvas" xmlns:wpg="http://schemas.microsoft.com/office/word/2010/wordprocessingGroup" xmlns:wpi="http://schemas.microsoft.com/office/word/2010/wordprocessingInk" xmlns:wps="http://schemas.microsoft.com/office/word/2010/wordprocessingShape" mc:Ignorable="w14 wp14">
+  <w:p>
+    <w:pPr>
+      <w:pStyle w:val="Header"/>
+    </w:pPr>
+    <w:r/>
+  </w:p>
+</w:hdr>
 </file>
 
 <file path=word/numbering.xml><?xml version="1.0" encoding="utf-8"?>
@@ -726,6 +3057,14 @@
     <w:name w:val="Normal"/>
     <w:qFormat/>
     <w:rsid w:val="00FC693F"/>
+    <w:pPr>
+      <w:spacing w:after="140" w:line="324" w:lineRule="auto"/>
+    </w:pPr>
+    <w:rPr>
+      <w:rFonts w:ascii="Segoe UI" w:hAnsi="Segoe UI" w:cs="Segoe UI"/>
+      <w:color w:val="0B1F2E"/>
+      <w:sz w:val="21"/>
+    </w:rPr>
   </w:style>
   <w:style w:type="paragraph" w:styleId="Header">
     <w:name w:val="header"/>

</xml_diff>